<commit_message>
added W2 instad of W1 in exam - typo
</commit_message>
<xml_diff>
--- a/admin/class-tests/in-class-test.docx
+++ b/admin/class-tests/in-class-test.docx
@@ -297,7 +297,7 @@
                 <v:stroke joinstyle="miter"/>
                 <v:path gradientshapeok="t" o:connecttype="rect"/>
               </v:shapetype>
-              <v:shape id="Text Box 2" o:spid="_x0000_s1026" type="#_x0000_t202" style="position:absolute;margin-left:49.45pt;margin-top:5.6pt;width:396.75pt;height:88.15pt;z-index:487641600;visibility:visible;mso-wrap-style:square;mso-width-percent:0;mso-height-percent:0;mso-wrap-distance-left:9pt;mso-wrap-distance-top:0;mso-wrap-distance-right:9pt;mso-wrap-distance-bottom:0;mso-position-horizontal:absolute;mso-position-horizontal-relative:text;mso-position-vertical:absolute;mso-position-vertical-relative:text;mso-width-percent:0;mso-height-percent:0;mso-width-relative:margin;mso-height-relative:margin;v-text-anchor:top" o:gfxdata="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" fillcolor="#fbd4b4 [1305]" strokeweight=".5pt">
+              <v:shape id="Text Box 2" o:spid="_x0000_s1026" type="#_x0000_t202" style="position:absolute;margin-left:49.45pt;margin-top:5.6pt;width:396.75pt;height:88.15pt;z-index:487641600;visibility:visible;mso-wrap-style:square;mso-width-percent:0;mso-height-percent:0;mso-wrap-distance-left:9pt;mso-wrap-distance-top:0;mso-wrap-distance-right:9pt;mso-wrap-distance-bottom:0;mso-position-horizontal:absolute;mso-position-horizontal-relative:text;mso-position-vertical:absolute;mso-position-vertical-relative:text;mso-width-percent:0;mso-height-percent:0;mso-width-relative:margin;mso-height-relative:margin;v-text-anchor:top" o:gfxdata="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" fillcolor="#fbd4b4 [1305]" strokeweight=".5pt">
                 <v:textbox>
                   <w:txbxContent>
                     <w:p>
@@ -636,13 +636,7 @@
                               <w:rPr>
                                 <w:lang w:val="en-IE"/>
                               </w:rPr>
-                              <w:t xml:space="preserve"> ________________________</w:t>
-                            </w:r>
-                            <w:r>
-                              <w:rPr>
-                                <w:lang w:val="en-IE"/>
-                              </w:rPr>
-                              <w:t>_</w:t>
+                              <w:t xml:space="preserve"> _________________________</w:t>
                             </w:r>
                           </w:p>
                           <w:p>
@@ -674,25 +668,29 @@
                                 <w:bCs/>
                                 <w:lang w:val="en-IE"/>
                               </w:rPr>
-                              <w:t xml:space="preserve">Group (W1/W1/W3/W4/Physics) </w:t>
+                              <w:t>Group (W1/W</w:t>
                             </w:r>
                             <w:r>
                               <w:rPr>
+                                <w:b/>
+                                <w:bCs/>
                                 <w:lang w:val="en-IE"/>
                               </w:rPr>
-                              <w:t>________________________</w:t>
+                              <w:t>2</w:t>
                             </w:r>
                             <w:r>
                               <w:rPr>
+                                <w:b/>
+                                <w:bCs/>
                                 <w:lang w:val="en-IE"/>
                               </w:rPr>
-                              <w:t>__</w:t>
+                              <w:t xml:space="preserve">/W3/W4/Physics) </w:t>
                             </w:r>
                             <w:r>
                               <w:rPr>
                                 <w:lang w:val="en-IE"/>
                               </w:rPr>
-                              <w:t>___</w:t>
+                              <w:t>_____________________________</w:t>
                             </w:r>
                           </w:p>
                         </w:txbxContent>
@@ -717,7 +715,7 @@
           </mc:Choice>
           <mc:Fallback>
             <w:pict>
-              <v:shape w14:anchorId="69449469" id="Text Box 1" o:spid="_x0000_s1027" type="#_x0000_t202" style="position:absolute;margin-left:67.75pt;margin-top:12.8pt;width:375.15pt;height:161.75pt;z-index:487640576;visibility:visible;mso-wrap-style:square;mso-width-percent:0;mso-height-percent:0;mso-wrap-distance-left:9pt;mso-wrap-distance-top:0;mso-wrap-distance-right:9pt;mso-wrap-distance-bottom:0;mso-position-horizontal:absolute;mso-position-horizontal-relative:text;mso-position-vertical:absolute;mso-position-vertical-relative:text;mso-width-percent:0;mso-height-percent:0;mso-width-relative:margin;mso-height-relative:margin;v-text-anchor:top" o:gfxdata="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" fillcolor="#fbd4b4 [1305]" strokeweight=".5pt">
+              <v:shape w14:anchorId="69449469" id="Text Box 1" o:spid="_x0000_s1027" type="#_x0000_t202" style="position:absolute;margin-left:67.75pt;margin-top:12.8pt;width:375.15pt;height:161.75pt;z-index:487640576;visibility:visible;mso-wrap-style:square;mso-width-percent:0;mso-height-percent:0;mso-wrap-distance-left:9pt;mso-wrap-distance-top:0;mso-wrap-distance-right:9pt;mso-wrap-distance-bottom:0;mso-position-horizontal:absolute;mso-position-horizontal-relative:text;mso-position-vertical:absolute;mso-position-vertical-relative:text;mso-width-percent:0;mso-height-percent:0;mso-width-relative:margin;mso-height-relative:margin;v-text-anchor:top" o:gfxdata="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" fillcolor="#fbd4b4 [1305]" strokeweight=".5pt">
                 <v:textbox>
                   <w:txbxContent>
                     <w:p>
@@ -823,13 +821,7 @@
                         <w:rPr>
                           <w:lang w:val="en-IE"/>
                         </w:rPr>
-                        <w:t xml:space="preserve"> ________________________</w:t>
-                      </w:r>
-                      <w:r>
-                        <w:rPr>
-                          <w:lang w:val="en-IE"/>
-                        </w:rPr>
-                        <w:t>_</w:t>
+                        <w:t xml:space="preserve"> _________________________</w:t>
                       </w:r>
                     </w:p>
                     <w:p>
@@ -861,25 +853,29 @@
                           <w:bCs/>
                           <w:lang w:val="en-IE"/>
                         </w:rPr>
-                        <w:t xml:space="preserve">Group (W1/W1/W3/W4/Physics) </w:t>
+                        <w:t>Group (W1/W</w:t>
                       </w:r>
                       <w:r>
                         <w:rPr>
+                          <w:b/>
+                          <w:bCs/>
                           <w:lang w:val="en-IE"/>
                         </w:rPr>
-                        <w:t>________________________</w:t>
+                        <w:t>2</w:t>
                       </w:r>
                       <w:r>
                         <w:rPr>
+                          <w:b/>
+                          <w:bCs/>
                           <w:lang w:val="en-IE"/>
                         </w:rPr>
-                        <w:t>__</w:t>
+                        <w:t xml:space="preserve">/W3/W4/Physics) </w:t>
                       </w:r>
                       <w:r>
                         <w:rPr>
                           <w:lang w:val="en-IE"/>
                         </w:rPr>
-                        <w:t>___</w:t>
+                        <w:t>_____________________________</w:t>
                       </w:r>
                     </w:p>
                   </w:txbxContent>
@@ -1105,12 +1101,13 @@
               </wp:anchor>
             </w:drawing>
           </mc:Choice>
-          <mc:Fallback xmlns:ve="http://schemas.openxmlformats.org/markup-compatibility/2006" xmlns:a="http://schemas.openxmlformats.org/drawingml/2006/main" xmlns:pic="http://schemas.openxmlformats.org/drawingml/2006/picture">
+          <mc:Fallback>
             <w:pict>
-              <v:rect style="position:absolute;margin-left:67pt;margin-top:5.952491pt;width:462pt;height:.75pt;mso-position-horizontal-relative:page;mso-position-vertical-relative:paragraph;z-index:-15728640;mso-wrap-distance-left:0;mso-wrap-distance-right:0" id="docshape3" filled="true" fillcolor="#000000" stroked="false">
-                <v:fill opacity="11822f" type="solid"/>
-                <w10:wrap type="topAndBottom"/>
-              </v:rect>
+              <v:shape w14:anchorId="54326FDB" id="Graphic 3" o:spid="_x0000_s1026" style="position:absolute;margin-left:67pt;margin-top:5.95pt;width:462pt;height:.75pt;z-index:-15728640;visibility:visible;mso-wrap-style:square;mso-wrap-distance-left:0;mso-wrap-distance-top:0;mso-wrap-distance-right:0;mso-wrap-distance-bottom:0;mso-position-horizontal:absolute;mso-position-horizontal-relative:page;mso-position-vertical:absolute;mso-position-vertical-relative:text;v-text-anchor:top" coordsize="5867400,9525" o:gfxdata="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" path="m5867400,9525l,9525,,,5867400,r,9525xe" fillcolor="black" stroked="f">
+                <v:fill opacity="11822f"/>
+                <v:path arrowok="t"/>
+                <w10:wrap type="topAndBottom" anchorx="page"/>
+              </v:shape>
             </w:pict>
           </mc:Fallback>
         </mc:AlternateContent>
@@ -1309,12 +1306,13 @@
               </wp:anchor>
             </w:drawing>
           </mc:Choice>
-          <mc:Fallback xmlns:ve="http://schemas.openxmlformats.org/markup-compatibility/2006" xmlns:a="http://schemas.openxmlformats.org/drawingml/2006/main" xmlns:pic="http://schemas.openxmlformats.org/drawingml/2006/picture">
+          <mc:Fallback>
             <w:pict>
-              <v:rect style="position:absolute;margin-left:67pt;margin-top:5.001855pt;width:462pt;height:.75pt;mso-position-horizontal-relative:page;mso-position-vertical-relative:paragraph;z-index:-15728128;mso-wrap-distance-left:0;mso-wrap-distance-right:0" id="docshape4" filled="true" fillcolor="#000000" stroked="false">
-                <v:fill opacity="11822f" type="solid"/>
-                <w10:wrap type="topAndBottom"/>
-              </v:rect>
+              <v:shape w14:anchorId="29227C2A" id="Graphic 4" o:spid="_x0000_s1026" style="position:absolute;margin-left:67pt;margin-top:5pt;width:462pt;height:.75pt;z-index:-15728128;visibility:visible;mso-wrap-style:square;mso-wrap-distance-left:0;mso-wrap-distance-top:0;mso-wrap-distance-right:0;mso-wrap-distance-bottom:0;mso-position-horizontal:absolute;mso-position-horizontal-relative:page;mso-position-vertical:absolute;mso-position-vertical-relative:text;v-text-anchor:top" coordsize="5867400,9525" o:gfxdata="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" path="m5867400,9525l,9525,,,5867400,r,9525xe" fillcolor="black" stroked="f">
+                <v:fill opacity="11822f"/>
+                <v:path arrowok="t"/>
+                <w10:wrap type="topAndBottom" anchorx="page"/>
+              </v:shape>
             </w:pict>
           </mc:Fallback>
         </mc:AlternateContent>
@@ -1628,7 +1626,7 @@
           </mc:Choice>
           <mc:Fallback>
             <w:pict>
-              <v:shape w14:anchorId="470BE2BB" id="Graphic 5" o:spid="_x0000_s1026" style="position:absolute;margin-left:85pt;margin-top:5.55pt;width:3.75pt;height:3.75pt;z-index:15728640;visibility:visible;mso-wrap-style:square;mso-wrap-distance-left:0;mso-wrap-distance-top:0;mso-wrap-distance-right:0;mso-wrap-distance-bottom:0;mso-position-horizontal:absolute;mso-position-horizontal-relative:page;mso-position-vertical:absolute;mso-position-vertical-relative:text;v-text-anchor:top" coordsize="47625,47625" o:gfxdata="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" path="m26974,47625r-6324,l17621,47024,,26974,,20650,20650,r6324,l47625,20650r,3162l47625,26974,30003,47024r-3029,601xe" fillcolor="black" stroked="f">
+              <v:shape w14:anchorId="6C586945" id="Graphic 5" o:spid="_x0000_s1026" style="position:absolute;margin-left:85pt;margin-top:5.55pt;width:3.75pt;height:3.75pt;z-index:15728640;visibility:visible;mso-wrap-style:square;mso-wrap-distance-left:0;mso-wrap-distance-top:0;mso-wrap-distance-right:0;mso-wrap-distance-bottom:0;mso-position-horizontal:absolute;mso-position-horizontal-relative:page;mso-position-vertical:absolute;mso-position-vertical-relative:text;v-text-anchor:top" coordsize="47625,47625" o:gfxdata="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" path="m26974,47625r-6324,l17621,47024,,26974,,20650,20650,r6324,l47625,20650r,3162l47625,26974,30003,47024r-3029,601xe" fillcolor="black" stroked="f">
                 <v:path arrowok="t"/>
                 <w10:wrap anchorx="page"/>
               </v:shape>
@@ -1866,7 +1864,7 @@
           </mc:Choice>
           <mc:Fallback>
             <w:pict>
-              <v:shape w14:anchorId="082B08D8" id="Graphic 6" o:spid="_x0000_s1026" style="position:absolute;margin-left:85pt;margin-top:9.6pt;width:3.75pt;height:3.75pt;z-index:15729152;visibility:visible;mso-wrap-style:square;mso-wrap-distance-left:0;mso-wrap-distance-top:0;mso-wrap-distance-right:0;mso-wrap-distance-bottom:0;mso-position-horizontal:absolute;mso-position-horizontal-relative:page;mso-position-vertical:absolute;mso-position-vertical-relative:text;v-text-anchor:top" coordsize="47625,47625" o:gfxdata="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" path="m26974,47625r-6324,l17621,47024,,26974,,20650,20650,r6324,l47625,20650r,3162l47625,26974,30003,47024r-3029,601xe" fillcolor="black" stroked="f">
+              <v:shape w14:anchorId="3B78E54B" id="Graphic 6" o:spid="_x0000_s1026" style="position:absolute;margin-left:85pt;margin-top:9.6pt;width:3.75pt;height:3.75pt;z-index:15729152;visibility:visible;mso-wrap-style:square;mso-wrap-distance-left:0;mso-wrap-distance-top:0;mso-wrap-distance-right:0;mso-wrap-distance-bottom:0;mso-position-horizontal:absolute;mso-position-horizontal-relative:page;mso-position-vertical:absolute;mso-position-vertical-relative:text;v-text-anchor:top" coordsize="47625,47625" o:gfxdata="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" path="m26974,47625r-6324,l17621,47024,,26974,,20650,20650,r6324,l47625,20650r,3162l47625,26974,30003,47024r-3029,601xe" fillcolor="black" stroked="f">
                 <v:path arrowok="t"/>
                 <w10:wrap anchorx="page"/>
               </v:shape>
@@ -2048,7 +2046,7 @@
           </mc:Choice>
           <mc:Fallback>
             <w:pict>
-              <v:shape w14:anchorId="3647EBA6" id="Graphic 7" o:spid="_x0000_s1026" style="position:absolute;margin-left:85pt;margin-top:8.8pt;width:3.75pt;height:3.75pt;z-index:15729664;visibility:visible;mso-wrap-style:square;mso-wrap-distance-left:0;mso-wrap-distance-top:0;mso-wrap-distance-right:0;mso-wrap-distance-bottom:0;mso-position-horizontal:absolute;mso-position-horizontal-relative:page;mso-position-vertical:absolute;mso-position-vertical-relative:text;v-text-anchor:top" coordsize="47625,47625" o:gfxdata="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" path="m26974,47625r-6324,l17621,47024,,26965,,20650,20650,r6324,l47625,20650r,3162l47625,26965,30003,47024r-3029,601xe" fillcolor="black" stroked="f">
+              <v:shape w14:anchorId="682727A4" id="Graphic 7" o:spid="_x0000_s1026" style="position:absolute;margin-left:85pt;margin-top:8.8pt;width:3.75pt;height:3.75pt;z-index:15729664;visibility:visible;mso-wrap-style:square;mso-wrap-distance-left:0;mso-wrap-distance-top:0;mso-wrap-distance-right:0;mso-wrap-distance-bottom:0;mso-position-horizontal:absolute;mso-position-horizontal-relative:page;mso-position-vertical:absolute;mso-position-vertical-relative:text;v-text-anchor:top" coordsize="47625,47625" o:gfxdata="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" path="m26974,47625r-6324,l17621,47024,,26965,,20650,20650,r6324,l47625,20650r,3162l47625,26965,30003,47024r-3029,601xe" fillcolor="black" stroked="f">
                 <v:path arrowok="t"/>
                 <w10:wrap anchorx="page"/>
               </v:shape>
@@ -2187,7 +2185,7 @@
           </mc:Choice>
           <mc:Fallback>
             <w:pict>
-              <v:shape w14:anchorId="3B575F42" id="Graphic 8" o:spid="_x0000_s1026" style="position:absolute;margin-left:85pt;margin-top:9.6pt;width:3.75pt;height:3.75pt;z-index:15730176;visibility:visible;mso-wrap-style:square;mso-wrap-distance-left:0;mso-wrap-distance-top:0;mso-wrap-distance-right:0;mso-wrap-distance-bottom:0;mso-position-horizontal:absolute;mso-position-horizontal-relative:page;mso-position-vertical:absolute;mso-position-vertical-relative:text;v-text-anchor:top" coordsize="47625,47625" o:gfxdata="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" path="m26974,47625r-6324,l17621,47024,,26974,,20650,20650,r6324,l47625,20650r,3162l47625,26974,30003,47024r-3029,601xe" fillcolor="black" stroked="f">
+              <v:shape w14:anchorId="67AF2D2F" id="Graphic 8" o:spid="_x0000_s1026" style="position:absolute;margin-left:85pt;margin-top:9.6pt;width:3.75pt;height:3.75pt;z-index:15730176;visibility:visible;mso-wrap-style:square;mso-wrap-distance-left:0;mso-wrap-distance-top:0;mso-wrap-distance-right:0;mso-wrap-distance-bottom:0;mso-position-horizontal:absolute;mso-position-horizontal-relative:page;mso-position-vertical:absolute;mso-position-vertical-relative:text;v-text-anchor:top" coordsize="47625,47625" o:gfxdata="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" path="m26974,47625r-6324,l17621,47024,,26974,,20650,20650,r6324,l47625,20650r,3162l47625,26974,30003,47024r-3029,601xe" fillcolor="black" stroked="f">
                 <v:path arrowok="t"/>
                 <w10:wrap anchorx="page"/>
               </v:shape>
@@ -2523,7 +2521,7 @@
           </mc:Choice>
           <mc:Fallback>
             <w:pict>
-              <v:shape w14:anchorId="24C12BBC" id="Graphic 9" o:spid="_x0000_s1026" style="position:absolute;margin-left:85pt;margin-top:5.55pt;width:3.75pt;height:3.75pt;z-index:15730688;visibility:visible;mso-wrap-style:square;mso-wrap-distance-left:0;mso-wrap-distance-top:0;mso-wrap-distance-right:0;mso-wrap-distance-bottom:0;mso-position-horizontal:absolute;mso-position-horizontal-relative:page;mso-position-vertical:absolute;mso-position-vertical-relative:text;v-text-anchor:top" coordsize="47625,47625" o:gfxdata="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" path="m26974,47625r-6324,l17621,47024,,26974,,20650,20650,r6324,l47625,20650r,3162l47625,26974,30003,47024r-3029,601xe" fillcolor="black" stroked="f">
+              <v:shape w14:anchorId="4F82D4F8" id="Graphic 9" o:spid="_x0000_s1026" style="position:absolute;margin-left:85pt;margin-top:5.55pt;width:3.75pt;height:3.75pt;z-index:15730688;visibility:visible;mso-wrap-style:square;mso-wrap-distance-left:0;mso-wrap-distance-top:0;mso-wrap-distance-right:0;mso-wrap-distance-bottom:0;mso-position-horizontal:absolute;mso-position-horizontal-relative:page;mso-position-vertical:absolute;mso-position-vertical-relative:text;v-text-anchor:top" coordsize="47625,47625" o:gfxdata="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" path="m26974,47625r-6324,l17621,47024,,26974,,20650,20650,r6324,l47625,20650r,3162l47625,26974,30003,47024r-3029,601xe" fillcolor="black" stroked="f">
                 <v:path arrowok="t"/>
                 <w10:wrap anchorx="page"/>
               </v:shape>
@@ -2746,7 +2744,7 @@
           </mc:Choice>
           <mc:Fallback>
             <w:pict>
-              <v:shape w14:anchorId="57406B0C" id="Graphic 10" o:spid="_x0000_s1026" style="position:absolute;margin-left:85pt;margin-top:8.85pt;width:3.75pt;height:3.75pt;z-index:15731200;visibility:visible;mso-wrap-style:square;mso-wrap-distance-left:0;mso-wrap-distance-top:0;mso-wrap-distance-right:0;mso-wrap-distance-bottom:0;mso-position-horizontal:absolute;mso-position-horizontal-relative:page;mso-position-vertical:absolute;mso-position-vertical-relative:text;v-text-anchor:top" coordsize="47625,47625" o:gfxdata="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" path="m26974,47625r-6324,l17621,47024,,26974,,20650,20650,r6324,l47625,20650r,3162l47625,26974,30003,47024r-3029,601xe" fillcolor="black" stroked="f">
+              <v:shape w14:anchorId="2EB08D89" id="Graphic 10" o:spid="_x0000_s1026" style="position:absolute;margin-left:85pt;margin-top:8.85pt;width:3.75pt;height:3.75pt;z-index:15731200;visibility:visible;mso-wrap-style:square;mso-wrap-distance-left:0;mso-wrap-distance-top:0;mso-wrap-distance-right:0;mso-wrap-distance-bottom:0;mso-position-horizontal:absolute;mso-position-horizontal-relative:page;mso-position-vertical:absolute;mso-position-vertical-relative:text;v-text-anchor:top" coordsize="47625,47625" o:gfxdata="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" path="m26974,47625r-6324,l17621,47024,,26974,,20650,20650,r6324,l47625,20650r,3162l47625,26974,30003,47024r-3029,601xe" fillcolor="black" stroked="f">
                 <v:path arrowok="t"/>
                 <w10:wrap anchorx="page"/>
               </v:shape>
@@ -2984,7 +2982,7 @@
           </mc:Choice>
           <mc:Fallback>
             <w:pict>
-              <v:shape w14:anchorId="26C6EED0" id="Graphic 11" o:spid="_x0000_s1026" style="position:absolute;margin-left:85pt;margin-top:9.55pt;width:3.75pt;height:3.75pt;z-index:15731712;visibility:visible;mso-wrap-style:square;mso-wrap-distance-left:0;mso-wrap-distance-top:0;mso-wrap-distance-right:0;mso-wrap-distance-bottom:0;mso-position-horizontal:absolute;mso-position-horizontal-relative:page;mso-position-vertical:absolute;mso-position-vertical-relative:text;v-text-anchor:top" coordsize="47625,47625" o:gfxdata="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" path="m26974,47625r-6324,l17621,47024,,26974,,20650,20650,r6324,l47625,20650r,3162l47625,26974,30003,47024r-3029,601xe" fillcolor="black" stroked="f">
+              <v:shape w14:anchorId="7A5D623E" id="Graphic 11" o:spid="_x0000_s1026" style="position:absolute;margin-left:85pt;margin-top:9.55pt;width:3.75pt;height:3.75pt;z-index:15731712;visibility:visible;mso-wrap-style:square;mso-wrap-distance-left:0;mso-wrap-distance-top:0;mso-wrap-distance-right:0;mso-wrap-distance-bottom:0;mso-position-horizontal:absolute;mso-position-horizontal-relative:page;mso-position-vertical:absolute;mso-position-vertical-relative:text;v-text-anchor:top" coordsize="47625,47625" o:gfxdata="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" path="m26974,47625r-6324,l17621,47024,,26974,,20650,20650,r6324,l47625,20650r,3162l47625,26974,30003,47024r-3029,601xe" fillcolor="black" stroked="f">
                 <v:path arrowok="t"/>
                 <w10:wrap anchorx="page"/>
               </v:shape>
@@ -3192,7 +3190,7 @@
           </mc:Choice>
           <mc:Fallback>
             <w:pict>
-              <v:shape w14:anchorId="1F86E44B" id="Graphic 12" o:spid="_x0000_s1026" style="position:absolute;margin-left:85pt;margin-top:8.85pt;width:3.75pt;height:3.75pt;z-index:15732224;visibility:visible;mso-wrap-style:square;mso-wrap-distance-left:0;mso-wrap-distance-top:0;mso-wrap-distance-right:0;mso-wrap-distance-bottom:0;mso-position-horizontal:absolute;mso-position-horizontal-relative:page;mso-position-vertical:absolute;mso-position-vertical-relative:text;v-text-anchor:top" coordsize="47625,47625" o:gfxdata="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" path="m26974,47625r-6324,l17621,47024,,26974,,20650,20650,r6324,l47625,20650r,3162l47625,26974,30003,47024r-3029,601xe" fillcolor="black" stroked="f">
+              <v:shape w14:anchorId="6248DBCC" id="Graphic 12" o:spid="_x0000_s1026" style="position:absolute;margin-left:85pt;margin-top:8.85pt;width:3.75pt;height:3.75pt;z-index:15732224;visibility:visible;mso-wrap-style:square;mso-wrap-distance-left:0;mso-wrap-distance-top:0;mso-wrap-distance-right:0;mso-wrap-distance-bottom:0;mso-position-horizontal:absolute;mso-position-horizontal-relative:page;mso-position-vertical:absolute;mso-position-vertical-relative:text;v-text-anchor:top" coordsize="47625,47625" o:gfxdata="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" path="m26974,47625r-6324,l17621,47024,,26974,,20650,20650,r6324,l47625,20650r,3162l47625,26974,30003,47024r-3029,601xe" fillcolor="black" stroked="f">
                 <v:path arrowok="t"/>
                 <w10:wrap anchorx="page"/>
               </v:shape>
@@ -3585,7 +3583,7 @@
           </mc:Choice>
           <mc:Fallback>
             <w:pict>
-              <v:shape w14:anchorId="6D571CE5" id="Graphic 13" o:spid="_x0000_s1026" style="position:absolute;margin-left:85pt;margin-top:5.55pt;width:3.75pt;height:3.75pt;z-index:15732736;visibility:visible;mso-wrap-style:square;mso-wrap-distance-left:0;mso-wrap-distance-top:0;mso-wrap-distance-right:0;mso-wrap-distance-bottom:0;mso-position-horizontal:absolute;mso-position-horizontal-relative:page;mso-position-vertical:absolute;mso-position-vertical-relative:text;v-text-anchor:top" coordsize="47625,47625" o:gfxdata="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" path="m26974,47625r-6324,l17621,47015,,26974,,20650,20650,r6324,l47625,20650r,3162l47625,26974,30003,47015r-3029,610xe" fillcolor="black" stroked="f">
+              <v:shape w14:anchorId="4325BDF7" id="Graphic 13" o:spid="_x0000_s1026" style="position:absolute;margin-left:85pt;margin-top:5.55pt;width:3.75pt;height:3.75pt;z-index:15732736;visibility:visible;mso-wrap-style:square;mso-wrap-distance-left:0;mso-wrap-distance-top:0;mso-wrap-distance-right:0;mso-wrap-distance-bottom:0;mso-position-horizontal:absolute;mso-position-horizontal-relative:page;mso-position-vertical:absolute;mso-position-vertical-relative:text;v-text-anchor:top" coordsize="47625,47625" o:gfxdata="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" path="m26974,47625r-6324,l17621,47015,,26974,,20650,20650,r6324,l47625,20650r,3162l47625,26974,30003,47015r-3029,610xe" fillcolor="black" stroked="f">
                 <v:path arrowok="t"/>
                 <w10:wrap anchorx="page"/>
               </v:shape>
@@ -3725,7 +3723,7 @@
           </mc:Choice>
           <mc:Fallback>
             <w:pict>
-              <v:shape w14:anchorId="2A018AEE" id="Graphic 14" o:spid="_x0000_s1026" style="position:absolute;margin-left:85pt;margin-top:8.85pt;width:3.75pt;height:3.75pt;z-index:15733248;visibility:visible;mso-wrap-style:square;mso-wrap-distance-left:0;mso-wrap-distance-top:0;mso-wrap-distance-right:0;mso-wrap-distance-bottom:0;mso-position-horizontal:absolute;mso-position-horizontal-relative:page;mso-position-vertical:absolute;mso-position-vertical-relative:text;v-text-anchor:top" coordsize="47625,47625" o:gfxdata="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" path="m26974,47625r-6324,l17621,47024,,26965,,20650,20650,r6324,l47625,20650r,3162l47625,26965,30003,47024r-3029,601xe" fillcolor="black" stroked="f">
+              <v:shape w14:anchorId="1ADC9F86" id="Graphic 14" o:spid="_x0000_s1026" style="position:absolute;margin-left:85pt;margin-top:8.85pt;width:3.75pt;height:3.75pt;z-index:15733248;visibility:visible;mso-wrap-style:square;mso-wrap-distance-left:0;mso-wrap-distance-top:0;mso-wrap-distance-right:0;mso-wrap-distance-bottom:0;mso-position-horizontal:absolute;mso-position-horizontal-relative:page;mso-position-vertical:absolute;mso-position-vertical-relative:text;v-text-anchor:top" coordsize="47625,47625" o:gfxdata="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" path="m26974,47625r-6324,l17621,47024,,26965,,20650,20650,r6324,l47625,20650r,3162l47625,26965,30003,47024r-3029,601xe" fillcolor="black" stroked="f">
                 <v:path arrowok="t"/>
                 <w10:wrap anchorx="page"/>
               </v:shape>
@@ -3861,7 +3859,7 @@
           </mc:Choice>
           <mc:Fallback>
             <w:pict>
-              <v:shape w14:anchorId="4C86CB52" id="Graphic 15" o:spid="_x0000_s1026" style="position:absolute;margin-left:85pt;margin-top:9.55pt;width:3.75pt;height:3.75pt;z-index:15733760;visibility:visible;mso-wrap-style:square;mso-wrap-distance-left:0;mso-wrap-distance-top:0;mso-wrap-distance-right:0;mso-wrap-distance-bottom:0;mso-position-horizontal:absolute;mso-position-horizontal-relative:page;mso-position-vertical:absolute;mso-position-vertical-relative:text;v-text-anchor:top" coordsize="47625,47625" o:gfxdata="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" path="m26974,47625r-6324,l17621,47015,,26974,,20650,20650,r6324,l47625,20650r,3162l47625,26974,30003,47015r-3029,610xe" fillcolor="black" stroked="f">
+              <v:shape w14:anchorId="13C54E66" id="Graphic 15" o:spid="_x0000_s1026" style="position:absolute;margin-left:85pt;margin-top:9.55pt;width:3.75pt;height:3.75pt;z-index:15733760;visibility:visible;mso-wrap-style:square;mso-wrap-distance-left:0;mso-wrap-distance-top:0;mso-wrap-distance-right:0;mso-wrap-distance-bottom:0;mso-position-horizontal:absolute;mso-position-horizontal-relative:page;mso-position-vertical:absolute;mso-position-vertical-relative:text;v-text-anchor:top" coordsize="47625,47625" o:gfxdata="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" path="m26974,47625r-6324,l17621,47015,,26974,,20650,20650,r6324,l47625,20650r,3162l47625,26974,30003,47015r-3029,610xe" fillcolor="black" stroked="f">
                 <v:path arrowok="t"/>
                 <w10:wrap anchorx="page"/>
               </v:shape>
@@ -3997,7 +3995,7 @@
           </mc:Choice>
           <mc:Fallback>
             <w:pict>
-              <v:shape w14:anchorId="0A8056F7" id="Graphic 16" o:spid="_x0000_s1026" style="position:absolute;margin-left:85pt;margin-top:8.85pt;width:3.75pt;height:3.75pt;z-index:15734272;visibility:visible;mso-wrap-style:square;mso-wrap-distance-left:0;mso-wrap-distance-top:0;mso-wrap-distance-right:0;mso-wrap-distance-bottom:0;mso-position-horizontal:absolute;mso-position-horizontal-relative:page;mso-position-vertical:absolute;mso-position-vertical-relative:text;v-text-anchor:top" coordsize="47625,47625" o:gfxdata="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" path="m26974,47625r-6324,l17621,47024,,26965,,20650,20650,r6324,l47625,20650r,3162l47625,26965,30003,47024r-3029,601xe" fillcolor="black" stroked="f">
+              <v:shape w14:anchorId="52864F61" id="Graphic 16" o:spid="_x0000_s1026" style="position:absolute;margin-left:85pt;margin-top:8.85pt;width:3.75pt;height:3.75pt;z-index:15734272;visibility:visible;mso-wrap-style:square;mso-wrap-distance-left:0;mso-wrap-distance-top:0;mso-wrap-distance-right:0;mso-wrap-distance-bottom:0;mso-position-horizontal:absolute;mso-position-horizontal-relative:page;mso-position-vertical:absolute;mso-position-vertical-relative:text;v-text-anchor:top" coordsize="47625,47625" o:gfxdata="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" path="m26974,47625r-6324,l17621,47024,,26965,,20650,20650,r6324,l47625,20650r,3162l47625,26965,30003,47024r-3029,601xe" fillcolor="black" stroked="f">
                 <v:path arrowok="t"/>
                 <w10:wrap anchorx="page"/>
               </v:shape>
@@ -4314,7 +4312,7 @@
           </mc:Choice>
           <mc:Fallback>
             <w:pict>
-              <v:shape w14:anchorId="5E5548DA" id="Graphic 17" o:spid="_x0000_s1026" style="position:absolute;margin-left:85pt;margin-top:5.55pt;width:3.75pt;height:3.75pt;z-index:15734784;visibility:visible;mso-wrap-style:square;mso-wrap-distance-left:0;mso-wrap-distance-top:0;mso-wrap-distance-right:0;mso-wrap-distance-bottom:0;mso-position-horizontal:absolute;mso-position-horizontal-relative:page;mso-position-vertical:absolute;mso-position-vertical-relative:text;v-text-anchor:top" coordsize="47625,47625" o:gfxdata="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" path="m26974,47625r-6324,l17621,47024,,26965,,20650,20650,r6324,l47625,20650r,3162l47625,26965,30003,47024r-3029,601xe" fillcolor="black" stroked="f">
+              <v:shape w14:anchorId="6030DA45" id="Graphic 17" o:spid="_x0000_s1026" style="position:absolute;margin-left:85pt;margin-top:5.55pt;width:3.75pt;height:3.75pt;z-index:15734784;visibility:visible;mso-wrap-style:square;mso-wrap-distance-left:0;mso-wrap-distance-top:0;mso-wrap-distance-right:0;mso-wrap-distance-bottom:0;mso-position-horizontal:absolute;mso-position-horizontal-relative:page;mso-position-vertical:absolute;mso-position-vertical-relative:text;v-text-anchor:top" coordsize="47625,47625" o:gfxdata="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" path="m26974,47625r-6324,l17621,47024,,26965,,20650,20650,r6324,l47625,20650r,3162l47625,26965,30003,47024r-3029,601xe" fillcolor="black" stroked="f">
                 <v:path arrowok="t"/>
                 <w10:wrap anchorx="page"/>
               </v:shape>
@@ -4551,7 +4549,7 @@
           </mc:Choice>
           <mc:Fallback>
             <w:pict>
-              <v:shape w14:anchorId="1C356AF9" id="Graphic 18" o:spid="_x0000_s1026" style="position:absolute;margin-left:85pt;margin-top:8.85pt;width:3.75pt;height:3.75pt;z-index:15735296;visibility:visible;mso-wrap-style:square;mso-wrap-distance-left:0;mso-wrap-distance-top:0;mso-wrap-distance-right:0;mso-wrap-distance-bottom:0;mso-position-horizontal:absolute;mso-position-horizontal-relative:page;mso-position-vertical:absolute;mso-position-vertical-relative:text;v-text-anchor:top" coordsize="47625,47625" o:gfxdata="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" path="m26974,47625r-6324,l17621,47024,,26965,,20650,20650,r6324,l47625,20650r,3162l47625,26965,30003,47024r-3029,601xe" fillcolor="black" stroked="f">
+              <v:shape w14:anchorId="75E5DD96" id="Graphic 18" o:spid="_x0000_s1026" style="position:absolute;margin-left:85pt;margin-top:8.85pt;width:3.75pt;height:3.75pt;z-index:15735296;visibility:visible;mso-wrap-style:square;mso-wrap-distance-left:0;mso-wrap-distance-top:0;mso-wrap-distance-right:0;mso-wrap-distance-bottom:0;mso-position-horizontal:absolute;mso-position-horizontal-relative:page;mso-position-vertical:absolute;mso-position-vertical-relative:text;v-text-anchor:top" coordsize="47625,47625" o:gfxdata="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" path="m26974,47625r-6324,l17621,47024,,26965,,20650,20650,r6324,l47625,20650r,3162l47625,26965,30003,47024r-3029,601xe" fillcolor="black" stroked="f">
                 <v:path arrowok="t"/>
                 <w10:wrap anchorx="page"/>
               </v:shape>
@@ -4733,7 +4731,7 @@
           </mc:Choice>
           <mc:Fallback>
             <w:pict>
-              <v:shape w14:anchorId="6F9D3D82" id="Graphic 19" o:spid="_x0000_s1026" style="position:absolute;margin-left:85pt;margin-top:8.8pt;width:3.75pt;height:3.75pt;z-index:15735808;visibility:visible;mso-wrap-style:square;mso-wrap-distance-left:0;mso-wrap-distance-top:0;mso-wrap-distance-right:0;mso-wrap-distance-bottom:0;mso-position-horizontal:absolute;mso-position-horizontal-relative:page;mso-position-vertical:absolute;mso-position-vertical-relative:text;v-text-anchor:top" coordsize="47625,47625" o:gfxdata="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" path="m26974,47625r-6324,l17621,47015,,26965,,20650,20650,r6324,l47625,20650r,3162l47625,26965,30003,47015r-3029,610xe" fillcolor="black" stroked="f">
+              <v:shape w14:anchorId="67A5CD17" id="Graphic 19" o:spid="_x0000_s1026" style="position:absolute;margin-left:85pt;margin-top:8.8pt;width:3.75pt;height:3.75pt;z-index:15735808;visibility:visible;mso-wrap-style:square;mso-wrap-distance-left:0;mso-wrap-distance-top:0;mso-wrap-distance-right:0;mso-wrap-distance-bottom:0;mso-position-horizontal:absolute;mso-position-horizontal-relative:page;mso-position-vertical:absolute;mso-position-vertical-relative:text;v-text-anchor:top" coordsize="47625,47625" o:gfxdata="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" path="m26974,47625r-6324,l17621,47015,,26965,,20650,20650,r6324,l47625,20650r,3162l47625,26965,30003,47015r-3029,610xe" fillcolor="black" stroked="f">
                 <v:path arrowok="t"/>
                 <w10:wrap anchorx="page"/>
               </v:shape>
@@ -4914,7 +4912,7 @@
           </mc:Choice>
           <mc:Fallback>
             <w:pict>
-              <v:shape w14:anchorId="13333B6C" id="Graphic 20" o:spid="_x0000_s1026" style="position:absolute;margin-left:85pt;margin-top:9.6pt;width:3.75pt;height:3.75pt;z-index:15736320;visibility:visible;mso-wrap-style:square;mso-wrap-distance-left:0;mso-wrap-distance-top:0;mso-wrap-distance-right:0;mso-wrap-distance-bottom:0;mso-position-horizontal:absolute;mso-position-horizontal-relative:page;mso-position-vertical:absolute;mso-position-vertical-relative:text;v-text-anchor:top" coordsize="47625,47625" o:gfxdata="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" path="m26974,47625r-6324,l17621,47024,,26965,,20650,20650,r6324,l47625,20650r,3162l47625,26965,30003,47024r-3029,601xe" fillcolor="black" stroked="f">
+              <v:shape w14:anchorId="3C4C36E3" id="Graphic 20" o:spid="_x0000_s1026" style="position:absolute;margin-left:85pt;margin-top:9.6pt;width:3.75pt;height:3.75pt;z-index:15736320;visibility:visible;mso-wrap-style:square;mso-wrap-distance-left:0;mso-wrap-distance-top:0;mso-wrap-distance-right:0;mso-wrap-distance-bottom:0;mso-position-horizontal:absolute;mso-position-horizontal-relative:page;mso-position-vertical:absolute;mso-position-vertical-relative:text;v-text-anchor:top" coordsize="47625,47625" o:gfxdata="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" path="m26974,47625r-6324,l17621,47024,,26965,,20650,20650,r6324,l47625,20650r,3162l47625,26965,30003,47024r-3029,601xe" fillcolor="black" stroked="f">
                 <v:path arrowok="t"/>
                 <w10:wrap anchorx="page"/>
               </v:shape>
@@ -5260,7 +5258,7 @@
           </mc:Choice>
           <mc:Fallback>
             <w:pict>
-              <v:shape w14:anchorId="58E9FEB0" id="Graphic 21" o:spid="_x0000_s1026" style="position:absolute;margin-left:85pt;margin-top:5.6pt;width:3.75pt;height:3.75pt;z-index:15736832;visibility:visible;mso-wrap-style:square;mso-wrap-distance-left:0;mso-wrap-distance-top:0;mso-wrap-distance-right:0;mso-wrap-distance-bottom:0;mso-position-horizontal:absolute;mso-position-horizontal-relative:page;mso-position-vertical:absolute;mso-position-vertical-relative:text;v-text-anchor:top" coordsize="47625,47625" o:gfxdata="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" path="m26974,47625r-6324,l17621,47015,,26965,,20650,20650,r6324,l47625,20650r,3162l47625,26965,30003,47015r-3029,610xe" fillcolor="black" stroked="f">
+              <v:shape w14:anchorId="0CFB5A49" id="Graphic 21" o:spid="_x0000_s1026" style="position:absolute;margin-left:85pt;margin-top:5.6pt;width:3.75pt;height:3.75pt;z-index:15736832;visibility:visible;mso-wrap-style:square;mso-wrap-distance-left:0;mso-wrap-distance-top:0;mso-wrap-distance-right:0;mso-wrap-distance-bottom:0;mso-position-horizontal:absolute;mso-position-horizontal-relative:page;mso-position-vertical:absolute;mso-position-vertical-relative:text;v-text-anchor:top" coordsize="47625,47625" o:gfxdata="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" path="m26974,47625r-6324,l17621,47015,,26965,,20650,20650,r6324,l47625,20650r,3162l47625,26965,30003,47015r-3029,610xe" fillcolor="black" stroked="f">
                 <v:path arrowok="t"/>
                 <w10:wrap anchorx="page"/>
               </v:shape>
@@ -5402,7 +5400,7 @@
           </mc:Choice>
           <mc:Fallback>
             <w:pict>
-              <v:shape w14:anchorId="6EC56265" id="Graphic 22" o:spid="_x0000_s1026" style="position:absolute;margin-left:85pt;margin-top:9.55pt;width:3.75pt;height:3.75pt;z-index:15737344;visibility:visible;mso-wrap-style:square;mso-wrap-distance-left:0;mso-wrap-distance-top:0;mso-wrap-distance-right:0;mso-wrap-distance-bottom:0;mso-position-horizontal:absolute;mso-position-horizontal-relative:page;mso-position-vertical:absolute;mso-position-vertical-relative:text;v-text-anchor:top" coordsize="47625,47625" o:gfxdata="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" path="m26974,47625r-6324,l17621,47024,,26965,,20650,20650,r6324,l47625,20650r,3162l47625,26965,30003,47024r-3029,601xe" fillcolor="black" stroked="f">
+              <v:shape w14:anchorId="7E91CAB6" id="Graphic 22" o:spid="_x0000_s1026" style="position:absolute;margin-left:85pt;margin-top:9.55pt;width:3.75pt;height:3.75pt;z-index:15737344;visibility:visible;mso-wrap-style:square;mso-wrap-distance-left:0;mso-wrap-distance-top:0;mso-wrap-distance-right:0;mso-wrap-distance-bottom:0;mso-position-horizontal:absolute;mso-position-horizontal-relative:page;mso-position-vertical:absolute;mso-position-vertical-relative:text;v-text-anchor:top" coordsize="47625,47625" o:gfxdata="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" path="m26974,47625r-6324,l17621,47024,,26965,,20650,20650,r6324,l47625,20650r,3162l47625,26965,30003,47024r-3029,601xe" fillcolor="black" stroked="f">
                 <v:path arrowok="t"/>
                 <w10:wrap anchorx="page"/>
               </v:shape>
@@ -5572,7 +5570,7 @@
           </mc:Choice>
           <mc:Fallback>
             <w:pict>
-              <v:shape w14:anchorId="212091CF" id="Graphic 23" o:spid="_x0000_s1026" style="position:absolute;margin-left:85pt;margin-top:8.85pt;width:3.75pt;height:3.75pt;z-index:15737856;visibility:visible;mso-wrap-style:square;mso-wrap-distance-left:0;mso-wrap-distance-top:0;mso-wrap-distance-right:0;mso-wrap-distance-bottom:0;mso-position-horizontal:absolute;mso-position-horizontal-relative:page;mso-position-vertical:absolute;mso-position-vertical-relative:text;v-text-anchor:top" coordsize="47625,47625" o:gfxdata="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" path="m26974,47625r-6324,l17621,47015,,26965,,20650,20650,r6324,l47625,20650r,3162l47625,26965,30003,47015r-3029,610xe" fillcolor="black" stroked="f">
+              <v:shape w14:anchorId="0197992E" id="Graphic 23" o:spid="_x0000_s1026" style="position:absolute;margin-left:85pt;margin-top:8.85pt;width:3.75pt;height:3.75pt;z-index:15737856;visibility:visible;mso-wrap-style:square;mso-wrap-distance-left:0;mso-wrap-distance-top:0;mso-wrap-distance-right:0;mso-wrap-distance-bottom:0;mso-position-horizontal:absolute;mso-position-horizontal-relative:page;mso-position-vertical:absolute;mso-position-vertical-relative:text;v-text-anchor:top" coordsize="47625,47625" o:gfxdata="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" path="m26974,47625r-6324,l17621,47015,,26965,,20650,20650,r6324,l47625,20650r,3162l47625,26965,30003,47015r-3029,610xe" fillcolor="black" stroked="f">
                 <v:path arrowok="t"/>
                 <w10:wrap anchorx="page"/>
               </v:shape>
@@ -5732,7 +5730,7 @@
           </mc:Choice>
           <mc:Fallback>
             <w:pict>
-              <v:shape w14:anchorId="0539E64C" id="Graphic 24" o:spid="_x0000_s1026" style="position:absolute;margin-left:85pt;margin-top:9.55pt;width:3.75pt;height:3.75pt;z-index:15738368;visibility:visible;mso-wrap-style:square;mso-wrap-distance-left:0;mso-wrap-distance-top:0;mso-wrap-distance-right:0;mso-wrap-distance-bottom:0;mso-position-horizontal:absolute;mso-position-horizontal-relative:page;mso-position-vertical:absolute;mso-position-vertical-relative:text;v-text-anchor:top" coordsize="47625,47625" o:gfxdata="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" path="m26974,47625r-6324,l17621,47015,,26965,,20650,20650,r6324,l47625,20650r,3162l47625,26965,30003,47015r-3029,610xe" fillcolor="black" stroked="f">
+              <v:shape w14:anchorId="1225F36F" id="Graphic 24" o:spid="_x0000_s1026" style="position:absolute;margin-left:85pt;margin-top:9.55pt;width:3.75pt;height:3.75pt;z-index:15738368;visibility:visible;mso-wrap-style:square;mso-wrap-distance-left:0;mso-wrap-distance-top:0;mso-wrap-distance-right:0;mso-wrap-distance-bottom:0;mso-position-horizontal:absolute;mso-position-horizontal-relative:page;mso-position-vertical:absolute;mso-position-vertical-relative:text;v-text-anchor:top" coordsize="47625,47625" o:gfxdata="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" path="m26974,47625r-6324,l17621,47015,,26965,,20650,20650,r6324,l47625,20650r,3162l47625,26965,30003,47015r-3029,610xe" fillcolor="black" stroked="f">
                 <v:path arrowok="t"/>
                 <w10:wrap anchorx="page"/>
               </v:shape>
@@ -6067,7 +6065,7 @@
           </mc:Choice>
           <mc:Fallback>
             <w:pict>
-              <v:shape w14:anchorId="389E3B0B" id="Graphic 25" o:spid="_x0000_s1026" style="position:absolute;margin-left:85pt;margin-top:6.9pt;width:3.75pt;height:3.75pt;z-index:15738880;visibility:visible;mso-wrap-style:square;mso-wrap-distance-left:0;mso-wrap-distance-top:0;mso-wrap-distance-right:0;mso-wrap-distance-bottom:0;mso-position-horizontal:absolute;mso-position-horizontal-relative:page;mso-position-vertical:absolute;mso-position-vertical-relative:text;v-text-anchor:top" coordsize="47625,47625" o:gfxdata="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" path="m26974,47625r-6324,l17621,47024,,26965,,20650,20650,r6324,l47625,20650r,3162l47625,26965,30003,47015r-3029,610xe" fillcolor="black" stroked="f">
+              <v:shape w14:anchorId="17766B6B" id="Graphic 25" o:spid="_x0000_s1026" style="position:absolute;margin-left:85pt;margin-top:6.9pt;width:3.75pt;height:3.75pt;z-index:15738880;visibility:visible;mso-wrap-style:square;mso-wrap-distance-left:0;mso-wrap-distance-top:0;mso-wrap-distance-right:0;mso-wrap-distance-bottom:0;mso-position-horizontal:absolute;mso-position-horizontal-relative:page;mso-position-vertical:absolute;mso-position-vertical-relative:text;v-text-anchor:top" coordsize="47625,47625" o:gfxdata="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" path="m26974,47625r-6324,l17621,47024,,26965,,20650,20650,r6324,l47625,20650r,3162l47625,26965,30003,47015r-3029,610xe" fillcolor="black" stroked="f">
                 <v:path arrowok="t"/>
                 <w10:wrap anchorx="page"/>
               </v:shape>
@@ -6221,7 +6219,7 @@
           </mc:Choice>
           <mc:Fallback>
             <w:pict>
-              <v:shape w14:anchorId="0236ABB4" id="Graphic 26" o:spid="_x0000_s1026" style="position:absolute;margin-left:85pt;margin-top:9.6pt;width:3.75pt;height:3.75pt;z-index:15739392;visibility:visible;mso-wrap-style:square;mso-wrap-distance-left:0;mso-wrap-distance-top:0;mso-wrap-distance-right:0;mso-wrap-distance-bottom:0;mso-position-horizontal:absolute;mso-position-horizontal-relative:page;mso-position-vertical:absolute;mso-position-vertical-relative:text;v-text-anchor:top" coordsize="47625,47625" o:gfxdata="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" path="m26974,47625r-6324,l17621,47015,,26965,,20650,20650,r6324,l47625,20650r,3162l47625,26965,30003,47015r-3029,610xe" fillcolor="black" stroked="f">
+              <v:shape w14:anchorId="0E8B51EF" id="Graphic 26" o:spid="_x0000_s1026" style="position:absolute;margin-left:85pt;margin-top:9.6pt;width:3.75pt;height:3.75pt;z-index:15739392;visibility:visible;mso-wrap-style:square;mso-wrap-distance-left:0;mso-wrap-distance-top:0;mso-wrap-distance-right:0;mso-wrap-distance-bottom:0;mso-position-horizontal:absolute;mso-position-horizontal-relative:page;mso-position-vertical:absolute;mso-position-vertical-relative:text;v-text-anchor:top" coordsize="47625,47625" o:gfxdata="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" path="m26974,47625r-6324,l17621,47015,,26965,,20650,20650,r6324,l47625,20650r,3162l47625,26965,30003,47015r-3029,610xe" fillcolor="black" stroked="f">
                 <v:path arrowok="t"/>
                 <w10:wrap anchorx="page"/>
               </v:shape>
@@ -6375,7 +6373,7 @@
           </mc:Choice>
           <mc:Fallback>
             <w:pict>
-              <v:shape w14:anchorId="6ECC7C39" id="Graphic 27" o:spid="_x0000_s1026" style="position:absolute;margin-left:85pt;margin-top:8.8pt;width:3.75pt;height:3.75pt;z-index:15739904;visibility:visible;mso-wrap-style:square;mso-wrap-distance-left:0;mso-wrap-distance-top:0;mso-wrap-distance-right:0;mso-wrap-distance-bottom:0;mso-position-horizontal:absolute;mso-position-horizontal-relative:page;mso-position-vertical:absolute;mso-position-vertical-relative:text;v-text-anchor:top" coordsize="47625,47625" o:gfxdata="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" path="m26974,47625r-6324,l17621,47024,,26965,,20650,20650,r6324,l47625,20650r,3162l47625,26965,30003,47024r-3029,601xe" fillcolor="black" stroked="f">
+              <v:shape w14:anchorId="7B2CDF5E" id="Graphic 27" o:spid="_x0000_s1026" style="position:absolute;margin-left:85pt;margin-top:8.8pt;width:3.75pt;height:3.75pt;z-index:15739904;visibility:visible;mso-wrap-style:square;mso-wrap-distance-left:0;mso-wrap-distance-top:0;mso-wrap-distance-right:0;mso-wrap-distance-bottom:0;mso-position-horizontal:absolute;mso-position-horizontal-relative:page;mso-position-vertical:absolute;mso-position-vertical-relative:text;v-text-anchor:top" coordsize="47625,47625" o:gfxdata="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" path="m26974,47625r-6324,l17621,47024,,26965,,20650,20650,r6324,l47625,20650r,3162l47625,26965,30003,47024r-3029,601xe" fillcolor="black" stroked="f">
                 <v:path arrowok="t"/>
                 <w10:wrap anchorx="page"/>
               </v:shape>
@@ -6529,7 +6527,7 @@
           </mc:Choice>
           <mc:Fallback>
             <w:pict>
-              <v:shape w14:anchorId="7BEFB6A7" id="Graphic 28" o:spid="_x0000_s1026" style="position:absolute;margin-left:85pt;margin-top:9.6pt;width:3.75pt;height:3.75pt;z-index:15740416;visibility:visible;mso-wrap-style:square;mso-wrap-distance-left:0;mso-wrap-distance-top:0;mso-wrap-distance-right:0;mso-wrap-distance-bottom:0;mso-position-horizontal:absolute;mso-position-horizontal-relative:page;mso-position-vertical:absolute;mso-position-vertical-relative:text;v-text-anchor:top" coordsize="47625,47625" o:gfxdata="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" path="m26974,47625r-6324,l17621,47015,,26965,,20650,20650,r6324,l47625,20650r,3162l47625,26965,30003,47015r-3029,610xe" fillcolor="black" stroked="f">
+              <v:shape w14:anchorId="20389CF4" id="Graphic 28" o:spid="_x0000_s1026" style="position:absolute;margin-left:85pt;margin-top:9.6pt;width:3.75pt;height:3.75pt;z-index:15740416;visibility:visible;mso-wrap-style:square;mso-wrap-distance-left:0;mso-wrap-distance-top:0;mso-wrap-distance-right:0;mso-wrap-distance-bottom:0;mso-position-horizontal:absolute;mso-position-horizontal-relative:page;mso-position-vertical:absolute;mso-position-vertical-relative:text;v-text-anchor:top" coordsize="47625,47625" o:gfxdata="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" path="m26974,47625r-6324,l17621,47015,,26965,,20650,20650,r6324,l47625,20650r,3162l47625,26965,30003,47015r-3029,610xe" fillcolor="black" stroked="f">
                 <v:path arrowok="t"/>
                 <w10:wrap anchorx="page"/>
               </v:shape>
@@ -6941,7 +6939,7 @@
           </mc:Choice>
           <mc:Fallback>
             <w:pict>
-              <v:shape w14:anchorId="7654AA71" id="Graphic 29" o:spid="_x0000_s1026" style="position:absolute;margin-left:85pt;margin-top:5.55pt;width:3.75pt;height:3.75pt;z-index:15741440;visibility:visible;mso-wrap-style:square;mso-wrap-distance-left:0;mso-wrap-distance-top:0;mso-wrap-distance-right:0;mso-wrap-distance-bottom:0;mso-position-horizontal:absolute;mso-position-horizontal-relative:page;mso-position-vertical:absolute;mso-position-vertical-relative:text;v-text-anchor:top" coordsize="47625,47625" o:gfxdata="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" path="m26970,47623r-6316,l17617,47019,,26969,,20653,20654,r6316,l47625,23812r-1,3157l26970,47623xe" fillcolor="black" stroked="f">
+              <v:shape w14:anchorId="2FB04851" id="Graphic 29" o:spid="_x0000_s1026" style="position:absolute;margin-left:85pt;margin-top:5.55pt;width:3.75pt;height:3.75pt;z-index:15741440;visibility:visible;mso-wrap-style:square;mso-wrap-distance-left:0;mso-wrap-distance-top:0;mso-wrap-distance-right:0;mso-wrap-distance-bottom:0;mso-position-horizontal:absolute;mso-position-horizontal-relative:page;mso-position-vertical:absolute;mso-position-vertical-relative:text;v-text-anchor:top" coordsize="47625,47625" o:gfxdata="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" path="m26970,47623r-6316,l17617,47019,,26969,,20653,20654,r6316,l47625,23812r-1,3157l26970,47623xe" fillcolor="black" stroked="f">
                 <v:path arrowok="t"/>
                 <w10:wrap anchorx="page"/>
               </v:shape>
@@ -7160,7 +7158,7 @@
           </mc:Choice>
           <mc:Fallback>
             <w:pict>
-              <v:shape w14:anchorId="08D27348" id="Graphic 30" o:spid="_x0000_s1026" style="position:absolute;margin-left:85pt;margin-top:9.6pt;width:3.75pt;height:3.75pt;z-index:15741952;visibility:visible;mso-wrap-style:square;mso-wrap-distance-left:0;mso-wrap-distance-top:0;mso-wrap-distance-right:0;mso-wrap-distance-bottom:0;mso-position-horizontal:absolute;mso-position-horizontal-relative:page;mso-position-vertical:absolute;mso-position-vertical-relative:text;v-text-anchor:top" coordsize="47625,47625" o:gfxdata="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" path="m26970,47624r-6316,l17617,47020,,26969,,20653,20654,r6316,l47625,23812r-1,3157l26970,47624xe" fillcolor="black" stroked="f">
+              <v:shape w14:anchorId="2ADCD91D" id="Graphic 30" o:spid="_x0000_s1026" style="position:absolute;margin-left:85pt;margin-top:9.6pt;width:3.75pt;height:3.75pt;z-index:15741952;visibility:visible;mso-wrap-style:square;mso-wrap-distance-left:0;mso-wrap-distance-top:0;mso-wrap-distance-right:0;mso-wrap-distance-bottom:0;mso-position-horizontal:absolute;mso-position-horizontal-relative:page;mso-position-vertical:absolute;mso-position-vertical-relative:text;v-text-anchor:top" coordsize="47625,47625" o:gfxdata="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" path="m26970,47624r-6316,l17617,47020,,26969,,20653,20654,r6316,l47625,23812r-1,3157l26970,47624xe" fillcolor="black" stroked="f">
                 <v:path arrowok="t"/>
                 <w10:wrap anchorx="page"/>
               </v:shape>
@@ -7401,7 +7399,7 @@
           </mc:Choice>
           <mc:Fallback>
             <w:pict>
-              <v:shape w14:anchorId="784EE7D3" id="Graphic 31" o:spid="_x0000_s1026" style="position:absolute;margin-left:85pt;margin-top:8.8pt;width:3.75pt;height:3.75pt;z-index:15742464;visibility:visible;mso-wrap-style:square;mso-wrap-distance-left:0;mso-wrap-distance-top:0;mso-wrap-distance-right:0;mso-wrap-distance-bottom:0;mso-position-horizontal:absolute;mso-position-horizontal-relative:page;mso-position-vertical:absolute;mso-position-vertical-relative:text;v-text-anchor:top" coordsize="47625,47625" o:gfxdata="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" path="m26970,47623r-6316,l17617,47019,,26969,,20653,20654,r6316,l47625,23812r-1,3157l26970,47623xe" fillcolor="black" stroked="f">
+              <v:shape w14:anchorId="08AFBCCC" id="Graphic 31" o:spid="_x0000_s1026" style="position:absolute;margin-left:85pt;margin-top:8.8pt;width:3.75pt;height:3.75pt;z-index:15742464;visibility:visible;mso-wrap-style:square;mso-wrap-distance-left:0;mso-wrap-distance-top:0;mso-wrap-distance-right:0;mso-wrap-distance-bottom:0;mso-position-horizontal:absolute;mso-position-horizontal-relative:page;mso-position-vertical:absolute;mso-position-vertical-relative:text;v-text-anchor:top" coordsize="47625,47625" o:gfxdata="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" path="m26970,47623r-6316,l17617,47019,,26969,,20653,20654,r6316,l47625,23812r-1,3157l26970,47623xe" fillcolor="black" stroked="f">
                 <v:path arrowok="t"/>
                 <w10:wrap anchorx="page"/>
               </v:shape>
@@ -7533,7 +7531,7 @@
           </mc:Choice>
           <mc:Fallback>
             <w:pict>
-              <v:shape w14:anchorId="5E061A35" id="Graphic 32" o:spid="_x0000_s1026" style="position:absolute;margin-left:85pt;margin-top:9.6pt;width:3.75pt;height:3.75pt;z-index:15742976;visibility:visible;mso-wrap-style:square;mso-wrap-distance-left:0;mso-wrap-distance-top:0;mso-wrap-distance-right:0;mso-wrap-distance-bottom:0;mso-position-horizontal:absolute;mso-position-horizontal-relative:page;mso-position-vertical:absolute;mso-position-vertical-relative:text;v-text-anchor:top" coordsize="47625,47625" o:gfxdata="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" path="m26970,47623r-6316,l17617,47019,,26969,,20653,20654,r6316,l47625,23812r-1,3157l26970,47623xe" fillcolor="black" stroked="f">
+              <v:shape w14:anchorId="5762EB21" id="Graphic 32" o:spid="_x0000_s1026" style="position:absolute;margin-left:85pt;margin-top:9.6pt;width:3.75pt;height:3.75pt;z-index:15742976;visibility:visible;mso-wrap-style:square;mso-wrap-distance-left:0;mso-wrap-distance-top:0;mso-wrap-distance-right:0;mso-wrap-distance-bottom:0;mso-position-horizontal:absolute;mso-position-horizontal-relative:page;mso-position-vertical:absolute;mso-position-vertical-relative:text;v-text-anchor:top" coordsize="47625,47625" o:gfxdata="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" path="m26970,47623r-6316,l17617,47019,,26969,,20653,20654,r6316,l47625,23812r-1,3157l26970,47623xe" fillcolor="black" stroked="f">
                 <v:path arrowok="t"/>
                 <w10:wrap anchorx="page"/>
               </v:shape>
@@ -7649,15 +7647,7 @@
                                 <w:spacing w:val="-6"/>
                                 <w:sz w:val="23"/>
                               </w:rPr>
-                              <w:t xml:space="preserve">(mark &lt; 0 ) || (mark &gt; 100)  </w:t>
-                            </w:r>
-                            <w:r>
-                              <w:rPr>
-                                <w:color w:val="000000" w:themeColor="text1"/>
-                                <w:spacing w:val="-6"/>
-                                <w:sz w:val="23"/>
-                              </w:rPr>
-                              <w:t>;</w:t>
+                              <w:t>(mark &lt; 0 ) || (mark &gt; 100)  ;</w:t>
                             </w:r>
                           </w:p>
                         </w:txbxContent>
@@ -7682,7 +7672,7 @@
           </mc:Choice>
           <mc:Fallback>
             <w:pict>
-              <v:rect w14:anchorId="2B900A91" id="Rectangle 91" o:spid="_x0000_s1028" style="position:absolute;left:0;text-align:left;margin-left:37.55pt;margin-top:36.35pt;width:169.3pt;height:24.75pt;z-index:487643648;visibility:visible;mso-wrap-style:square;mso-width-percent:0;mso-height-percent:0;mso-wrap-distance-left:9pt;mso-wrap-distance-top:0;mso-wrap-distance-right:9pt;mso-wrap-distance-bottom:0;mso-position-horizontal:absolute;mso-position-horizontal-relative:text;mso-position-vertical:absolute;mso-position-vertical-relative:text;mso-width-percent:0;mso-height-percent:0;mso-width-relative:margin;mso-height-relative:margin;v-text-anchor:middle" o:gfxdata="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" fillcolor="#fbd4b4 [1305]" strokecolor="#0a121c [484]" strokeweight="2pt">
+              <v:rect w14:anchorId="2B900A91" id="Rectangle 91" o:spid="_x0000_s1028" style="position:absolute;left:0;text-align:left;margin-left:37.55pt;margin-top:36.35pt;width:169.3pt;height:24.75pt;z-index:487643648;visibility:visible;mso-wrap-style:square;mso-width-percent:0;mso-height-percent:0;mso-wrap-distance-left:9pt;mso-wrap-distance-top:0;mso-wrap-distance-right:9pt;mso-wrap-distance-bottom:0;mso-position-horizontal:absolute;mso-position-horizontal-relative:text;mso-position-vertical:absolute;mso-position-vertical-relative:text;mso-width-percent:0;mso-height-percent:0;mso-width-relative:margin;mso-height-relative:margin;v-text-anchor:middle" o:gfxdata="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" fillcolor="#fbd4b4 [1305]" strokecolor="#0a121c [484]" strokeweight="2pt">
                 <v:textbox>
                   <w:txbxContent>
                     <w:p>
@@ -7698,15 +7688,7 @@
                           <w:spacing w:val="-6"/>
                           <w:sz w:val="23"/>
                         </w:rPr>
-                        <w:t xml:space="preserve">(mark &lt; 0 ) || (mark &gt; 100)  </w:t>
-                      </w:r>
-                      <w:r>
-                        <w:rPr>
-                          <w:color w:val="000000" w:themeColor="text1"/>
-                          <w:spacing w:val="-6"/>
-                          <w:sz w:val="23"/>
-                        </w:rPr>
-                        <w:t>;</w:t>
+                        <w:t>(mark &lt; 0 ) || (mark &gt; 100)  ;</w:t>
                       </w:r>
                     </w:p>
                   </w:txbxContent>
@@ -7799,13 +7781,7 @@
         <w:rPr>
           <w:spacing w:val="-8"/>
         </w:rPr>
-        <w:t xml:space="preserve"> </w:t>
-      </w:r>
-      <w:r>
-        <w:rPr>
-          <w:spacing w:val="-8"/>
-        </w:rPr>
-        <w:t>w</w:t>
+        <w:t xml:space="preserve"> w</w:t>
       </w:r>
       <w:r>
         <w:rPr>
@@ -7992,7 +7968,7 @@
           </mc:Choice>
           <mc:Fallback>
             <w:pict>
-              <v:shape w14:anchorId="68563F0C" id="Graphic 33" o:spid="_x0000_s1026" style="position:absolute;margin-left:85pt;margin-top:7.7pt;width:3.75pt;height:3.75pt;z-index:15743488;visibility:visible;mso-wrap-style:square;mso-wrap-distance-left:0;mso-wrap-distance-top:0;mso-wrap-distance-right:0;mso-wrap-distance-bottom:0;mso-position-horizontal:absolute;mso-position-horizontal-relative:page;mso-position-vertical:absolute;mso-position-vertical-relative:text;v-text-anchor:top" coordsize="47625,47625" o:gfxdata="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" path="m26970,47623r-6316,l17617,47019,,26969,,20653,20654,r6316,l47625,23812r-1,3157l26970,47623xe" fillcolor="black" stroked="f">
+              <v:shape w14:anchorId="2CCC3871" id="Graphic 33" o:spid="_x0000_s1026" style="position:absolute;margin-left:85pt;margin-top:7.7pt;width:3.75pt;height:3.75pt;z-index:15743488;visibility:visible;mso-wrap-style:square;mso-wrap-distance-left:0;mso-wrap-distance-top:0;mso-wrap-distance-right:0;mso-wrap-distance-bottom:0;mso-position-horizontal:absolute;mso-position-horizontal-relative:page;mso-position-vertical:absolute;mso-position-vertical-relative:text;v-text-anchor:top" coordsize="47625,47625" o:gfxdata="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" path="m26970,47623r-6316,l17617,47019,,26969,,20653,20654,r6316,l47625,23812r-1,3157l26970,47623xe" fillcolor="black" stroked="f">
                 <v:path arrowok="t"/>
                 <w10:wrap anchorx="page"/>
               </v:shape>
@@ -8195,7 +8171,7 @@
           </mc:Choice>
           <mc:Fallback>
             <w:pict>
-              <v:shape w14:anchorId="3D11FA69" id="Graphic 34" o:spid="_x0000_s1026" style="position:absolute;margin-left:85pt;margin-top:8.8pt;width:3.75pt;height:3.75pt;z-index:15744000;visibility:visible;mso-wrap-style:square;mso-wrap-distance-left:0;mso-wrap-distance-top:0;mso-wrap-distance-right:0;mso-wrap-distance-bottom:0;mso-position-horizontal:absolute;mso-position-horizontal-relative:page;mso-position-vertical:absolute;mso-position-vertical-relative:text;v-text-anchor:top" coordsize="47625,47625" o:gfxdata="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" path="m26970,47623r-6316,l17617,47019,,26969,,20653,20654,r6316,l47625,23812r-1,3157l26970,47623xe" fillcolor="black" stroked="f">
+              <v:shape w14:anchorId="70AE3F52" id="Graphic 34" o:spid="_x0000_s1026" style="position:absolute;margin-left:85pt;margin-top:8.8pt;width:3.75pt;height:3.75pt;z-index:15744000;visibility:visible;mso-wrap-style:square;mso-wrap-distance-left:0;mso-wrap-distance-top:0;mso-wrap-distance-right:0;mso-wrap-distance-bottom:0;mso-position-horizontal:absolute;mso-position-horizontal-relative:page;mso-position-vertical:absolute;mso-position-vertical-relative:text;v-text-anchor:top" coordsize="47625,47625" o:gfxdata="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" path="m26970,47623r-6316,l17617,47019,,26969,,20653,20654,r6316,l47625,23812r-1,3157l26970,47623xe" fillcolor="black" stroked="f">
                 <v:path arrowok="t"/>
                 <w10:wrap anchorx="page"/>
               </v:shape>
@@ -8380,7 +8356,7 @@
           </mc:Choice>
           <mc:Fallback>
             <w:pict>
-              <v:shape w14:anchorId="5FE2630C" id="Graphic 35" o:spid="_x0000_s1026" style="position:absolute;margin-left:85pt;margin-top:8.85pt;width:3.75pt;height:3.75pt;z-index:15744512;visibility:visible;mso-wrap-style:square;mso-wrap-distance-left:0;mso-wrap-distance-top:0;mso-wrap-distance-right:0;mso-wrap-distance-bottom:0;mso-position-horizontal:absolute;mso-position-horizontal-relative:page;mso-position-vertical:absolute;mso-position-vertical-relative:text;v-text-anchor:top" coordsize="47625,47625" o:gfxdata="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" path="m26970,47623r-6316,l17617,47019,,26969,,20654,20654,r6316,l47625,23812r-1,3157l26970,47623xe" fillcolor="black" stroked="f">
+              <v:shape w14:anchorId="4A820414" id="Graphic 35" o:spid="_x0000_s1026" style="position:absolute;margin-left:85pt;margin-top:8.85pt;width:3.75pt;height:3.75pt;z-index:15744512;visibility:visible;mso-wrap-style:square;mso-wrap-distance-left:0;mso-wrap-distance-top:0;mso-wrap-distance-right:0;mso-wrap-distance-bottom:0;mso-position-horizontal:absolute;mso-position-horizontal-relative:page;mso-position-vertical:absolute;mso-position-vertical-relative:text;v-text-anchor:top" coordsize="47625,47625" o:gfxdata="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" path="m26970,47623r-6316,l17617,47019,,26969,,20654,20654,r6316,l47625,23812r-1,3157l26970,47623xe" fillcolor="black" stroked="f">
                 <v:path arrowok="t"/>
                 <w10:wrap anchorx="page"/>
               </v:shape>
@@ -8510,7 +8486,7 @@
           </mc:Choice>
           <mc:Fallback>
             <w:pict>
-              <v:shape w14:anchorId="6C13B466" id="Graphic 36" o:spid="_x0000_s1026" style="position:absolute;margin-left:85pt;margin-top:9.55pt;width:3.75pt;height:3.75pt;z-index:15745024;visibility:visible;mso-wrap-style:square;mso-wrap-distance-left:0;mso-wrap-distance-top:0;mso-wrap-distance-right:0;mso-wrap-distance-bottom:0;mso-position-horizontal:absolute;mso-position-horizontal-relative:page;mso-position-vertical:absolute;mso-position-vertical-relative:text;v-text-anchor:top" coordsize="47625,47625" o:gfxdata="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" path="m26970,47623r-6316,l17617,47019,,26969,,20653,20654,r6316,l47625,23812r-1,3157l26970,47623xe" fillcolor="black" stroked="f">
+              <v:shape w14:anchorId="247FE6C1" id="Graphic 36" o:spid="_x0000_s1026" style="position:absolute;margin-left:85pt;margin-top:9.55pt;width:3.75pt;height:3.75pt;z-index:15745024;visibility:visible;mso-wrap-style:square;mso-wrap-distance-left:0;mso-wrap-distance-top:0;mso-wrap-distance-right:0;mso-wrap-distance-bottom:0;mso-position-horizontal:absolute;mso-position-horizontal-relative:page;mso-position-vertical:absolute;mso-position-vertical-relative:text;v-text-anchor:top" coordsize="47625,47625" o:gfxdata="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" path="m26970,47623r-6316,l17617,47019,,26969,,20653,20654,r6316,l47625,23812r-1,3157l26970,47623xe" fillcolor="black" stroked="f">
                 <v:path arrowok="t"/>
                 <w10:wrap anchorx="page"/>
               </v:shape>
@@ -8666,7 +8642,7 @@
           </mc:Choice>
           <mc:Fallback>
             <w:pict>
-              <v:rect w14:anchorId="6A4CA80F" id="_x0000_s1029" style="position:absolute;left:0;text-align:left;margin-left:32.3pt;margin-top:32.2pt;width:169.3pt;height:24.75pt;z-index:487612928;visibility:visible;mso-wrap-style:square;mso-width-percent:0;mso-height-percent:0;mso-wrap-distance-left:9pt;mso-wrap-distance-top:0;mso-wrap-distance-right:9pt;mso-wrap-distance-bottom:0;mso-position-horizontal:absolute;mso-position-horizontal-relative:text;mso-position-vertical:absolute;mso-position-vertical-relative:text;mso-width-percent:0;mso-height-percent:0;mso-width-relative:margin;mso-height-relative:margin;v-text-anchor:middle" o:gfxdata="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" fillcolor="#fbd4b4 [1305]" strokecolor="#0a121c [484]" strokeweight="2pt">
+              <v:rect w14:anchorId="6A4CA80F" id="_x0000_s1029" style="position:absolute;left:0;text-align:left;margin-left:32.3pt;margin-top:32.2pt;width:169.3pt;height:24.75pt;z-index:487612928;visibility:visible;mso-wrap-style:square;mso-width-percent:0;mso-height-percent:0;mso-wrap-distance-left:9pt;mso-wrap-distance-top:0;mso-wrap-distance-right:9pt;mso-wrap-distance-bottom:0;mso-position-horizontal:absolute;mso-position-horizontal-relative:text;mso-position-vertical:absolute;mso-position-vertical-relative:text;mso-width-percent:0;mso-height-percent:0;mso-width-relative:margin;mso-height-relative:margin;v-text-anchor:middle" o:gfxdata="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" fillcolor="#fbd4b4 [1305]" strokecolor="#0a121c [484]" strokeweight="2pt">
                 <v:textbox>
                   <w:txbxContent>
                     <w:p>
@@ -8835,7 +8811,7 @@
           </mc:Choice>
           <mc:Fallback>
             <w:pict>
-              <v:shape w14:anchorId="7D83BF42" id="Text Box 93" o:spid="_x0000_s1030" type="#_x0000_t202" style="position:absolute;left:0;text-align:left;margin-left:134.75pt;margin-top:4pt;width:66.8pt;height:23.5pt;z-index:487645696;visibility:visible;mso-wrap-style:square;mso-width-percent:0;mso-height-percent:0;mso-wrap-distance-left:9pt;mso-wrap-distance-top:0;mso-wrap-distance-right:9pt;mso-wrap-distance-bottom:0;mso-position-horizontal:absolute;mso-position-horizontal-relative:text;mso-position-vertical:absolute;mso-position-vertical-relative:text;mso-width-percent:0;mso-height-percent:0;mso-width-relative:margin;mso-height-relative:margin;v-text-anchor:top" o:gfxdata="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" fillcolor="#fbd4b4 [1305]" strokeweight="2pt">
+              <v:shape w14:anchorId="7D83BF42" id="Text Box 93" o:spid="_x0000_s1030" type="#_x0000_t202" style="position:absolute;left:0;text-align:left;margin-left:134.75pt;margin-top:4pt;width:66.8pt;height:23.5pt;z-index:487645696;visibility:visible;mso-wrap-style:square;mso-width-percent:0;mso-height-percent:0;mso-wrap-distance-left:9pt;mso-wrap-distance-top:0;mso-wrap-distance-right:9pt;mso-wrap-distance-bottom:0;mso-position-horizontal:absolute;mso-position-horizontal-relative:text;mso-position-vertical:absolute;mso-position-vertical-relative:text;mso-width-percent:0;mso-height-percent:0;mso-width-relative:margin;mso-height-relative:margin;v-text-anchor:top" o:gfxdata="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" fillcolor="#fbd4b4 [1305]" strokeweight="2pt">
                 <v:textbox>
                   <w:txbxContent>
                     <w:p>
@@ -8859,10 +8835,7 @@
         </mc:AlternateContent>
       </w:r>
       <w:r>
-        <w:t xml:space="preserve">what </w:t>
-      </w:r>
-      <w:r>
-        <w:t xml:space="preserve">value has </w:t>
+        <w:t xml:space="preserve">what value has </w:t>
       </w:r>
       <w:r>
         <w:t xml:space="preserve">        </w:t>
@@ -8974,7 +8947,7 @@
           </mc:Choice>
           <mc:Fallback>
             <w:pict>
-              <v:shape w14:anchorId="2CD6E18D" id="Graphic 37" o:spid="_x0000_s1026" style="position:absolute;margin-left:85pt;margin-top:5.55pt;width:3.75pt;height:3.75pt;z-index:15745536;visibility:visible;mso-wrap-style:square;mso-wrap-distance-left:0;mso-wrap-distance-top:0;mso-wrap-distance-right:0;mso-wrap-distance-bottom:0;mso-position-horizontal:absolute;mso-position-horizontal-relative:page;mso-position-vertical:absolute;mso-position-vertical-relative:text;v-text-anchor:top" coordsize="47625,47625" o:gfxdata="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" path="m26970,47623r-6316,l17617,47018,,26969,,20654,20654,r6316,l47625,23812r-1,3157l26970,47623xe" fillcolor="black" stroked="f">
+              <v:shape w14:anchorId="0E5B0B5B" id="Graphic 37" o:spid="_x0000_s1026" style="position:absolute;margin-left:85pt;margin-top:5.55pt;width:3.75pt;height:3.75pt;z-index:15745536;visibility:visible;mso-wrap-style:square;mso-wrap-distance-left:0;mso-wrap-distance-top:0;mso-wrap-distance-right:0;mso-wrap-distance-bottom:0;mso-position-horizontal:absolute;mso-position-horizontal-relative:page;mso-position-vertical:absolute;mso-position-vertical-relative:text;v-text-anchor:top" coordsize="47625,47625" o:gfxdata="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" path="m26970,47623r-6316,l17617,47018,,26969,,20654,20654,r6316,l47625,23812r-1,3157l26970,47623xe" fillcolor="black" stroked="f">
                 <v:path arrowok="t"/>
                 <w10:wrap anchorx="page"/>
               </v:shape>
@@ -9100,7 +9073,7 @@
           </mc:Choice>
           <mc:Fallback>
             <w:pict>
-              <v:shape w14:anchorId="49354048" id="Graphic 38" o:spid="_x0000_s1026" style="position:absolute;margin-left:85pt;margin-top:9.6pt;width:3.75pt;height:3.75pt;z-index:15746048;visibility:visible;mso-wrap-style:square;mso-wrap-distance-left:0;mso-wrap-distance-top:0;mso-wrap-distance-right:0;mso-wrap-distance-bottom:0;mso-position-horizontal:absolute;mso-position-horizontal-relative:page;mso-position-vertical:absolute;mso-position-vertical-relative:text;v-text-anchor:top" coordsize="47625,47625" o:gfxdata="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" path="m26970,47623r-6316,l17617,47019,,26969,,20653,20654,r6316,l47625,23812r-1,3157l26970,47623xe" fillcolor="black" stroked="f">
+              <v:shape w14:anchorId="021958AD" id="Graphic 38" o:spid="_x0000_s1026" style="position:absolute;margin-left:85pt;margin-top:9.6pt;width:3.75pt;height:3.75pt;z-index:15746048;visibility:visible;mso-wrap-style:square;mso-wrap-distance-left:0;mso-wrap-distance-top:0;mso-wrap-distance-right:0;mso-wrap-distance-bottom:0;mso-position-horizontal:absolute;mso-position-horizontal-relative:page;mso-position-vertical:absolute;mso-position-vertical-relative:text;v-text-anchor:top" coordsize="47625,47625" o:gfxdata="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" path="m26970,47623r-6316,l17617,47019,,26969,,20653,20654,r6316,l47625,23812r-1,3157l26970,47623xe" fillcolor="black" stroked="f">
                 <v:path arrowok="t"/>
                 <w10:wrap anchorx="page"/>
               </v:shape>
@@ -9222,7 +9195,7 @@
           </mc:Choice>
           <mc:Fallback>
             <w:pict>
-              <v:shape w14:anchorId="379F8C06" id="Graphic 39" o:spid="_x0000_s1026" style="position:absolute;margin-left:85pt;margin-top:8.8pt;width:3.75pt;height:3.75pt;z-index:15746560;visibility:visible;mso-wrap-style:square;mso-wrap-distance-left:0;mso-wrap-distance-top:0;mso-wrap-distance-right:0;mso-wrap-distance-bottom:0;mso-position-horizontal:absolute;mso-position-horizontal-relative:page;mso-position-vertical:absolute;mso-position-vertical-relative:text;v-text-anchor:top" coordsize="47625,47625" o:gfxdata="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" path="m26970,47623r-6316,l17617,47019,,26969,,20653,20654,r6316,l47625,23812r-1,3157l26970,47623xe" fillcolor="black" stroked="f">
+              <v:shape w14:anchorId="2A669584" id="Graphic 39" o:spid="_x0000_s1026" style="position:absolute;margin-left:85pt;margin-top:8.8pt;width:3.75pt;height:3.75pt;z-index:15746560;visibility:visible;mso-wrap-style:square;mso-wrap-distance-left:0;mso-wrap-distance-top:0;mso-wrap-distance-right:0;mso-wrap-distance-bottom:0;mso-position-horizontal:absolute;mso-position-horizontal-relative:page;mso-position-vertical:absolute;mso-position-vertical-relative:text;v-text-anchor:top" coordsize="47625,47625" o:gfxdata="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" path="m26970,47623r-6316,l17617,47019,,26969,,20653,20654,r6316,l47625,23812r-1,3157l26970,47623xe" fillcolor="black" stroked="f">
                 <v:path arrowok="t"/>
                 <w10:wrap anchorx="page"/>
               </v:shape>
@@ -9348,7 +9321,7 @@
           </mc:Choice>
           <mc:Fallback>
             <w:pict>
-              <v:shape w14:anchorId="64E5AB12" id="Graphic 40" o:spid="_x0000_s1026" style="position:absolute;margin-left:85pt;margin-top:9.65pt;width:3.75pt;height:3.75pt;z-index:15747072;visibility:visible;mso-wrap-style:square;mso-wrap-distance-left:0;mso-wrap-distance-top:0;mso-wrap-distance-right:0;mso-wrap-distance-bottom:0;mso-position-horizontal:absolute;mso-position-horizontal-relative:page;mso-position-vertical:absolute;mso-position-vertical-relative:text;v-text-anchor:top" coordsize="47625,47625" o:gfxdata="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" path="m26970,47624r-6316,l17617,47020,,26969,,20653,20654,r6316,l47625,23812r-1,3157l26970,47624xe" fillcolor="black" stroked="f">
+              <v:shape w14:anchorId="46FA9197" id="Graphic 40" o:spid="_x0000_s1026" style="position:absolute;margin-left:85pt;margin-top:9.65pt;width:3.75pt;height:3.75pt;z-index:15747072;visibility:visible;mso-wrap-style:square;mso-wrap-distance-left:0;mso-wrap-distance-top:0;mso-wrap-distance-right:0;mso-wrap-distance-bottom:0;mso-position-horizontal:absolute;mso-position-horizontal-relative:page;mso-position-vertical:absolute;mso-position-vertical-relative:text;v-text-anchor:top" coordsize="47625,47625" o:gfxdata="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" path="m26970,47624r-6316,l17617,47020,,26969,,20653,20654,r6316,l47625,23812r-1,3157l26970,47624xe" fillcolor="black" stroked="f">
                 <v:path arrowok="t"/>
                 <w10:wrap anchorx="page"/>
               </v:shape>
@@ -9929,7 +9902,7 @@
           </mc:Choice>
           <mc:Fallback>
             <w:pict>
-              <v:rect w14:anchorId="3DB55FE8" id="_x0000_s1031" style="position:absolute;margin-left:25.1pt;margin-top:6.85pt;width:209.75pt;height:81.5pt;z-index:487610880;visibility:visible;mso-wrap-style:square;mso-width-percent:0;mso-height-percent:0;mso-wrap-distance-left:9pt;mso-wrap-distance-top:0;mso-wrap-distance-right:9pt;mso-wrap-distance-bottom:0;mso-position-horizontal:absolute;mso-position-horizontal-relative:text;mso-position-vertical:absolute;mso-position-vertical-relative:text;mso-width-percent:0;mso-height-percent:0;mso-width-relative:margin;mso-height-relative:margin;v-text-anchor:middle" o:gfxdata="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" fillcolor="#fbd4b4 [1305]" strokecolor="#0a121c [484]" strokeweight="2pt">
+              <v:rect w14:anchorId="3DB55FE8" id="_x0000_s1031" style="position:absolute;margin-left:25.1pt;margin-top:6.85pt;width:209.75pt;height:81.5pt;z-index:487610880;visibility:visible;mso-wrap-style:square;mso-width-percent:0;mso-height-percent:0;mso-wrap-distance-left:9pt;mso-wrap-distance-top:0;mso-wrap-distance-right:9pt;mso-wrap-distance-bottom:0;mso-position-horizontal:absolute;mso-position-horizontal-relative:text;mso-position-vertical:absolute;mso-position-vertical-relative:text;mso-width-percent:0;mso-height-percent:0;mso-width-relative:margin;mso-height-relative:margin;v-text-anchor:middle" o:gfxdata="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" fillcolor="#fbd4b4 [1305]" strokecolor="#0a121c [484]" strokeweight="2pt">
                 <v:textbox>
                   <w:txbxContent>
                     <w:p>
@@ -10457,7 +10430,7 @@
           </mc:Choice>
           <mc:Fallback>
             <w:pict>
-              <v:shape w14:anchorId="38821DFA" id="Graphic 41" o:spid="_x0000_s1026" style="position:absolute;margin-left:85pt;margin-top:5.55pt;width:3.75pt;height:3.75pt;z-index:15747584;visibility:visible;mso-wrap-style:square;mso-wrap-distance-left:0;mso-wrap-distance-top:0;mso-wrap-distance-right:0;mso-wrap-distance-bottom:0;mso-position-horizontal:absolute;mso-position-horizontal-relative:page;mso-position-vertical:absolute;mso-position-vertical-relative:text;v-text-anchor:top" coordsize="47625,47625" o:gfxdata="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" path="m26970,47624r-6316,l17617,47019,,26969,,20653,20654,r6316,l47625,23812r-1,3157l26970,47624xe" fillcolor="black" stroked="f">
+              <v:shape w14:anchorId="290B783C" id="Graphic 41" o:spid="_x0000_s1026" style="position:absolute;margin-left:85pt;margin-top:5.55pt;width:3.75pt;height:3.75pt;z-index:15747584;visibility:visible;mso-wrap-style:square;mso-wrap-distance-left:0;mso-wrap-distance-top:0;mso-wrap-distance-right:0;mso-wrap-distance-bottom:0;mso-position-horizontal:absolute;mso-position-horizontal-relative:page;mso-position-vertical:absolute;mso-position-vertical-relative:text;v-text-anchor:top" coordsize="47625,47625" o:gfxdata="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" path="m26970,47624r-6316,l17617,47019,,26969,,20653,20654,r6316,l47625,23812r-1,3157l26970,47624xe" fillcolor="black" stroked="f">
                 <v:path arrowok="t"/>
                 <w10:wrap anchorx="page"/>
               </v:shape>
@@ -10626,7 +10599,7 @@
           </mc:Choice>
           <mc:Fallback>
             <w:pict>
-              <v:shape w14:anchorId="027943CB" id="Graphic 42" o:spid="_x0000_s1026" style="position:absolute;margin-left:85pt;margin-top:8.8pt;width:3.75pt;height:3.75pt;z-index:15748096;visibility:visible;mso-wrap-style:square;mso-wrap-distance-left:0;mso-wrap-distance-top:0;mso-wrap-distance-right:0;mso-wrap-distance-bottom:0;mso-position-horizontal:absolute;mso-position-horizontal-relative:page;mso-position-vertical:absolute;mso-position-vertical-relative:text;v-text-anchor:top" coordsize="47625,47625" o:gfxdata="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" path="m26970,47624r-6316,l17617,47018,,26969,,20654,20654,r6316,l47625,23812r-1,3157l26970,47624xe" fillcolor="black" stroked="f">
+              <v:shape w14:anchorId="66921546" id="Graphic 42" o:spid="_x0000_s1026" style="position:absolute;margin-left:85pt;margin-top:8.8pt;width:3.75pt;height:3.75pt;z-index:15748096;visibility:visible;mso-wrap-style:square;mso-wrap-distance-left:0;mso-wrap-distance-top:0;mso-wrap-distance-right:0;mso-wrap-distance-bottom:0;mso-position-horizontal:absolute;mso-position-horizontal-relative:page;mso-position-vertical:absolute;mso-position-vertical-relative:text;v-text-anchor:top" coordsize="47625,47625" o:gfxdata="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" path="m26970,47624r-6316,l17617,47018,,26969,,20654,20654,r6316,l47625,23812r-1,3157l26970,47624xe" fillcolor="black" stroked="f">
                 <v:path arrowok="t"/>
                 <w10:wrap anchorx="page"/>
               </v:shape>
@@ -10781,7 +10754,7 @@
           </mc:Choice>
           <mc:Fallback>
             <w:pict>
-              <v:shape w14:anchorId="342D8F69" id="Graphic 43" o:spid="_x0000_s1026" style="position:absolute;margin-left:85pt;margin-top:8.85pt;width:3.75pt;height:3.75pt;z-index:15748608;visibility:visible;mso-wrap-style:square;mso-wrap-distance-left:0;mso-wrap-distance-top:0;mso-wrap-distance-right:0;mso-wrap-distance-bottom:0;mso-position-horizontal:absolute;mso-position-horizontal-relative:page;mso-position-vertical:absolute;mso-position-vertical-relative:text;v-text-anchor:top" coordsize="47625,47625" o:gfxdata="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" path="m26970,47623r-6316,l17617,47017,,26968,,20653,20654,r6316,l47625,23812r-1,3156l26970,47623xe" fillcolor="black" stroked="f">
+              <v:shape w14:anchorId="41916DF3" id="Graphic 43" o:spid="_x0000_s1026" style="position:absolute;margin-left:85pt;margin-top:8.85pt;width:3.75pt;height:3.75pt;z-index:15748608;visibility:visible;mso-wrap-style:square;mso-wrap-distance-left:0;mso-wrap-distance-top:0;mso-wrap-distance-right:0;mso-wrap-distance-bottom:0;mso-position-horizontal:absolute;mso-position-horizontal-relative:page;mso-position-vertical:absolute;mso-position-vertical-relative:text;v-text-anchor:top" coordsize="47625,47625" o:gfxdata="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" path="m26970,47623r-6316,l17617,47017,,26968,,20653,20654,r6316,l47625,23812r-1,3156l26970,47623xe" fillcolor="black" stroked="f">
                 <v:path arrowok="t"/>
                 <w10:wrap anchorx="page"/>
               </v:shape>
@@ -10994,7 +10967,7 @@
           </mc:Choice>
           <mc:Fallback>
             <w:pict>
-              <v:shape w14:anchorId="5D560338" id="Graphic 44" o:spid="_x0000_s1026" style="position:absolute;margin-left:85pt;margin-top:9.55pt;width:3.75pt;height:3.75pt;z-index:15749120;visibility:visible;mso-wrap-style:square;mso-wrap-distance-left:0;mso-wrap-distance-top:0;mso-wrap-distance-right:0;mso-wrap-distance-bottom:0;mso-position-horizontal:absolute;mso-position-horizontal-relative:page;mso-position-vertical:absolute;mso-position-vertical-relative:text;v-text-anchor:top" coordsize="47625,47625" o:gfxdata="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" path="m26970,47624r-6316,l17617,47019,,26969,,20653,20654,r6316,l47625,23812r-1,3157l26970,47624xe" fillcolor="black" stroked="f">
+              <v:shape w14:anchorId="0D670516" id="Graphic 44" o:spid="_x0000_s1026" style="position:absolute;margin-left:85pt;margin-top:9.55pt;width:3.75pt;height:3.75pt;z-index:15749120;visibility:visible;mso-wrap-style:square;mso-wrap-distance-left:0;mso-wrap-distance-top:0;mso-wrap-distance-right:0;mso-wrap-distance-bottom:0;mso-position-horizontal:absolute;mso-position-horizontal-relative:page;mso-position-vertical:absolute;mso-position-vertical-relative:text;v-text-anchor:top" coordsize="47625,47625" o:gfxdata="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" path="m26970,47624r-6316,l17617,47019,,26969,,20653,20654,r6316,l47625,23812r-1,3157l26970,47624xe" fillcolor="black" stroked="f">
                 <v:path arrowok="t"/>
                 <w10:wrap anchorx="page"/>
               </v:shape>
@@ -11124,7 +11097,7 @@
           </mc:Choice>
           <mc:Fallback>
             <w:pict>
-              <v:shape w14:anchorId="76D2458A" id="Text Box 92" o:spid="_x0000_s1032" type="#_x0000_t202" style="position:absolute;left:0;text-align:left;margin-left:37.35pt;margin-top:35.65pt;width:82.45pt;height:22.95pt;z-index:487644672;visibility:visible;mso-wrap-style:square;mso-width-percent:0;mso-height-percent:0;mso-wrap-distance-left:9pt;mso-wrap-distance-top:0;mso-wrap-distance-right:9pt;mso-wrap-distance-bottom:0;mso-position-horizontal:absolute;mso-position-horizontal-relative:text;mso-position-vertical:absolute;mso-position-vertical-relative:text;mso-width-percent:0;mso-height-percent:0;mso-width-relative:margin;mso-height-relative:margin;v-text-anchor:top" o:gfxdata="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" fillcolor="#fbd4b4 [1305]" strokecolor="black [3213]" strokeweight="2pt">
+              <v:shape w14:anchorId="76D2458A" id="Text Box 92" o:spid="_x0000_s1032" type="#_x0000_t202" style="position:absolute;left:0;text-align:left;margin-left:37.35pt;margin-top:35.65pt;width:82.45pt;height:22.95pt;z-index:487644672;visibility:visible;mso-wrap-style:square;mso-width-percent:0;mso-height-percent:0;mso-wrap-distance-left:9pt;mso-wrap-distance-top:0;mso-wrap-distance-right:9pt;mso-wrap-distance-bottom:0;mso-position-horizontal:absolute;mso-position-horizontal-relative:text;mso-position-vertical:absolute;mso-position-vertical-relative:text;mso-width-percent:0;mso-height-percent:0;mso-width-relative:margin;mso-height-relative:margin;v-text-anchor:top" o:gfxdata="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" fillcolor="#fbd4b4 [1305]" strokecolor="black [3213]" strokeweight="2pt">
                 <v:textbox>
                   <w:txbxContent>
                     <w:p>
@@ -11155,16 +11128,7 @@
           <w:spacing w:val="-6"/>
           <w:sz w:val="25"/>
         </w:rPr>
-        <w:t>Q</w:t>
-      </w:r>
-      <w:r>
-        <w:rPr>
-          <w:b/>
-          <w:bCs/>
-          <w:spacing w:val="-6"/>
-          <w:sz w:val="25"/>
-        </w:rPr>
-        <w:t>A.</w:t>
+        <w:t>QA.</w:t>
       </w:r>
       <w:r>
         <w:rPr>
@@ -11515,7 +11479,7 @@
           </mc:Choice>
           <mc:Fallback>
             <w:pict>
-              <v:shape w14:anchorId="37085378" id="Graphic 47" o:spid="_x0000_s1026" style="position:absolute;margin-left:21pt;margin-top:7.9pt;width:3.75pt;height:54pt;z-index:-15877632;visibility:visible;mso-wrap-style:square;mso-wrap-distance-left:9pt;mso-wrap-distance-top:0;mso-wrap-distance-right:9pt;mso-wrap-distance-bottom:0;mso-position-horizontal:absolute;mso-position-horizontal-relative:text;mso-position-vertical:absolute;mso-position-vertical-relative:text;v-text-anchor:top" coordsize="47625,685800" o:gfxdata="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" path="m47625,658837l26974,638175r-6312,l,658837r,6312l20662,685800r6312,l47625,665149r,-3162l47625,658837xem47625,449287l26974,428625r-6312,l,449287r,6312l20662,476250r6312,l47625,455599r,-3162l47625,449287xem47625,230212l26974,209550r-6312,l,230212r,6312l20662,257175r6312,l47625,236524r,-3162l47625,230212xem47625,20662l26974,,20662,,,20662r,6312l20662,47625r6312,l47625,26974r,-3162l47625,20662xe" fillcolor="black" stroked="f">
+              <v:shape w14:anchorId="5806B376" id="Graphic 47" o:spid="_x0000_s1026" style="position:absolute;margin-left:21pt;margin-top:7.9pt;width:3.75pt;height:54pt;z-index:-15877632;visibility:visible;mso-wrap-style:square;mso-wrap-distance-left:9pt;mso-wrap-distance-top:0;mso-wrap-distance-right:9pt;mso-wrap-distance-bottom:0;mso-position-horizontal:absolute;mso-position-horizontal-relative:text;mso-position-vertical:absolute;mso-position-vertical-relative:text;v-text-anchor:top" coordsize="47625,685800" o:gfxdata="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" path="m47625,658837l26974,638175r-6312,l,658837r,6312l20662,685800r6312,l47625,665149r,-3162l47625,658837xem47625,449287l26974,428625r-6312,l,449287r,6312l20662,476250r6312,l47625,455599r,-3162l47625,449287xem47625,230212l26974,209550r-6312,l,230212r,6312l20662,257175r6312,l47625,236524r,-3162l47625,230212xem47625,20662l26974,,20662,,,20662r,6312l20662,47625r6312,l47625,26974r,-3162l47625,20662xe" fillcolor="black" stroked="f">
                 <v:path arrowok="t"/>
               </v:shape>
             </w:pict>
@@ -11916,7 +11880,7 @@
           </mc:Choice>
           <mc:Fallback>
             <w:pict>
-              <v:rect w14:anchorId="395224D5" id="_x0000_s1033" style="position:absolute;left:0;text-align:left;margin-left:21.25pt;margin-top:18.8pt;width:248.9pt;height:63.1pt;z-index:487614976;visibility:visible;mso-wrap-style:square;mso-width-percent:0;mso-height-percent:0;mso-wrap-distance-left:9pt;mso-wrap-distance-top:0;mso-wrap-distance-right:9pt;mso-wrap-distance-bottom:0;mso-position-horizontal:absolute;mso-position-horizontal-relative:text;mso-position-vertical:absolute;mso-position-vertical-relative:text;mso-width-percent:0;mso-height-percent:0;mso-width-relative:margin;mso-height-relative:margin;v-text-anchor:middle" o:gfxdata="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" fillcolor="#fbd4b4 [1305]" strokecolor="#0a121c [484]" strokeweight="2pt">
+              <v:rect w14:anchorId="395224D5" id="_x0000_s1033" style="position:absolute;left:0;text-align:left;margin-left:21.25pt;margin-top:18.8pt;width:248.9pt;height:63.1pt;z-index:487614976;visibility:visible;mso-wrap-style:square;mso-width-percent:0;mso-height-percent:0;mso-wrap-distance-left:9pt;mso-wrap-distance-top:0;mso-wrap-distance-right:9pt;mso-wrap-distance-bottom:0;mso-position-horizontal:absolute;mso-position-horizontal-relative:text;mso-position-vertical:absolute;mso-position-vertical-relative:text;mso-width-percent:0;mso-height-percent:0;mso-width-relative:margin;mso-height-relative:margin;v-text-anchor:middle" o:gfxdata="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" fillcolor="#fbd4b4 [1305]" strokecolor="#0a121c [484]" strokeweight="2pt">
                 <v:textbox>
                   <w:txbxContent>
                     <w:p>
@@ -12126,7 +12090,7 @@
           </mc:Choice>
           <mc:Fallback>
             <w:pict>
-              <v:shape w14:anchorId="331EDA88" id="Graphic 49" o:spid="_x0000_s1026" style="position:absolute;margin-left:85pt;margin-top:7pt;width:3.75pt;height:3.75pt;z-index:15750144;visibility:visible;mso-wrap-style:square;mso-wrap-distance-left:0;mso-wrap-distance-top:0;mso-wrap-distance-right:0;mso-wrap-distance-bottom:0;mso-position-horizontal:absolute;mso-position-horizontal-relative:page;mso-position-vertical:absolute;mso-position-vertical-relative:text;v-text-anchor:top" coordsize="47625,47625" o:gfxdata="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" path="m26970,47623r-6316,l17617,47018,,26968,,20654,20654,r6316,l47625,23812r-1,3156l26970,47623xe" fillcolor="black" stroked="f">
+              <v:shape w14:anchorId="72815112" id="Graphic 49" o:spid="_x0000_s1026" style="position:absolute;margin-left:85pt;margin-top:7pt;width:3.75pt;height:3.75pt;z-index:15750144;visibility:visible;mso-wrap-style:square;mso-wrap-distance-left:0;mso-wrap-distance-top:0;mso-wrap-distance-right:0;mso-wrap-distance-bottom:0;mso-position-horizontal:absolute;mso-position-horizontal-relative:page;mso-position-vertical:absolute;mso-position-vertical-relative:text;v-text-anchor:top" coordsize="47625,47625" o:gfxdata="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" path="m26970,47623r-6316,l17617,47018,,26968,,20654,20654,r6316,l47625,23812r-1,3156l26970,47623xe" fillcolor="black" stroked="f">
                 <v:path arrowok="t"/>
                 <w10:wrap anchorx="page"/>
               </v:shape>
@@ -12304,7 +12268,7 @@
           </mc:Choice>
           <mc:Fallback>
             <w:pict>
-              <v:shape w14:anchorId="54C14902" id="Graphic 50" o:spid="_x0000_s1026" style="position:absolute;margin-left:85pt;margin-top:8.85pt;width:3.75pt;height:3.75pt;z-index:15750656;visibility:visible;mso-wrap-style:square;mso-wrap-distance-left:0;mso-wrap-distance-top:0;mso-wrap-distance-right:0;mso-wrap-distance-bottom:0;mso-position-horizontal:absolute;mso-position-horizontal-relative:page;mso-position-vertical:absolute;mso-position-vertical-relative:text;v-text-anchor:top" coordsize="47625,47625" o:gfxdata="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" path="m26970,47623r-6316,l17617,47018,,26968,,20652,20654,r6316,l47625,23812r-1,3156l26970,47623xe" fillcolor="black" stroked="f">
+              <v:shape w14:anchorId="12314831" id="Graphic 50" o:spid="_x0000_s1026" style="position:absolute;margin-left:85pt;margin-top:8.85pt;width:3.75pt;height:3.75pt;z-index:15750656;visibility:visible;mso-wrap-style:square;mso-wrap-distance-left:0;mso-wrap-distance-top:0;mso-wrap-distance-right:0;mso-wrap-distance-bottom:0;mso-position-horizontal:absolute;mso-position-horizontal-relative:page;mso-position-vertical:absolute;mso-position-vertical-relative:text;v-text-anchor:top" coordsize="47625,47625" o:gfxdata="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" path="m26970,47623r-6316,l17617,47018,,26968,,20652,20654,r6316,l47625,23812r-1,3156l26970,47623xe" fillcolor="black" stroked="f">
                 <v:path arrowok="t"/>
                 <w10:wrap anchorx="page"/>
               </v:shape>
@@ -12478,7 +12442,7 @@
           </mc:Choice>
           <mc:Fallback>
             <w:pict>
-              <v:shape w14:anchorId="043DE62A" id="Graphic 51" o:spid="_x0000_s1026" style="position:absolute;margin-left:85pt;margin-top:9.6pt;width:3.75pt;height:3.75pt;z-index:15751168;visibility:visible;mso-wrap-style:square;mso-wrap-distance-left:0;mso-wrap-distance-top:0;mso-wrap-distance-right:0;mso-wrap-distance-bottom:0;mso-position-horizontal:absolute;mso-position-horizontal-relative:page;mso-position-vertical:absolute;mso-position-vertical-relative:text;v-text-anchor:top" coordsize="47625,47625" o:gfxdata="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" path="m26970,47623r-6316,l17617,47018,,26968,,20654,20654,r6316,l47625,23812r-1,3156l26970,47623xe" fillcolor="black" stroked="f">
+              <v:shape w14:anchorId="5D7533AF" id="Graphic 51" o:spid="_x0000_s1026" style="position:absolute;margin-left:85pt;margin-top:9.6pt;width:3.75pt;height:3.75pt;z-index:15751168;visibility:visible;mso-wrap-style:square;mso-wrap-distance-left:0;mso-wrap-distance-top:0;mso-wrap-distance-right:0;mso-wrap-distance-bottom:0;mso-position-horizontal:absolute;mso-position-horizontal-relative:page;mso-position-vertical:absolute;mso-position-vertical-relative:text;v-text-anchor:top" coordsize="47625,47625" o:gfxdata="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" path="m26970,47623r-6316,l17617,47018,,26968,,20654,20654,r6316,l47625,23812r-1,3156l26970,47623xe" fillcolor="black" stroked="f">
                 <v:path arrowok="t"/>
                 <w10:wrap anchorx="page"/>
               </v:shape>
@@ -12663,7 +12627,7 @@
           </mc:Choice>
           <mc:Fallback>
             <w:pict>
-              <v:shape w14:anchorId="3D25C6CD" id="Graphic 52" o:spid="_x0000_s1026" style="position:absolute;margin-left:85pt;margin-top:8.85pt;width:3.75pt;height:3.75pt;z-index:15751680;visibility:visible;mso-wrap-style:square;mso-wrap-distance-left:0;mso-wrap-distance-top:0;mso-wrap-distance-right:0;mso-wrap-distance-bottom:0;mso-position-horizontal:absolute;mso-position-horizontal-relative:page;mso-position-vertical:absolute;mso-position-vertical-relative:text;v-text-anchor:top" coordsize="47625,47625" o:gfxdata="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" path="m26970,47623r-6316,l17617,47018,,26968,,20654,20654,r6316,l47625,23812r-1,3156l26970,47623xe" fillcolor="black" stroked="f">
+              <v:shape w14:anchorId="4053BFDA" id="Graphic 52" o:spid="_x0000_s1026" style="position:absolute;margin-left:85pt;margin-top:8.85pt;width:3.75pt;height:3.75pt;z-index:15751680;visibility:visible;mso-wrap-style:square;mso-wrap-distance-left:0;mso-wrap-distance-top:0;mso-wrap-distance-right:0;mso-wrap-distance-bottom:0;mso-position-horizontal:absolute;mso-position-horizontal-relative:page;mso-position-vertical:absolute;mso-position-vertical-relative:text;v-text-anchor:top" coordsize="47625,47625" o:gfxdata="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" path="m26970,47623r-6316,l17617,47018,,26968,,20654,20654,r6316,l47625,23812r-1,3156l26970,47623xe" fillcolor="black" stroked="f">
                 <v:path arrowok="t"/>
                 <w10:wrap anchorx="page"/>
               </v:shape>
@@ -13141,7 +13105,7 @@
           </mc:Choice>
           <mc:Fallback>
             <w:pict>
-              <v:shape w14:anchorId="7A88CDDE" id="Graphic 53" o:spid="_x0000_s1026" style="position:absolute;margin-left:85pt;margin-top:5.55pt;width:3.75pt;height:3.75pt;z-index:15752192;visibility:visible;mso-wrap-style:square;mso-wrap-distance-left:0;mso-wrap-distance-top:0;mso-wrap-distance-right:0;mso-wrap-distance-bottom:0;mso-position-horizontal:absolute;mso-position-horizontal-relative:page;mso-position-vertical:absolute;mso-position-vertical-relative:text;v-text-anchor:top" coordsize="47625,47625" o:gfxdata="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" path="m26970,47623r-6316,l17617,47015,,26968,,20652,20654,r6316,l47625,23812r-1,3156l26970,47623xe" fillcolor="black" stroked="f">
+              <v:shape w14:anchorId="6C4D7BB0" id="Graphic 53" o:spid="_x0000_s1026" style="position:absolute;margin-left:85pt;margin-top:5.55pt;width:3.75pt;height:3.75pt;z-index:15752192;visibility:visible;mso-wrap-style:square;mso-wrap-distance-left:0;mso-wrap-distance-top:0;mso-wrap-distance-right:0;mso-wrap-distance-bottom:0;mso-position-horizontal:absolute;mso-position-horizontal-relative:page;mso-position-vertical:absolute;mso-position-vertical-relative:text;v-text-anchor:top" coordsize="47625,47625" o:gfxdata="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" path="m26970,47623r-6316,l17617,47015,,26968,,20652,20654,r6316,l47625,23812r-1,3156l26970,47623xe" fillcolor="black" stroked="f">
                 <v:path arrowok="t"/>
                 <w10:wrap anchorx="page"/>
               </v:shape>
@@ -13393,7 +13357,7 @@
           </mc:Choice>
           <mc:Fallback>
             <w:pict>
-              <v:shape w14:anchorId="5C34215A" id="Graphic 54" o:spid="_x0000_s1026" style="position:absolute;margin-left:85pt;margin-top:8.85pt;width:3.75pt;height:3.75pt;z-index:15752704;visibility:visible;mso-wrap-style:square;mso-wrap-distance-left:0;mso-wrap-distance-top:0;mso-wrap-distance-right:0;mso-wrap-distance-bottom:0;mso-position-horizontal:absolute;mso-position-horizontal-relative:page;mso-position-vertical:absolute;mso-position-vertical-relative:text;v-text-anchor:top" coordsize="47625,47625" o:gfxdata="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" path="m26970,47623r-6316,l17617,47018,,26968,,20654,20654,r6316,l47625,23812r-1,3156l26970,47623xe" fillcolor="black" stroked="f">
+              <v:shape w14:anchorId="69EB0E0D" id="Graphic 54" o:spid="_x0000_s1026" style="position:absolute;margin-left:85pt;margin-top:8.85pt;width:3.75pt;height:3.75pt;z-index:15752704;visibility:visible;mso-wrap-style:square;mso-wrap-distance-left:0;mso-wrap-distance-top:0;mso-wrap-distance-right:0;mso-wrap-distance-bottom:0;mso-position-horizontal:absolute;mso-position-horizontal-relative:page;mso-position-vertical:absolute;mso-position-vertical-relative:text;v-text-anchor:top" coordsize="47625,47625" o:gfxdata="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" path="m26970,47623r-6316,l17617,47018,,26968,,20654,20654,r6316,l47625,23812r-1,3156l26970,47623xe" fillcolor="black" stroked="f">
                 <v:path arrowok="t"/>
                 <w10:wrap anchorx="page"/>
               </v:shape>
@@ -13572,7 +13536,7 @@
           </mc:Choice>
           <mc:Fallback>
             <w:pict>
-              <v:shape w14:anchorId="50F6A14F" id="Graphic 55" o:spid="_x0000_s1026" style="position:absolute;margin-left:85pt;margin-top:9.55pt;width:3.75pt;height:3.75pt;z-index:15753216;visibility:visible;mso-wrap-style:square;mso-wrap-distance-left:0;mso-wrap-distance-top:0;mso-wrap-distance-right:0;mso-wrap-distance-bottom:0;mso-position-horizontal:absolute;mso-position-horizontal-relative:page;mso-position-vertical:absolute;mso-position-vertical-relative:text;v-text-anchor:top" coordsize="47625,47625" o:gfxdata="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" path="m26970,47624r-6316,l17617,47020,,26968,,20652,20654,r6316,l47625,23812r-1,3156l26970,47624xe" fillcolor="black" stroked="f">
+              <v:shape w14:anchorId="7207A317" id="Graphic 55" o:spid="_x0000_s1026" style="position:absolute;margin-left:85pt;margin-top:9.55pt;width:3.75pt;height:3.75pt;z-index:15753216;visibility:visible;mso-wrap-style:square;mso-wrap-distance-left:0;mso-wrap-distance-top:0;mso-wrap-distance-right:0;mso-wrap-distance-bottom:0;mso-position-horizontal:absolute;mso-position-horizontal-relative:page;mso-position-vertical:absolute;mso-position-vertical-relative:text;v-text-anchor:top" coordsize="47625,47625" o:gfxdata="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" path="m26970,47624r-6316,l17617,47020,,26968,,20652,20654,r6316,l47625,23812r-1,3156l26970,47624xe" fillcolor="black" stroked="f">
                 <v:path arrowok="t"/>
                 <w10:wrap anchorx="page"/>
               </v:shape>
@@ -13750,7 +13714,7 @@
           </mc:Choice>
           <mc:Fallback>
             <w:pict>
-              <v:shape w14:anchorId="65A4589A" id="Graphic 56" o:spid="_x0000_s1026" style="position:absolute;margin-left:85pt;margin-top:8.85pt;width:3.75pt;height:3.75pt;z-index:15753728;visibility:visible;mso-wrap-style:square;mso-wrap-distance-left:0;mso-wrap-distance-top:0;mso-wrap-distance-right:0;mso-wrap-distance-bottom:0;mso-position-horizontal:absolute;mso-position-horizontal-relative:page;mso-position-vertical:absolute;mso-position-vertical-relative:text;v-text-anchor:top" coordsize="47625,47625" o:gfxdata="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" path="m26970,47623r-6316,l17617,47018,,26968,,20652,20654,r6316,l47625,23812r-1,3156l26970,47623xe" fillcolor="black" stroked="f">
+              <v:shape w14:anchorId="772B0CE8" id="Graphic 56" o:spid="_x0000_s1026" style="position:absolute;margin-left:85pt;margin-top:8.85pt;width:3.75pt;height:3.75pt;z-index:15753728;visibility:visible;mso-wrap-style:square;mso-wrap-distance-left:0;mso-wrap-distance-top:0;mso-wrap-distance-right:0;mso-wrap-distance-bottom:0;mso-position-horizontal:absolute;mso-position-horizontal-relative:page;mso-position-vertical:absolute;mso-position-vertical-relative:text;v-text-anchor:top" coordsize="47625,47625" o:gfxdata="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" path="m26970,47623r-6316,l17617,47018,,26968,,20652,20654,r6316,l47625,23812r-1,3156l26970,47623xe" fillcolor="black" stroked="f">
                 <v:path arrowok="t"/>
                 <w10:wrap anchorx="page"/>
               </v:shape>
@@ -13914,7 +13878,7 @@
           </mc:Choice>
           <mc:Fallback>
             <w:pict>
-              <v:rect w14:anchorId="30EB977E" id="_x0000_s1034" style="position:absolute;left:0;text-align:left;margin-left:40.25pt;margin-top:29.8pt;width:59.95pt;height:24.25pt;z-index:487617024;visibility:visible;mso-wrap-style:square;mso-width-percent:0;mso-height-percent:0;mso-wrap-distance-left:9pt;mso-wrap-distance-top:0;mso-wrap-distance-right:9pt;mso-wrap-distance-bottom:0;mso-position-horizontal:absolute;mso-position-horizontal-relative:text;mso-position-vertical:absolute;mso-position-vertical-relative:text;mso-width-percent:0;mso-height-percent:0;mso-width-relative:margin;mso-height-relative:margin;v-text-anchor:middle" o:gfxdata="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" fillcolor="#fbd4b4 [1305]" strokecolor="#0a121c [484]" strokeweight="2pt">
+              <v:rect w14:anchorId="30EB977E" id="_x0000_s1034" style="position:absolute;left:0;text-align:left;margin-left:40.25pt;margin-top:29.8pt;width:59.95pt;height:24.25pt;z-index:487617024;visibility:visible;mso-wrap-style:square;mso-width-percent:0;mso-height-percent:0;mso-wrap-distance-left:9pt;mso-wrap-distance-top:0;mso-wrap-distance-right:9pt;mso-wrap-distance-bottom:0;mso-position-horizontal:absolute;mso-position-horizontal-relative:text;mso-position-vertical:absolute;mso-position-vertical-relative:text;mso-width-percent:0;mso-height-percent:0;mso-width-relative:margin;mso-height-relative:margin;v-text-anchor:middle" o:gfxdata="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" fillcolor="#fbd4b4 [1305]" strokecolor="#0a121c [484]" strokeweight="2pt">
                 <v:textbox>
                   <w:txbxContent>
                     <w:p>
@@ -14183,7 +14147,7 @@
           </mc:Choice>
           <mc:Fallback>
             <w:pict>
-              <v:shape w14:anchorId="73624793" id="Graphic 58" o:spid="_x0000_s1026" style="position:absolute;margin-left:85pt;margin-top:6.3pt;width:3.75pt;height:3.75pt;z-index:15754240;visibility:visible;mso-wrap-style:square;mso-wrap-distance-left:0;mso-wrap-distance-top:0;mso-wrap-distance-right:0;mso-wrap-distance-bottom:0;mso-position-horizontal:absolute;mso-position-horizontal-relative:page;mso-position-vertical:absolute;mso-position-vertical-relative:text;v-text-anchor:top" coordsize="47625,47625" o:gfxdata="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" path="m26970,47623r-6316,l17617,47018,,26968,,20652,20654,r6316,l47625,23812r-1,3156l26970,47623xe" fillcolor="black" stroked="f">
+              <v:shape w14:anchorId="6C085DD2" id="Graphic 58" o:spid="_x0000_s1026" style="position:absolute;margin-left:85pt;margin-top:6.3pt;width:3.75pt;height:3.75pt;z-index:15754240;visibility:visible;mso-wrap-style:square;mso-wrap-distance-left:0;mso-wrap-distance-top:0;mso-wrap-distance-right:0;mso-wrap-distance-bottom:0;mso-position-horizontal:absolute;mso-position-horizontal-relative:page;mso-position-vertical:absolute;mso-position-vertical-relative:text;v-text-anchor:top" coordsize="47625,47625" o:gfxdata="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" path="m26970,47623r-6316,l17617,47018,,26968,,20652,20654,r6316,l47625,23812r-1,3156l26970,47623xe" fillcolor="black" stroked="f">
                 <v:path arrowok="t"/>
                 <w10:wrap anchorx="page"/>
               </v:shape>
@@ -14343,7 +14307,7 @@
           </mc:Choice>
           <mc:Fallback>
             <w:pict>
-              <v:shape w14:anchorId="66613D36" id="Graphic 59" o:spid="_x0000_s1026" style="position:absolute;margin-left:85pt;margin-top:8.8pt;width:3.75pt;height:3.75pt;z-index:15754752;visibility:visible;mso-wrap-style:square;mso-wrap-distance-left:0;mso-wrap-distance-top:0;mso-wrap-distance-right:0;mso-wrap-distance-bottom:0;mso-position-horizontal:absolute;mso-position-horizontal-relative:page;mso-position-vertical:absolute;mso-position-vertical-relative:text;v-text-anchor:top" coordsize="47625,47625" o:gfxdata="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" path="m26970,47623r-6316,l17617,47015,,26968,,20652,20654,r6316,l47625,23812r-1,3156l26970,47623xe" fillcolor="black" stroked="f">
+              <v:shape w14:anchorId="10D51A0D" id="Graphic 59" o:spid="_x0000_s1026" style="position:absolute;margin-left:85pt;margin-top:8.8pt;width:3.75pt;height:3.75pt;z-index:15754752;visibility:visible;mso-wrap-style:square;mso-wrap-distance-left:0;mso-wrap-distance-top:0;mso-wrap-distance-right:0;mso-wrap-distance-bottom:0;mso-position-horizontal:absolute;mso-position-horizontal-relative:page;mso-position-vertical:absolute;mso-position-vertical-relative:text;v-text-anchor:top" coordsize="47625,47625" o:gfxdata="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" path="m26970,47623r-6316,l17617,47015,,26968,,20652,20654,r6316,l47625,23812r-1,3156l26970,47623xe" fillcolor="black" stroked="f">
                 <v:path arrowok="t"/>
                 <w10:wrap anchorx="page"/>
               </v:shape>
@@ -14512,7 +14476,7 @@
           </mc:Choice>
           <mc:Fallback>
             <w:pict>
-              <v:shape w14:anchorId="2205AB7D" id="Graphic 60" o:spid="_x0000_s1026" style="position:absolute;margin-left:85pt;margin-top:9.6pt;width:3.75pt;height:3.75pt;z-index:15755264;visibility:visible;mso-wrap-style:square;mso-wrap-distance-left:0;mso-wrap-distance-top:0;mso-wrap-distance-right:0;mso-wrap-distance-bottom:0;mso-position-horizontal:absolute;mso-position-horizontal-relative:page;mso-position-vertical:absolute;mso-position-vertical-relative:text;v-text-anchor:top" coordsize="47625,47625" o:gfxdata="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" path="m26970,47624r-6316,l17617,47020,,26968,,20654,20654,r6316,l47625,23812r-1,3156l26970,47624xe" fillcolor="black" stroked="f">
+              <v:shape w14:anchorId="022EA03E" id="Graphic 60" o:spid="_x0000_s1026" style="position:absolute;margin-left:85pt;margin-top:9.6pt;width:3.75pt;height:3.75pt;z-index:15755264;visibility:visible;mso-wrap-style:square;mso-wrap-distance-left:0;mso-wrap-distance-top:0;mso-wrap-distance-right:0;mso-wrap-distance-bottom:0;mso-position-horizontal:absolute;mso-position-horizontal-relative:page;mso-position-vertical:absolute;mso-position-vertical-relative:text;v-text-anchor:top" coordsize="47625,47625" o:gfxdata="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" path="m26970,47624r-6316,l17617,47020,,26968,,20654,20654,r6316,l47625,23812r-1,3156l26970,47624xe" fillcolor="black" stroked="f">
                 <v:path arrowok="t"/>
                 <w10:wrap anchorx="page"/>
               </v:shape>
@@ -14681,7 +14645,7 @@
           </mc:Choice>
           <mc:Fallback>
             <w:pict>
-              <v:shape w14:anchorId="0D548D86" id="Graphic 61" o:spid="_x0000_s1026" style="position:absolute;margin-left:85pt;margin-top:8.8pt;width:3.75pt;height:3.75pt;z-index:15755776;visibility:visible;mso-wrap-style:square;mso-wrap-distance-left:0;mso-wrap-distance-top:0;mso-wrap-distance-right:0;mso-wrap-distance-bottom:0;mso-position-horizontal:absolute;mso-position-horizontal-relative:page;mso-position-vertical:absolute;mso-position-vertical-relative:text;v-text-anchor:top" coordsize="47625,47625" o:gfxdata="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" path="m26970,47623r-6316,l17617,47018,,26968,,20652,20654,r6316,l47625,23812r-1,3156l26970,47623xe" fillcolor="black" stroked="f">
+              <v:shape w14:anchorId="55DC35BA" id="Graphic 61" o:spid="_x0000_s1026" style="position:absolute;margin-left:85pt;margin-top:8.8pt;width:3.75pt;height:3.75pt;z-index:15755776;visibility:visible;mso-wrap-style:square;mso-wrap-distance-left:0;mso-wrap-distance-top:0;mso-wrap-distance-right:0;mso-wrap-distance-bottom:0;mso-position-horizontal:absolute;mso-position-horizontal-relative:page;mso-position-vertical:absolute;mso-position-vertical-relative:text;v-text-anchor:top" coordsize="47625,47625" o:gfxdata="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" path="m26970,47623r-6316,l17617,47018,,26968,,20652,20654,r6316,l47625,23812r-1,3156l26970,47623xe" fillcolor="black" stroked="f">
                 <v:path arrowok="t"/>
                 <w10:wrap anchorx="page"/>
               </v:shape>
@@ -14853,7 +14817,7 @@
           </mc:Choice>
           <mc:Fallback>
             <w:pict>
-              <v:rect w14:anchorId="3A775963" id="_x0000_s1035" style="position:absolute;left:0;text-align:left;margin-left:44.9pt;margin-top:35.1pt;width:37.35pt;height:25.3pt;z-index:487619072;visibility:visible;mso-wrap-style:square;mso-width-percent:0;mso-height-percent:0;mso-wrap-distance-left:9pt;mso-wrap-distance-top:0;mso-wrap-distance-right:9pt;mso-wrap-distance-bottom:0;mso-position-horizontal:absolute;mso-position-horizontal-relative:text;mso-position-vertical:absolute;mso-position-vertical-relative:text;mso-width-percent:0;mso-height-percent:0;mso-width-relative:margin;mso-height-relative:margin;v-text-anchor:middle" o:gfxdata="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" fillcolor="#fbd4b4 [1305]" strokecolor="#0a121c [484]" strokeweight="2pt">
+              <v:rect w14:anchorId="3A775963" id="_x0000_s1035" style="position:absolute;left:0;text-align:left;margin-left:44.9pt;margin-top:35.1pt;width:37.35pt;height:25.3pt;z-index:487619072;visibility:visible;mso-wrap-style:square;mso-width-percent:0;mso-height-percent:0;mso-wrap-distance-left:9pt;mso-wrap-distance-top:0;mso-wrap-distance-right:9pt;mso-wrap-distance-bottom:0;mso-position-horizontal:absolute;mso-position-horizontal-relative:text;mso-position-vertical:absolute;mso-position-vertical-relative:text;mso-width-percent:0;mso-height-percent:0;mso-width-relative:margin;mso-height-relative:margin;v-text-anchor:middle" o:gfxdata="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" fillcolor="#fbd4b4 [1305]" strokecolor="#0a121c [484]" strokeweight="2pt">
                 <v:textbox>
                   <w:txbxContent>
                     <w:p>
@@ -15220,7 +15184,7 @@
           </mc:Choice>
           <mc:Fallback>
             <w:pict>
-              <v:shape w14:anchorId="1D8F90F7" id="Graphic 62" o:spid="_x0000_s1026" style="position:absolute;margin-left:85pt;margin-top:6.3pt;width:3.75pt;height:3.75pt;z-index:15756288;visibility:visible;mso-wrap-style:square;mso-wrap-distance-left:0;mso-wrap-distance-top:0;mso-wrap-distance-right:0;mso-wrap-distance-bottom:0;mso-position-horizontal:absolute;mso-position-horizontal-relative:page;mso-position-vertical:absolute;mso-position-vertical-relative:text;v-text-anchor:top" coordsize="47625,47625" o:gfxdata="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" path="m26970,47623r-6316,l17617,47015,,26968,,20652,20654,r6316,l47625,23812r-1,3156l26970,47623xe" fillcolor="black" stroked="f">
+              <v:shape w14:anchorId="6B1E86A5" id="Graphic 62" o:spid="_x0000_s1026" style="position:absolute;margin-left:85pt;margin-top:6.3pt;width:3.75pt;height:3.75pt;z-index:15756288;visibility:visible;mso-wrap-style:square;mso-wrap-distance-left:0;mso-wrap-distance-top:0;mso-wrap-distance-right:0;mso-wrap-distance-bottom:0;mso-position-horizontal:absolute;mso-position-horizontal-relative:page;mso-position-vertical:absolute;mso-position-vertical-relative:text;v-text-anchor:top" coordsize="47625,47625" o:gfxdata="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" path="m26970,47623r-6316,l17617,47015,,26968,,20652,20654,r6316,l47625,23812r-1,3156l26970,47623xe" fillcolor="black" stroked="f">
                 <v:path arrowok="t"/>
                 <w10:wrap anchorx="page"/>
               </v:shape>
@@ -15342,7 +15306,7 @@
           </mc:Choice>
           <mc:Fallback>
             <w:pict>
-              <v:shape w14:anchorId="3E39E2FE" id="Graphic 63" o:spid="_x0000_s1026" style="position:absolute;margin-left:85pt;margin-top:8.95pt;width:3.75pt;height:3.75pt;z-index:15756800;visibility:visible;mso-wrap-style:square;mso-wrap-distance-left:0;mso-wrap-distance-top:0;mso-wrap-distance-right:0;mso-wrap-distance-bottom:0;mso-position-horizontal:absolute;mso-position-horizontal-relative:page;mso-position-vertical:absolute;mso-position-vertical-relative:text;v-text-anchor:top" coordsize="47625,47625" o:gfxdata="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" path="m26970,47623r-6316,l17617,47018,,26968,,20652,20654,r6316,l47625,23812r-1,3156l26970,47623xe" fillcolor="black" stroked="f">
+              <v:shape w14:anchorId="655603D2" id="Graphic 63" o:spid="_x0000_s1026" style="position:absolute;margin-left:85pt;margin-top:8.95pt;width:3.75pt;height:3.75pt;z-index:15756800;visibility:visible;mso-wrap-style:square;mso-wrap-distance-left:0;mso-wrap-distance-top:0;mso-wrap-distance-right:0;mso-wrap-distance-bottom:0;mso-position-horizontal:absolute;mso-position-horizontal-relative:page;mso-position-vertical:absolute;mso-position-vertical-relative:text;v-text-anchor:top" coordsize="47625,47625" o:gfxdata="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" path="m26970,47623r-6316,l17617,47018,,26968,,20652,20654,r6316,l47625,23812r-1,3156l26970,47623xe" fillcolor="black" stroked="f">
                 <v:path arrowok="t"/>
                 <w10:wrap anchorx="page"/>
               </v:shape>
@@ -15464,7 +15428,7 @@
           </mc:Choice>
           <mc:Fallback>
             <w:pict>
-              <v:shape w14:anchorId="388201CC" id="Graphic 64" o:spid="_x0000_s1026" style="position:absolute;margin-left:85pt;margin-top:9.7pt;width:3.75pt;height:3.75pt;z-index:15757312;visibility:visible;mso-wrap-style:square;mso-wrap-distance-left:0;mso-wrap-distance-top:0;mso-wrap-distance-right:0;mso-wrap-distance-bottom:0;mso-position-horizontal:absolute;mso-position-horizontal-relative:page;mso-position-vertical:absolute;mso-position-vertical-relative:text;v-text-anchor:top" coordsize="47625,47625" o:gfxdata="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" path="m26970,47623r-6316,l17617,47018,,26968,,20652,20654,r6316,l47625,23812r-1,3156l26970,47623xe" fillcolor="black" stroked="f">
+              <v:shape w14:anchorId="55E14E60" id="Graphic 64" o:spid="_x0000_s1026" style="position:absolute;margin-left:85pt;margin-top:9.7pt;width:3.75pt;height:3.75pt;z-index:15757312;visibility:visible;mso-wrap-style:square;mso-wrap-distance-left:0;mso-wrap-distance-top:0;mso-wrap-distance-right:0;mso-wrap-distance-bottom:0;mso-position-horizontal:absolute;mso-position-horizontal-relative:page;mso-position-vertical:absolute;mso-position-vertical-relative:text;v-text-anchor:top" coordsize="47625,47625" o:gfxdata="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" path="m26970,47623r-6316,l17617,47018,,26968,,20652,20654,r6316,l47625,23812r-1,3156l26970,47623xe" fillcolor="black" stroked="f">
                 <v:path arrowok="t"/>
                 <w10:wrap anchorx="page"/>
               </v:shape>
@@ -15590,7 +15554,7 @@
           </mc:Choice>
           <mc:Fallback>
             <w:pict>
-              <v:shape w14:anchorId="4E96F332" id="Graphic 65" o:spid="_x0000_s1026" style="position:absolute;margin-left:85pt;margin-top:8.95pt;width:3.75pt;height:3.75pt;z-index:15757824;visibility:visible;mso-wrap-style:square;mso-wrap-distance-left:0;mso-wrap-distance-top:0;mso-wrap-distance-right:0;mso-wrap-distance-bottom:0;mso-position-horizontal:absolute;mso-position-horizontal-relative:page;mso-position-vertical:absolute;mso-position-vertical-relative:text;v-text-anchor:top" coordsize="47625,47625" o:gfxdata="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" path="m26970,47623r-6316,l17617,47018,,26968,,20652,20654,r6316,l47625,23812r-1,3156l26970,47623xe" fillcolor="black" stroked="f">
+              <v:shape w14:anchorId="56040523" id="Graphic 65" o:spid="_x0000_s1026" style="position:absolute;margin-left:85pt;margin-top:8.95pt;width:3.75pt;height:3.75pt;z-index:15757824;visibility:visible;mso-wrap-style:square;mso-wrap-distance-left:0;mso-wrap-distance-top:0;mso-wrap-distance-right:0;mso-wrap-distance-bottom:0;mso-position-horizontal:absolute;mso-position-horizontal-relative:page;mso-position-vertical:absolute;mso-position-vertical-relative:text;v-text-anchor:top" coordsize="47625,47625" o:gfxdata="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" path="m26970,47623r-6316,l17617,47018,,26968,,20652,20654,r6316,l47625,23812r-1,3156l26970,47623xe" fillcolor="black" stroked="f">
                 <v:path arrowok="t"/>
                 <w10:wrap anchorx="page"/>
               </v:shape>
@@ -15743,7 +15707,7 @@
           </mc:Choice>
           <mc:Fallback>
             <w:pict>
-              <v:rect w14:anchorId="7138D093" id="_x0000_s1036" style="position:absolute;left:0;text-align:left;margin-left:33.35pt;margin-top:32.65pt;width:52.6pt;height:24.25pt;z-index:487621120;visibility:visible;mso-wrap-style:square;mso-width-percent:0;mso-height-percent:0;mso-wrap-distance-left:9pt;mso-wrap-distance-top:0;mso-wrap-distance-right:9pt;mso-wrap-distance-bottom:0;mso-position-horizontal:absolute;mso-position-horizontal-relative:text;mso-position-vertical:absolute;mso-position-vertical-relative:text;mso-width-percent:0;mso-height-percent:0;mso-width-relative:margin;mso-height-relative:margin;v-text-anchor:middle" o:gfxdata="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" fillcolor="#fbd4b4 [1305]" strokecolor="#0a121c [484]" strokeweight="2pt">
+              <v:rect w14:anchorId="7138D093" id="_x0000_s1036" style="position:absolute;left:0;text-align:left;margin-left:33.35pt;margin-top:32.65pt;width:52.6pt;height:24.25pt;z-index:487621120;visibility:visible;mso-wrap-style:square;mso-width-percent:0;mso-height-percent:0;mso-wrap-distance-left:9pt;mso-wrap-distance-top:0;mso-wrap-distance-right:9pt;mso-wrap-distance-bottom:0;mso-position-horizontal:absolute;mso-position-horizontal-relative:text;mso-position-vertical:absolute;mso-position-vertical-relative:text;mso-width-percent:0;mso-height-percent:0;mso-width-relative:margin;mso-height-relative:margin;v-text-anchor:middle" o:gfxdata="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" fillcolor="#fbd4b4 [1305]" strokecolor="#0a121c [484]" strokeweight="2pt">
                 <v:textbox>
                   <w:txbxContent>
                     <w:p>
@@ -16073,7 +16037,7 @@
           </mc:Choice>
           <mc:Fallback>
             <w:pict>
-              <v:shape w14:anchorId="31BD5CF5" id="Graphic 66" o:spid="_x0000_s1026" style="position:absolute;margin-left:85pt;margin-top:6.25pt;width:3.75pt;height:3.75pt;z-index:15758336;visibility:visible;mso-wrap-style:square;mso-wrap-distance-left:0;mso-wrap-distance-top:0;mso-wrap-distance-right:0;mso-wrap-distance-bottom:0;mso-position-horizontal:absolute;mso-position-horizontal-relative:page;mso-position-vertical:absolute;mso-position-vertical-relative:text;v-text-anchor:top" coordsize="47625,47625" o:gfxdata="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" path="m26970,47623r-6316,l17617,47018,,26968,,20652,20654,r6316,l47625,23812r-1,3156l26970,47623xe" fillcolor="black" stroked="f">
+              <v:shape w14:anchorId="1B391260" id="Graphic 66" o:spid="_x0000_s1026" style="position:absolute;margin-left:85pt;margin-top:6.25pt;width:3.75pt;height:3.75pt;z-index:15758336;visibility:visible;mso-wrap-style:square;mso-wrap-distance-left:0;mso-wrap-distance-top:0;mso-wrap-distance-right:0;mso-wrap-distance-bottom:0;mso-position-horizontal:absolute;mso-position-horizontal-relative:page;mso-position-vertical:absolute;mso-position-vertical-relative:text;v-text-anchor:top" coordsize="47625,47625" o:gfxdata="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" path="m26970,47623r-6316,l17617,47018,,26968,,20652,20654,r6316,l47625,23812r-1,3156l26970,47623xe" fillcolor="black" stroked="f">
                 <v:path arrowok="t"/>
                 <w10:wrap anchorx="page"/>
               </v:shape>
@@ -16195,7 +16159,7 @@
           </mc:Choice>
           <mc:Fallback>
             <w:pict>
-              <v:shape w14:anchorId="6BFF5F7C" id="Graphic 67" o:spid="_x0000_s1026" style="position:absolute;margin-left:85pt;margin-top:9.65pt;width:3.75pt;height:3.75pt;z-index:15758848;visibility:visible;mso-wrap-style:square;mso-wrap-distance-left:0;mso-wrap-distance-top:0;mso-wrap-distance-right:0;mso-wrap-distance-bottom:0;mso-position-horizontal:absolute;mso-position-horizontal-relative:page;mso-position-vertical:absolute;mso-position-vertical-relative:text;v-text-anchor:top" coordsize="47625,47625" o:gfxdata="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" path="m26970,47623r-6316,l17617,47018,,26968,,20652,20654,r6316,l47625,23812r-1,3156l26970,47623xe" fillcolor="black" stroked="f">
+              <v:shape w14:anchorId="73F4CD0F" id="Graphic 67" o:spid="_x0000_s1026" style="position:absolute;margin-left:85pt;margin-top:9.65pt;width:3.75pt;height:3.75pt;z-index:15758848;visibility:visible;mso-wrap-style:square;mso-wrap-distance-left:0;mso-wrap-distance-top:0;mso-wrap-distance-right:0;mso-wrap-distance-bottom:0;mso-position-horizontal:absolute;mso-position-horizontal-relative:page;mso-position-vertical:absolute;mso-position-vertical-relative:text;v-text-anchor:top" coordsize="47625,47625" o:gfxdata="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" path="m26970,47623r-6316,l17617,47018,,26968,,20652,20654,r6316,l47625,23812r-1,3156l26970,47623xe" fillcolor="black" stroked="f">
                 <v:path arrowok="t"/>
                 <w10:wrap anchorx="page"/>
               </v:shape>
@@ -16317,7 +16281,7 @@
           </mc:Choice>
           <mc:Fallback>
             <w:pict>
-              <v:shape w14:anchorId="2A638A05" id="Graphic 68" o:spid="_x0000_s1026" style="position:absolute;margin-left:85pt;margin-top:8.9pt;width:3.75pt;height:3.75pt;z-index:15759360;visibility:visible;mso-wrap-style:square;mso-wrap-distance-left:0;mso-wrap-distance-top:0;mso-wrap-distance-right:0;mso-wrap-distance-bottom:0;mso-position-horizontal:absolute;mso-position-horizontal-relative:page;mso-position-vertical:absolute;mso-position-vertical-relative:text;v-text-anchor:top" coordsize="47625,47625" o:gfxdata="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" path="m26970,47623r-6316,l17617,47018,,26968,,20652,20654,r6316,l47625,23812r-1,3156l26970,47623xe" fillcolor="black" stroked="f">
+              <v:shape w14:anchorId="050EA700" id="Graphic 68" o:spid="_x0000_s1026" style="position:absolute;margin-left:85pt;margin-top:8.9pt;width:3.75pt;height:3.75pt;z-index:15759360;visibility:visible;mso-wrap-style:square;mso-wrap-distance-left:0;mso-wrap-distance-top:0;mso-wrap-distance-right:0;mso-wrap-distance-bottom:0;mso-position-horizontal:absolute;mso-position-horizontal-relative:page;mso-position-vertical:absolute;mso-position-vertical-relative:text;v-text-anchor:top" coordsize="47625,47625" o:gfxdata="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" path="m26970,47623r-6316,l17617,47018,,26968,,20652,20654,r6316,l47625,23812r-1,3156l26970,47623xe" fillcolor="black" stroked="f">
                 <v:path arrowok="t"/>
                 <w10:wrap anchorx="page"/>
               </v:shape>
@@ -16439,7 +16403,7 @@
           </mc:Choice>
           <mc:Fallback>
             <w:pict>
-              <v:shape w14:anchorId="72E4F66F" id="Graphic 69" o:spid="_x0000_s1026" style="position:absolute;margin-left:85pt;margin-top:8.9pt;width:3.75pt;height:3.75pt;z-index:15759872;visibility:visible;mso-wrap-style:square;mso-wrap-distance-left:0;mso-wrap-distance-top:0;mso-wrap-distance-right:0;mso-wrap-distance-bottom:0;mso-position-horizontal:absolute;mso-position-horizontal-relative:page;mso-position-vertical:absolute;mso-position-vertical-relative:text;v-text-anchor:top" coordsize="47625,47625" o:gfxdata="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" path="m26970,47623r-6316,l17617,47018,,26968,,20652,20654,r6316,l47625,23812r-1,3156l26970,47623xe" fillcolor="black" stroked="f">
+              <v:shape w14:anchorId="7A0C9157" id="Graphic 69" o:spid="_x0000_s1026" style="position:absolute;margin-left:85pt;margin-top:8.9pt;width:3.75pt;height:3.75pt;z-index:15759872;visibility:visible;mso-wrap-style:square;mso-wrap-distance-left:0;mso-wrap-distance-top:0;mso-wrap-distance-right:0;mso-wrap-distance-bottom:0;mso-position-horizontal:absolute;mso-position-horizontal-relative:page;mso-position-vertical:absolute;mso-position-vertical-relative:text;v-text-anchor:top" coordsize="47625,47625" o:gfxdata="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" path="m26970,47623r-6316,l17617,47018,,26968,,20652,20654,r6316,l47625,23812r-1,3156l26970,47623xe" fillcolor="black" stroked="f">
                 <v:path arrowok="t"/>
                 <w10:wrap anchorx="page"/>
               </v:shape>
@@ -16916,7 +16880,7 @@
           </mc:Choice>
           <mc:Fallback>
             <w:pict>
-              <v:rect w14:anchorId="397DE88B" id="_x0000_s1037" style="position:absolute;left:0;text-align:left;margin-left:39.7pt;margin-top:.85pt;width:128.3pt;height:56.7pt;z-index:487623168;visibility:visible;mso-wrap-style:square;mso-width-percent:0;mso-height-percent:0;mso-wrap-distance-left:9pt;mso-wrap-distance-top:0;mso-wrap-distance-right:9pt;mso-wrap-distance-bottom:0;mso-position-horizontal:absolute;mso-position-horizontal-relative:text;mso-position-vertical:absolute;mso-position-vertical-relative:text;mso-width-percent:0;mso-height-percent:0;mso-width-relative:margin;mso-height-relative:margin;v-text-anchor:middle" o:gfxdata="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" fillcolor="#fbd4b4 [1305]" strokecolor="#0a121c [484]" strokeweight="2pt">
+              <v:rect w14:anchorId="397DE88B" id="_x0000_s1037" style="position:absolute;left:0;text-align:left;margin-left:39.7pt;margin-top:.85pt;width:128.3pt;height:56.7pt;z-index:487623168;visibility:visible;mso-wrap-style:square;mso-width-percent:0;mso-height-percent:0;mso-wrap-distance-left:9pt;mso-wrap-distance-top:0;mso-wrap-distance-right:9pt;mso-wrap-distance-bottom:0;mso-position-horizontal:absolute;mso-position-horizontal-relative:text;mso-position-vertical:absolute;mso-position-vertical-relative:text;mso-width-percent:0;mso-height-percent:0;mso-width-relative:margin;mso-height-relative:margin;v-text-anchor:middle" o:gfxdata="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" fillcolor="#fbd4b4 [1305]" strokecolor="#0a121c [484]" strokeweight="2pt">
                 <v:textbox>
                   <w:txbxContent>
                     <w:p>
@@ -17126,7 +17090,7 @@
           </mc:Choice>
           <mc:Fallback>
             <w:pict>
-              <v:shape w14:anchorId="5C5F65B2" id="Graphic 70" o:spid="_x0000_s1026" style="position:absolute;margin-left:85pt;margin-top:6.9pt;width:3.75pt;height:3.75pt;z-index:15760384;visibility:visible;mso-wrap-style:square;mso-wrap-distance-left:0;mso-wrap-distance-top:0;mso-wrap-distance-right:0;mso-wrap-distance-bottom:0;mso-position-horizontal:absolute;mso-position-horizontal-relative:page;mso-position-vertical:absolute;mso-position-vertical-relative:text;v-text-anchor:top" coordsize="47625,47625" o:gfxdata="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" path="m26970,47623r-6316,l17617,47018,,26968,,20652,20654,r6316,l47625,23812r-1,3156l26970,47623xe" fillcolor="black" stroked="f">
+              <v:shape w14:anchorId="7880D3FD" id="Graphic 70" o:spid="_x0000_s1026" style="position:absolute;margin-left:85pt;margin-top:6.9pt;width:3.75pt;height:3.75pt;z-index:15760384;visibility:visible;mso-wrap-style:square;mso-wrap-distance-left:0;mso-wrap-distance-top:0;mso-wrap-distance-right:0;mso-wrap-distance-bottom:0;mso-position-horizontal:absolute;mso-position-horizontal-relative:page;mso-position-vertical:absolute;mso-position-vertical-relative:text;v-text-anchor:top" coordsize="47625,47625" o:gfxdata="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" path="m26970,47623r-6316,l17617,47018,,26968,,20652,20654,r6316,l47625,23812r-1,3156l26970,47623xe" fillcolor="black" stroked="f">
                 <v:path arrowok="t"/>
                 <w10:wrap anchorx="page"/>
               </v:shape>
@@ -17248,7 +17212,7 @@
           </mc:Choice>
           <mc:Fallback>
             <w:pict>
-              <v:shape w14:anchorId="724B91A7" id="Graphic 71" o:spid="_x0000_s1026" style="position:absolute;margin-left:85pt;margin-top:9.7pt;width:3.75pt;height:3.75pt;z-index:15760896;visibility:visible;mso-wrap-style:square;mso-wrap-distance-left:0;mso-wrap-distance-top:0;mso-wrap-distance-right:0;mso-wrap-distance-bottom:0;mso-position-horizontal:absolute;mso-position-horizontal-relative:page;mso-position-vertical:absolute;mso-position-vertical-relative:text;v-text-anchor:top" coordsize="47625,47625" o:gfxdata="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" path="m26970,47623r-6316,l17617,47018,,26968,,20652,20654,r6316,l47625,23812r-1,3156l26970,47623xe" fillcolor="black" stroked="f">
+              <v:shape w14:anchorId="631E6254" id="Graphic 71" o:spid="_x0000_s1026" style="position:absolute;margin-left:85pt;margin-top:9.7pt;width:3.75pt;height:3.75pt;z-index:15760896;visibility:visible;mso-wrap-style:square;mso-wrap-distance-left:0;mso-wrap-distance-top:0;mso-wrap-distance-right:0;mso-wrap-distance-bottom:0;mso-position-horizontal:absolute;mso-position-horizontal-relative:page;mso-position-vertical:absolute;mso-position-vertical-relative:text;v-text-anchor:top" coordsize="47625,47625" o:gfxdata="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" path="m26970,47623r-6316,l17617,47018,,26968,,20652,20654,r6316,l47625,23812r-1,3156l26970,47623xe" fillcolor="black" stroked="f">
                 <v:path arrowok="t"/>
                 <w10:wrap anchorx="page"/>
               </v:shape>
@@ -17376,7 +17340,7 @@
           </mc:Choice>
           <mc:Fallback>
             <w:pict>
-              <v:shape w14:anchorId="3959A87A" id="Graphic 72" o:spid="_x0000_s1026" style="position:absolute;margin-left:85pt;margin-top:8.95pt;width:3.75pt;height:3.75pt;z-index:15761408;visibility:visible;mso-wrap-style:square;mso-wrap-distance-left:0;mso-wrap-distance-top:0;mso-wrap-distance-right:0;mso-wrap-distance-bottom:0;mso-position-horizontal:absolute;mso-position-horizontal-relative:page;mso-position-vertical:absolute;mso-position-vertical-relative:text;v-text-anchor:top" coordsize="47625,47625" o:gfxdata="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" path="m26970,47623r-6316,l17617,47015,,26968,,20652,20654,r6316,l47625,23812r-1,3156l26970,47623xe" fillcolor="black" stroked="f">
+              <v:shape w14:anchorId="665DBE39" id="Graphic 72" o:spid="_x0000_s1026" style="position:absolute;margin-left:85pt;margin-top:8.95pt;width:3.75pt;height:3.75pt;z-index:15761408;visibility:visible;mso-wrap-style:square;mso-wrap-distance-left:0;mso-wrap-distance-top:0;mso-wrap-distance-right:0;mso-wrap-distance-bottom:0;mso-position-horizontal:absolute;mso-position-horizontal-relative:page;mso-position-vertical:absolute;mso-position-vertical-relative:text;v-text-anchor:top" coordsize="47625,47625" o:gfxdata="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" path="m26970,47623r-6316,l17617,47015,,26968,,20652,20654,r6316,l47625,23812r-1,3156l26970,47623xe" fillcolor="black" stroked="f">
                 <v:path arrowok="t"/>
                 <w10:wrap anchorx="page"/>
               </v:shape>
@@ -17504,7 +17468,7 @@
           </mc:Choice>
           <mc:Fallback>
             <w:pict>
-              <v:shape w14:anchorId="2DA0BB1A" id="Graphic 73" o:spid="_x0000_s1026" style="position:absolute;margin-left:85pt;margin-top:8.95pt;width:3.75pt;height:3.75pt;z-index:15761920;visibility:visible;mso-wrap-style:square;mso-wrap-distance-left:0;mso-wrap-distance-top:0;mso-wrap-distance-right:0;mso-wrap-distance-bottom:0;mso-position-horizontal:absolute;mso-position-horizontal-relative:page;mso-position-vertical:absolute;mso-position-vertical-relative:text;v-text-anchor:top" coordsize="47625,47625" o:gfxdata="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" path="m26970,47623r-6316,l17617,47015,,26968,,20654,20654,r6316,l47625,23812r-1,3156l26970,47623xe" fillcolor="black" stroked="f">
+              <v:shape w14:anchorId="47F3CC45" id="Graphic 73" o:spid="_x0000_s1026" style="position:absolute;margin-left:85pt;margin-top:8.95pt;width:3.75pt;height:3.75pt;z-index:15761920;visibility:visible;mso-wrap-style:square;mso-wrap-distance-left:0;mso-wrap-distance-top:0;mso-wrap-distance-right:0;mso-wrap-distance-bottom:0;mso-position-horizontal:absolute;mso-position-horizontal-relative:page;mso-position-vertical:absolute;mso-position-vertical-relative:text;v-text-anchor:top" coordsize="47625,47625" o:gfxdata="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" path="m26970,47623r-6316,l17617,47015,,26968,,20654,20654,r6316,l47625,23812r-1,3156l26970,47623xe" fillcolor="black" stroked="f">
                 <v:path arrowok="t"/>
                 <w10:wrap anchorx="page"/>
               </v:shape>
@@ -17858,7 +17822,7 @@
           </mc:Choice>
           <mc:Fallback>
             <w:pict>
-              <v:shape w14:anchorId="7F371A0E" id="Graphic 74" o:spid="_x0000_s1026" style="position:absolute;margin-left:85pt;margin-top:5.55pt;width:3.75pt;height:3.75pt;z-index:15762432;visibility:visible;mso-wrap-style:square;mso-wrap-distance-left:0;mso-wrap-distance-top:0;mso-wrap-distance-right:0;mso-wrap-distance-bottom:0;mso-position-horizontal:absolute;mso-position-horizontal-relative:page;mso-position-vertical:absolute;mso-position-vertical-relative:text;v-text-anchor:top" coordsize="47625,47625" o:gfxdata="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" path="m26970,47623r-6316,l17617,47015,,26968,,20652,20654,r6316,l47625,23812r-1,3156l26970,47623xe" fillcolor="black" stroked="f">
+              <v:shape w14:anchorId="0CA729E7" id="Graphic 74" o:spid="_x0000_s1026" style="position:absolute;margin-left:85pt;margin-top:5.55pt;width:3.75pt;height:3.75pt;z-index:15762432;visibility:visible;mso-wrap-style:square;mso-wrap-distance-left:0;mso-wrap-distance-top:0;mso-wrap-distance-right:0;mso-wrap-distance-bottom:0;mso-position-horizontal:absolute;mso-position-horizontal-relative:page;mso-position-vertical:absolute;mso-position-vertical-relative:text;v-text-anchor:top" coordsize="47625,47625" o:gfxdata="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" path="m26970,47623r-6316,l17617,47015,,26968,,20652,20654,r6316,l47625,23812r-1,3156l26970,47623xe" fillcolor="black" stroked="f">
                 <v:path arrowok="t"/>
                 <w10:wrap anchorx="page"/>
               </v:shape>
@@ -18033,7 +17997,7 @@
           </mc:Choice>
           <mc:Fallback>
             <w:pict>
-              <v:shape w14:anchorId="79ED6CE5" id="Graphic 75" o:spid="_x0000_s1026" style="position:absolute;margin-left:85pt;margin-top:8.85pt;width:3.75pt;height:3.75pt;z-index:15762944;visibility:visible;mso-wrap-style:square;mso-wrap-distance-left:0;mso-wrap-distance-top:0;mso-wrap-distance-right:0;mso-wrap-distance-bottom:0;mso-position-horizontal:absolute;mso-position-horizontal-relative:page;mso-position-vertical:absolute;mso-position-vertical-relative:text;v-text-anchor:top" coordsize="47625,47625" o:gfxdata="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" path="m26970,47623r-6316,l17617,47015,,26968,,20652,20654,r6316,l47625,23812r-1,3156l26970,47623xe" fillcolor="black" stroked="f">
+              <v:shape w14:anchorId="00B0C2B3" id="Graphic 75" o:spid="_x0000_s1026" style="position:absolute;margin-left:85pt;margin-top:8.85pt;width:3.75pt;height:3.75pt;z-index:15762944;visibility:visible;mso-wrap-style:square;mso-wrap-distance-left:0;mso-wrap-distance-top:0;mso-wrap-distance-right:0;mso-wrap-distance-bottom:0;mso-position-horizontal:absolute;mso-position-horizontal-relative:page;mso-position-vertical:absolute;mso-position-vertical-relative:text;v-text-anchor:top" coordsize="47625,47625" o:gfxdata="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" path="m26970,47623r-6316,l17617,47015,,26968,,20652,20654,r6316,l47625,23812r-1,3156l26970,47623xe" fillcolor="black" stroked="f">
                 <v:path arrowok="t"/>
                 <w10:wrap anchorx="page"/>
               </v:shape>
@@ -18220,7 +18184,7 @@
           </mc:Choice>
           <mc:Fallback>
             <w:pict>
-              <v:shape w14:anchorId="2A11C103" id="Graphic 79" o:spid="_x0000_s1026" style="position:absolute;margin-left:85pt;margin-top:7pt;width:3.75pt;height:3.75pt;z-index:15763456;visibility:visible;mso-wrap-style:square;mso-wrap-distance-left:0;mso-wrap-distance-top:0;mso-wrap-distance-right:0;mso-wrap-distance-bottom:0;mso-position-horizontal:absolute;mso-position-horizontal-relative:page;mso-position-vertical:absolute;mso-position-vertical-relative:text;v-text-anchor:top" coordsize="47625,47625" o:gfxdata="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" path="m26970,47623r-6316,l17617,47015,,26968,,20652,20654,r6316,l47625,23812r-1,3156l26970,47623xe" fillcolor="black" stroked="f">
+              <v:shape w14:anchorId="42931CF3" id="Graphic 79" o:spid="_x0000_s1026" style="position:absolute;margin-left:85pt;margin-top:7pt;width:3.75pt;height:3.75pt;z-index:15763456;visibility:visible;mso-wrap-style:square;mso-wrap-distance-left:0;mso-wrap-distance-top:0;mso-wrap-distance-right:0;mso-wrap-distance-bottom:0;mso-position-horizontal:absolute;mso-position-horizontal-relative:page;mso-position-vertical:absolute;mso-position-vertical-relative:text;v-text-anchor:top" coordsize="47625,47625" o:gfxdata="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" path="m26970,47623r-6316,l17617,47015,,26968,,20652,20654,r6316,l47625,23812r-1,3156l26970,47623xe" fillcolor="black" stroked="f">
                 <v:path arrowok="t"/>
                 <w10:wrap anchorx="page"/>
               </v:shape>
@@ -18388,7 +18352,7 @@
           </mc:Choice>
           <mc:Fallback>
             <w:pict>
-              <v:shape w14:anchorId="35E0BDE7" id="Graphic 80" o:spid="_x0000_s1026" style="position:absolute;margin-left:85pt;margin-top:8.85pt;width:3.75pt;height:3.75pt;z-index:15763968;visibility:visible;mso-wrap-style:square;mso-wrap-distance-left:0;mso-wrap-distance-top:0;mso-wrap-distance-right:0;mso-wrap-distance-bottom:0;mso-position-horizontal:absolute;mso-position-horizontal-relative:page;mso-position-vertical:absolute;mso-position-vertical-relative:text;v-text-anchor:top" coordsize="47625,47625" o:gfxdata="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" path="m26970,47623r-6316,l17617,47018,,26968,,20654,20654,r6316,l47625,23812r-1,3156l26970,47623xe" fillcolor="black" stroked="f">
+              <v:shape w14:anchorId="2497C11F" id="Graphic 80" o:spid="_x0000_s1026" style="position:absolute;margin-left:85pt;margin-top:8.85pt;width:3.75pt;height:3.75pt;z-index:15763968;visibility:visible;mso-wrap-style:square;mso-wrap-distance-left:0;mso-wrap-distance-top:0;mso-wrap-distance-right:0;mso-wrap-distance-bottom:0;mso-position-horizontal:absolute;mso-position-horizontal-relative:page;mso-position-vertical:absolute;mso-position-vertical-relative:text;v-text-anchor:top" coordsize="47625,47625" o:gfxdata="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" path="m26970,47623r-6316,l17617,47018,,26968,,20654,20654,r6316,l47625,23812r-1,3156l26970,47623xe" fillcolor="black" stroked="f">
                 <v:path arrowok="t"/>
                 <w10:wrap anchorx="page"/>
               </v:shape>
@@ -18710,7 +18674,7 @@
           </mc:Choice>
           <mc:Fallback>
             <w:pict>
-              <v:shape w14:anchorId="6FEB4A7B" id="Graphic 81" o:spid="_x0000_s1026" style="position:absolute;margin-left:85pt;margin-top:5.55pt;width:3.75pt;height:3.75pt;z-index:15764480;visibility:visible;mso-wrap-style:square;mso-wrap-distance-left:0;mso-wrap-distance-top:0;mso-wrap-distance-right:0;mso-wrap-distance-bottom:0;mso-position-horizontal:absolute;mso-position-horizontal-relative:page;mso-position-vertical:absolute;mso-position-vertical-relative:text;v-text-anchor:top" coordsize="47625,47625" o:gfxdata="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" path="m26970,47623r-6316,l17617,47018,,26968,,20652,20654,r6316,l47625,23812r-1,3156l26970,47623xe" fillcolor="black" stroked="f">
+              <v:shape w14:anchorId="27549BF1" id="Graphic 81" o:spid="_x0000_s1026" style="position:absolute;margin-left:85pt;margin-top:5.55pt;width:3.75pt;height:3.75pt;z-index:15764480;visibility:visible;mso-wrap-style:square;mso-wrap-distance-left:0;mso-wrap-distance-top:0;mso-wrap-distance-right:0;mso-wrap-distance-bottom:0;mso-position-horizontal:absolute;mso-position-horizontal-relative:page;mso-position-vertical:absolute;mso-position-vertical-relative:text;v-text-anchor:top" coordsize="47625,47625" o:gfxdata="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" path="m26970,47623r-6316,l17617,47018,,26968,,20652,20654,r6316,l47625,23812r-1,3156l26970,47623xe" fillcolor="black" stroked="f">
                 <v:path arrowok="t"/>
                 <w10:wrap anchorx="page"/>
               </v:shape>
@@ -18883,7 +18847,7 @@
           </mc:Choice>
           <mc:Fallback>
             <w:pict>
-              <v:shape w14:anchorId="5A9ACC98" id="Graphic 82" o:spid="_x0000_s1026" style="position:absolute;margin-left:85pt;margin-top:8.85pt;width:3.75pt;height:3.75pt;z-index:15764992;visibility:visible;mso-wrap-style:square;mso-wrap-distance-left:0;mso-wrap-distance-top:0;mso-wrap-distance-right:0;mso-wrap-distance-bottom:0;mso-position-horizontal:absolute;mso-position-horizontal-relative:page;mso-position-vertical:absolute;mso-position-vertical-relative:text;v-text-anchor:top" coordsize="47625,47625" o:gfxdata="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" path="m26970,47623r-6316,l17617,47015,,26968,,20654,20654,r6316,l47625,23812r-1,3156l26970,47623xe" fillcolor="black" stroked="f">
+              <v:shape w14:anchorId="7C362CCE" id="Graphic 82" o:spid="_x0000_s1026" style="position:absolute;margin-left:85pt;margin-top:8.85pt;width:3.75pt;height:3.75pt;z-index:15764992;visibility:visible;mso-wrap-style:square;mso-wrap-distance-left:0;mso-wrap-distance-top:0;mso-wrap-distance-right:0;mso-wrap-distance-bottom:0;mso-position-horizontal:absolute;mso-position-horizontal-relative:page;mso-position-vertical:absolute;mso-position-vertical-relative:text;v-text-anchor:top" coordsize="47625,47625" o:gfxdata="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" path="m26970,47623r-6316,l17617,47015,,26968,,20654,20654,r6316,l47625,23812r-1,3156l26970,47623xe" fillcolor="black" stroked="f">
                 <v:path arrowok="t"/>
                 <w10:wrap anchorx="page"/>
               </v:shape>
@@ -19085,7 +19049,7 @@
           </mc:Choice>
           <mc:Fallback>
             <w:pict>
-              <v:shape w14:anchorId="4603544B" id="Graphic 83" o:spid="_x0000_s1026" style="position:absolute;margin-left:85pt;margin-top:9.55pt;width:3.75pt;height:3.75pt;z-index:15765504;visibility:visible;mso-wrap-style:square;mso-wrap-distance-left:0;mso-wrap-distance-top:0;mso-wrap-distance-right:0;mso-wrap-distance-bottom:0;mso-position-horizontal:absolute;mso-position-horizontal-relative:page;mso-position-vertical:absolute;mso-position-vertical-relative:text;v-text-anchor:top" coordsize="47625,47625" o:gfxdata="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" path="m26970,47623r-6316,l17617,47015,,26968,,20652,20654,r6316,l47625,23812r-1,3156l26970,47623xe" fillcolor="black" stroked="f">
+              <v:shape w14:anchorId="4B58A4AE" id="Graphic 83" o:spid="_x0000_s1026" style="position:absolute;margin-left:85pt;margin-top:9.55pt;width:3.75pt;height:3.75pt;z-index:15765504;visibility:visible;mso-wrap-style:square;mso-wrap-distance-left:0;mso-wrap-distance-top:0;mso-wrap-distance-right:0;mso-wrap-distance-bottom:0;mso-position-horizontal:absolute;mso-position-horizontal-relative:page;mso-position-vertical:absolute;mso-position-vertical-relative:text;v-text-anchor:top" coordsize="47625,47625" o:gfxdata="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" path="m26970,47623r-6316,l17617,47015,,26968,,20652,20654,r6316,l47625,23812r-1,3156l26970,47623xe" fillcolor="black" stroked="f">
                 <v:path arrowok="t"/>
                 <w10:wrap anchorx="page"/>
               </v:shape>
@@ -19258,7 +19222,7 @@
           </mc:Choice>
           <mc:Fallback>
             <w:pict>
-              <v:shape w14:anchorId="485E7393" id="Graphic 84" o:spid="_x0000_s1026" style="position:absolute;margin-left:85pt;margin-top:8.85pt;width:3.75pt;height:3.75pt;z-index:15766016;visibility:visible;mso-wrap-style:square;mso-wrap-distance-left:0;mso-wrap-distance-top:0;mso-wrap-distance-right:0;mso-wrap-distance-bottom:0;mso-position-horizontal:absolute;mso-position-horizontal-relative:page;mso-position-vertical:absolute;mso-position-vertical-relative:text;v-text-anchor:top" coordsize="47625,47625" o:gfxdata="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" path="m26970,47623r-6316,l17617,47018,,26968,,20652,20654,r6316,l47625,23812r-1,3156l26970,47623xe" fillcolor="black" stroked="f">
+              <v:shape w14:anchorId="196E2EA3" id="Graphic 84" o:spid="_x0000_s1026" style="position:absolute;margin-left:85pt;margin-top:8.85pt;width:3.75pt;height:3.75pt;z-index:15766016;visibility:visible;mso-wrap-style:square;mso-wrap-distance-left:0;mso-wrap-distance-top:0;mso-wrap-distance-right:0;mso-wrap-distance-bottom:0;mso-position-horizontal:absolute;mso-position-horizontal-relative:page;mso-position-vertical:absolute;mso-position-vertical-relative:text;v-text-anchor:top" coordsize="47625,47625" o:gfxdata="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" path="m26970,47623r-6316,l17617,47018,,26968,,20652,20654,r6316,l47625,23812r-1,3156l26970,47623xe" fillcolor="black" stroked="f">
                 <v:path arrowok="t"/>
                 <w10:wrap anchorx="page"/>
               </v:shape>
@@ -19697,7 +19661,7 @@
           </mc:Choice>
           <mc:Fallback>
             <w:pict>
-              <v:shape w14:anchorId="3E710C1D" id="Graphic 85" o:spid="_x0000_s1026" style="position:absolute;margin-left:85pt;margin-top:5.55pt;width:3.75pt;height:3.75pt;z-index:15766528;visibility:visible;mso-wrap-style:square;mso-wrap-distance-left:0;mso-wrap-distance-top:0;mso-wrap-distance-right:0;mso-wrap-distance-bottom:0;mso-position-horizontal:absolute;mso-position-horizontal-relative:page;mso-position-vertical:absolute;mso-position-vertical-relative:text;v-text-anchor:top" coordsize="47625,47625" o:gfxdata="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" path="m26970,47623r-6316,l17617,47015,,26968,,20652,20654,r6316,l47625,23812r-1,3156l26970,47623xe" fillcolor="black" stroked="f">
+              <v:shape w14:anchorId="181E3CB4" id="Graphic 85" o:spid="_x0000_s1026" style="position:absolute;margin-left:85pt;margin-top:5.55pt;width:3.75pt;height:3.75pt;z-index:15766528;visibility:visible;mso-wrap-style:square;mso-wrap-distance-left:0;mso-wrap-distance-top:0;mso-wrap-distance-right:0;mso-wrap-distance-bottom:0;mso-position-horizontal:absolute;mso-position-horizontal-relative:page;mso-position-vertical:absolute;mso-position-vertical-relative:text;v-text-anchor:top" coordsize="47625,47625" o:gfxdata="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" path="m26970,47623r-6316,l17617,47015,,26968,,20652,20654,r6316,l47625,23812r-1,3156l26970,47623xe" fillcolor="black" stroked="f">
                 <v:path arrowok="t"/>
                 <w10:wrap anchorx="page"/>
               </v:shape>
@@ -19876,7 +19840,7 @@
           </mc:Choice>
           <mc:Fallback>
             <w:pict>
-              <v:shape w14:anchorId="5B5DE479" id="Graphic 86" o:spid="_x0000_s1026" style="position:absolute;margin-left:85pt;margin-top:8.85pt;width:3.75pt;height:3.75pt;z-index:15767040;visibility:visible;mso-wrap-style:square;mso-wrap-distance-left:0;mso-wrap-distance-top:0;mso-wrap-distance-right:0;mso-wrap-distance-bottom:0;mso-position-horizontal:absolute;mso-position-horizontal-relative:page;mso-position-vertical:absolute;mso-position-vertical-relative:text;v-text-anchor:top" coordsize="47625,47625" o:gfxdata="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" path="m26970,47623r-6316,l17617,47015,,26968,,20652,20654,r6316,l47625,23812r-1,3156l26970,47623xe" fillcolor="black" stroked="f">
+              <v:shape w14:anchorId="6DA501F4" id="Graphic 86" o:spid="_x0000_s1026" style="position:absolute;margin-left:85pt;margin-top:8.85pt;width:3.75pt;height:3.75pt;z-index:15767040;visibility:visible;mso-wrap-style:square;mso-wrap-distance-left:0;mso-wrap-distance-top:0;mso-wrap-distance-right:0;mso-wrap-distance-bottom:0;mso-position-horizontal:absolute;mso-position-horizontal-relative:page;mso-position-vertical:absolute;mso-position-vertical-relative:text;v-text-anchor:top" coordsize="47625,47625" o:gfxdata="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" path="m26970,47623r-6316,l17617,47015,,26968,,20652,20654,r6316,l47625,23812r-1,3156l26970,47623xe" fillcolor="black" stroked="f">
                 <v:path arrowok="t"/>
                 <w10:wrap anchorx="page"/>
               </v:shape>
@@ -20165,7 +20129,7 @@
           </mc:Choice>
           <mc:Fallback>
             <w:pict>
-              <v:shape w14:anchorId="4F143D33" id="Graphic 87" o:spid="_x0000_s1026" style="position:absolute;margin-left:85pt;margin-top:8.85pt;width:3.75pt;height:3.75pt;z-index:15767552;visibility:visible;mso-wrap-style:square;mso-wrap-distance-left:0;mso-wrap-distance-top:0;mso-wrap-distance-right:0;mso-wrap-distance-bottom:0;mso-position-horizontal:absolute;mso-position-horizontal-relative:page;mso-position-vertical:absolute;mso-position-vertical-relative:text;v-text-anchor:top" coordsize="47625,47625" o:gfxdata="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" path="m26970,47623r-6316,l17617,47018,,26968,,20652,20654,r6316,l47625,23812r-1,3156l26970,47623xe" fillcolor="black" stroked="f">
+              <v:shape w14:anchorId="4F625D43" id="Graphic 87" o:spid="_x0000_s1026" style="position:absolute;margin-left:85pt;margin-top:8.85pt;width:3.75pt;height:3.75pt;z-index:15767552;visibility:visible;mso-wrap-style:square;mso-wrap-distance-left:0;mso-wrap-distance-top:0;mso-wrap-distance-right:0;mso-wrap-distance-bottom:0;mso-position-horizontal:absolute;mso-position-horizontal-relative:page;mso-position-vertical:absolute;mso-position-vertical-relative:text;v-text-anchor:top" coordsize="47625,47625" o:gfxdata="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" path="m26970,47623r-6316,l17617,47018,,26968,,20652,20654,r6316,l47625,23812r-1,3156l26970,47623xe" fillcolor="black" stroked="f">
                 <v:path arrowok="t"/>
                 <w10:wrap anchorx="page"/>
               </v:shape>
@@ -20457,7 +20421,7 @@
           </mc:Choice>
           <mc:Fallback>
             <w:pict>
-              <v:shape w14:anchorId="31B6D4F2" id="Graphic 4" o:spid="_x0000_s1026" style="position:absolute;margin-left:63.75pt;margin-top:28.1pt;width:462pt;height:.75pt;z-index:-15668736;visibility:visible;mso-wrap-style:square;mso-wrap-distance-left:0;mso-wrap-distance-top:0;mso-wrap-distance-right:0;mso-wrap-distance-bottom:0;mso-position-horizontal:absolute;mso-position-horizontal-relative:page;mso-position-vertical:absolute;mso-position-vertical-relative:text;v-text-anchor:top" coordsize="5867400,9525" o:gfxdata="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" path="m5867400,9525l,9525,,,5867400,r,9525xe" fillcolor="black" stroked="f">
+              <v:shape w14:anchorId="2BCB988F" id="Graphic 4" o:spid="_x0000_s1026" style="position:absolute;margin-left:63.75pt;margin-top:28.1pt;width:462pt;height:.75pt;z-index:-15668736;visibility:visible;mso-wrap-style:square;mso-wrap-distance-left:0;mso-wrap-distance-top:0;mso-wrap-distance-right:0;mso-wrap-distance-bottom:0;mso-position-horizontal:absolute;mso-position-horizontal-relative:page;mso-position-vertical:absolute;mso-position-vertical-relative:text;v-text-anchor:top" coordsize="5867400,9525" o:gfxdata="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" path="m5867400,9525l,9525,,,5867400,r,9525xe" fillcolor="black" stroked="f">
                 <v:fill opacity="11822f"/>
                 <v:path arrowok="t"/>
                 <w10:wrap type="topAndBottom" anchorx="page"/>
@@ -21236,7 +21200,7 @@
           </mc:Choice>
           <mc:Fallback>
             <w:pict>
-              <v:shape w14:anchorId="4F0DC5DB" id="Textbox 17" o:spid="_x0000_s1038" type="#_x0000_t202" style="position:absolute;margin-left:-.1pt;margin-top:10.7pt;width:462pt;height:145.05pt;z-index:487628288;visibility:visible;mso-wrap-style:square;mso-height-percent:0;mso-wrap-distance-left:9pt;mso-wrap-distance-top:0;mso-wrap-distance-right:9pt;mso-wrap-distance-bottom:0;mso-position-horizontal:absolute;mso-position-horizontal-relative:text;mso-position-vertical:absolute;mso-position-vertical-relative:text;mso-height-percent:0;mso-height-relative:margin;v-text-anchor:top" o:gfxdata="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" fillcolor="#fbd4b4 [1305]" strokecolor="#0a121c [484]">
+              <v:shape w14:anchorId="4F0DC5DB" id="Textbox 17" o:spid="_x0000_s1038" type="#_x0000_t202" style="position:absolute;margin-left:-.1pt;margin-top:10.7pt;width:462pt;height:145.05pt;z-index:487628288;visibility:visible;mso-wrap-style:square;mso-height-percent:0;mso-wrap-distance-left:9pt;mso-wrap-distance-top:0;mso-wrap-distance-right:9pt;mso-wrap-distance-bottom:0;mso-position-horizontal:absolute;mso-position-horizontal-relative:text;mso-position-vertical:absolute;mso-position-vertical-relative:text;mso-height-percent:0;mso-height-relative:margin;v-text-anchor:top" o:gfxdata="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" fillcolor="#fbd4b4 [1305]" strokecolor="#0a121c [484]">
                 <v:textbox inset="0,0,0,0">
                   <w:txbxContent>
                     <w:p>
@@ -21914,7 +21878,7 @@
           </mc:Choice>
           <mc:Fallback>
             <w:pict>
-              <v:shape w14:anchorId="787890AE" id="Text Box 7" o:spid="_x0000_s1039" type="#_x0000_t202" style="position:absolute;margin-left:10.3pt;margin-top:17.1pt;width:421.7pt;height:229.45pt;z-index:487630336;visibility:visible;mso-wrap-style:square;mso-width-percent:0;mso-height-percent:0;mso-wrap-distance-left:9pt;mso-wrap-distance-top:0;mso-wrap-distance-right:9pt;mso-wrap-distance-bottom:0;mso-position-horizontal:absolute;mso-position-horizontal-relative:text;mso-position-vertical:absolute;mso-position-vertical-relative:text;mso-width-percent:0;mso-height-percent:0;mso-width-relative:margin;mso-height-relative:margin;v-text-anchor:top" o:gfxdata="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" fillcolor="white [3201]" strokeweight=".5pt">
+              <v:shape w14:anchorId="787890AE" id="Text Box 7" o:spid="_x0000_s1039" type="#_x0000_t202" style="position:absolute;margin-left:10.3pt;margin-top:17.1pt;width:421.7pt;height:229.45pt;z-index:487630336;visibility:visible;mso-wrap-style:square;mso-width-percent:0;mso-height-percent:0;mso-wrap-distance-left:9pt;mso-wrap-distance-top:0;mso-wrap-distance-right:9pt;mso-wrap-distance-bottom:0;mso-position-horizontal:absolute;mso-position-horizontal-relative:text;mso-position-vertical:absolute;mso-position-vertical-relative:text;mso-width-percent:0;mso-height-percent:0;mso-width-relative:margin;mso-height-relative:margin;v-text-anchor:top" o:gfxdata="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" fillcolor="white [3201]" strokeweight=".5pt">
                 <v:textbox style="layout-flow:vertical-ideographic">
                   <w:txbxContent>
                     <w:p>
@@ -22167,7 +22131,7 @@
           </mc:Choice>
           <mc:Fallback>
             <w:pict>
-              <v:shape w14:anchorId="4F97F9FB" id="Text Box 6" o:spid="_x0000_s1040" type="#_x0000_t202" style="position:absolute;margin-left:25.3pt;margin-top:48pt;width:413.05pt;height:178.8pt;z-index:487629312;visibility:visible;mso-wrap-style:square;mso-width-percent:0;mso-height-percent:0;mso-wrap-distance-left:9pt;mso-wrap-distance-top:0;mso-wrap-distance-right:9pt;mso-wrap-distance-bottom:0;mso-position-horizontal:absolute;mso-position-horizontal-relative:text;mso-position-vertical:absolute;mso-position-vertical-relative:text;mso-width-percent:0;mso-height-percent:0;mso-width-relative:margin;mso-height-relative:margin;v-text-anchor:top" o:gfxdata="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" fillcolor="white [3201]" strokeweight=".5pt">
+              <v:shape w14:anchorId="4F97F9FB" id="Text Box 6" o:spid="_x0000_s1040" type="#_x0000_t202" style="position:absolute;margin-left:25.3pt;margin-top:48pt;width:413.05pt;height:178.8pt;z-index:487629312;visibility:visible;mso-wrap-style:square;mso-width-percent:0;mso-height-percent:0;mso-wrap-distance-left:9pt;mso-wrap-distance-top:0;mso-wrap-distance-right:9pt;mso-wrap-distance-bottom:0;mso-position-horizontal:absolute;mso-position-horizontal-relative:text;mso-position-vertical:absolute;mso-position-vertical-relative:text;mso-width-percent:0;mso-height-percent:0;mso-width-relative:margin;mso-height-relative:margin;v-text-anchor:top" o:gfxdata="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" fillcolor="white [3201]" strokeweight=".5pt">
                 <v:textbox>
                   <w:txbxContent>
                     <w:p/>
@@ -22552,7 +22516,7 @@
           </mc:Choice>
           <mc:Fallback>
             <w:pict>
-              <v:shape w14:anchorId="707CA7A3" id="_x0000_s1041" type="#_x0000_t202" style="position:absolute;margin-left:33.25pt;margin-top:7.05pt;width:409.85pt;height:306.25pt;z-index:487631360;visibility:visible;mso-wrap-style:square;mso-width-percent:0;mso-height-percent:0;mso-wrap-distance-left:9pt;mso-wrap-distance-top:0;mso-wrap-distance-right:9pt;mso-wrap-distance-bottom:0;mso-position-horizontal:absolute;mso-position-horizontal-relative:text;mso-position-vertical:absolute;mso-position-vertical-relative:text;mso-width-percent:0;mso-height-percent:0;mso-width-relative:margin;mso-height-relative:margin;v-text-anchor:top" o:gfxdata="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" fillcolor="white [3201]" strokeweight=".5pt">
+              <v:shape w14:anchorId="707CA7A3" id="_x0000_s1041" type="#_x0000_t202" style="position:absolute;margin-left:33.25pt;margin-top:7.05pt;width:409.85pt;height:306.25pt;z-index:487631360;visibility:visible;mso-wrap-style:square;mso-width-percent:0;mso-height-percent:0;mso-wrap-distance-left:9pt;mso-wrap-distance-top:0;mso-wrap-distance-right:9pt;mso-wrap-distance-bottom:0;mso-position-horizontal:absolute;mso-position-horizontal-relative:text;mso-position-vertical:absolute;mso-position-vertical-relative:text;mso-width-percent:0;mso-height-percent:0;mso-width-relative:margin;mso-height-relative:margin;v-text-anchor:top" o:gfxdata="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" fillcolor="white [3201]" strokeweight=".5pt">
                 <v:textbox style="layout-flow:vertical-ideographic">
                   <w:txbxContent>
                     <w:p>
@@ -22872,17 +22836,7 @@
           <w:sz w:val="24"/>
           <w:szCs w:val="24"/>
         </w:rPr>
-        <w:t>QB.</w:t>
-      </w:r>
-      <w:r>
-        <w:rPr>
-          <w:rFonts w:ascii="Times New Roman" w:hAnsi="Times New Roman" w:cs="Times New Roman"/>
-          <w:b/>
-          <w:bCs/>
-          <w:sz w:val="24"/>
-          <w:szCs w:val="24"/>
-        </w:rPr>
-        <w:t>2.1</w:t>
+        <w:t>QB.2.1</w:t>
       </w:r>
       <w:r>
         <w:rPr>
@@ -23022,17 +22976,7 @@
           <w:sz w:val="24"/>
           <w:szCs w:val="24"/>
         </w:rPr>
-        <w:t>QB.</w:t>
-      </w:r>
-      <w:r>
-        <w:rPr>
-          <w:rFonts w:ascii="Times New Roman" w:hAnsi="Times New Roman" w:cs="Times New Roman"/>
-          <w:b/>
-          <w:bCs/>
-          <w:sz w:val="24"/>
-          <w:szCs w:val="24"/>
-        </w:rPr>
-        <w:t xml:space="preserve">2.2 </w:t>
+        <w:t xml:space="preserve">QB.2.2 </w:t>
       </w:r>
       <w:r>
         <w:rPr>
@@ -23526,7 +23470,7 @@
           </mc:Choice>
           <mc:Fallback>
             <w:pict>
-              <v:rect w14:anchorId="7E2EC406" id="Rectangle 1015172502" o:spid="_x0000_s1026" style="position:absolute;margin-left:0;margin-top:8.5pt;width:474pt;height:417.75pt;z-index:487632384;visibility:visible;mso-wrap-style:square;mso-height-percent:0;mso-wrap-distance-left:9pt;mso-wrap-distance-top:0;mso-wrap-distance-right:9pt;mso-wrap-distance-bottom:0;mso-position-horizontal:absolute;mso-position-horizontal-relative:text;mso-position-vertical:absolute;mso-position-vertical-relative:text;mso-height-percent:0;mso-height-relative:margin;v-text-anchor:middle" o:gfxdata="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" filled="f" strokecolor="#243f60 [1604]" strokeweight="2pt"/>
+              <v:rect w14:anchorId="42233EBD" id="Rectangle 1015172502" o:spid="_x0000_s1026" style="position:absolute;margin-left:0;margin-top:8.5pt;width:474pt;height:417.75pt;z-index:487632384;visibility:visible;mso-wrap-style:square;mso-height-percent:0;mso-wrap-distance-left:9pt;mso-wrap-distance-top:0;mso-wrap-distance-right:9pt;mso-wrap-distance-bottom:0;mso-position-horizontal:absolute;mso-position-horizontal-relative:text;mso-position-vertical:absolute;mso-position-vertical-relative:text;mso-height-percent:0;mso-height-relative:margin;v-text-anchor:middle" o:gfxdata="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" filled="f" strokecolor="#243f60 [1604]" strokeweight="2pt"/>
             </w:pict>
           </mc:Fallback>
         </mc:AlternateContent>
@@ -23830,7 +23774,7 @@
           </mc:Choice>
           <mc:Fallback>
             <w:pict>
-              <v:rect w14:anchorId="613E70D7" id="Rectangle 1685900763" o:spid="_x0000_s1026" style="position:absolute;margin-left:-5.9pt;margin-top:12.5pt;width:474pt;height:584.7pt;z-index:487633408;visibility:visible;mso-wrap-style:square;mso-height-percent:0;mso-wrap-distance-left:9pt;mso-wrap-distance-top:0;mso-wrap-distance-right:9pt;mso-wrap-distance-bottom:0;mso-position-horizontal:absolute;mso-position-horizontal-relative:text;mso-position-vertical:absolute;mso-position-vertical-relative:text;mso-height-percent:0;mso-height-relative:margin;v-text-anchor:middle" o:gfxdata="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" filled="f" strokecolor="#243f60 [1604]" strokeweight="2pt"/>
+              <v:rect w14:anchorId="2CC86D92" id="Rectangle 1685900763" o:spid="_x0000_s1026" style="position:absolute;margin-left:-5.9pt;margin-top:12.5pt;width:474pt;height:584.7pt;z-index:487633408;visibility:visible;mso-wrap-style:square;mso-height-percent:0;mso-wrap-distance-left:9pt;mso-wrap-distance-top:0;mso-wrap-distance-right:9pt;mso-wrap-distance-bottom:0;mso-position-horizontal:absolute;mso-position-horizontal-relative:text;mso-position-vertical:absolute;mso-position-vertical-relative:text;mso-height-percent:0;mso-height-relative:margin;v-text-anchor:middle" o:gfxdata="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" filled="f" strokecolor="#243f60 [1604]" strokeweight="2pt"/>
             </w:pict>
           </mc:Fallback>
         </mc:AlternateContent>
@@ -24303,6 +24247,7 @@
           <w:rFonts w:ascii="Times New Roman" w:eastAsia="Times New Roman" w:hAnsi="Times New Roman" w:cs="Times New Roman"/>
           <w:i/>
           <w:iCs/>
+          <w:noProof/>
           <w:sz w:val="24"/>
           <w:szCs w:val="24"/>
           <w:lang w:eastAsia="en-GB"/>
@@ -25058,7 +25003,7 @@
           </mc:Choice>
           <mc:Fallback>
             <w:pict>
-              <v:shape w14:anchorId="50B695C1" id="_x0000_s1042" type="#_x0000_t202" style="position:absolute;left:0;text-align:left;margin-left:-12.1pt;margin-top:31.65pt;width:476.25pt;height:268.15pt;z-index:487634432;visibility:visible;mso-wrap-style:square;mso-width-percent:0;mso-height-percent:0;mso-wrap-distance-left:9pt;mso-wrap-distance-top:3.6pt;mso-wrap-distance-right:9pt;mso-wrap-distance-bottom:3.6pt;mso-position-horizontal:absolute;mso-position-horizontal-relative:margin;mso-position-vertical:absolute;mso-position-vertical-relative:text;mso-width-percent:0;mso-height-percent:0;mso-width-relative:margin;mso-height-relative:margin;v-text-anchor:top" o:gfxdata="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">
+              <v:shape w14:anchorId="50B695C1" id="_x0000_s1042" type="#_x0000_t202" style="position:absolute;left:0;text-align:left;margin-left:-12.1pt;margin-top:31.65pt;width:476.25pt;height:268.15pt;z-index:487634432;visibility:visible;mso-wrap-style:square;mso-width-percent:0;mso-height-percent:0;mso-wrap-distance-left:9pt;mso-wrap-distance-top:3.6pt;mso-wrap-distance-right:9pt;mso-wrap-distance-bottom:3.6pt;mso-position-horizontal:absolute;mso-position-horizontal-relative:margin;mso-position-vertical:absolute;mso-position-vertical-relative:text;mso-width-percent:0;mso-height-percent:0;mso-width-relative:margin;mso-height-relative:margin;v-text-anchor:top" o:gfxdata="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">
                 <v:textbox>
                   <w:txbxContent>
                     <w:p>
@@ -25695,7 +25640,7 @@
           </mc:Choice>
           <mc:Fallback>
             <w:pict>
-              <v:shape w14:anchorId="022BD980" id="_x0000_s1043" type="#_x0000_t202" style="position:absolute;margin-left:-19.85pt;margin-top:30.25pt;width:476.25pt;height:613.55pt;z-index:487625216;visibility:visible;mso-wrap-style:square;mso-width-percent:0;mso-height-percent:0;mso-wrap-distance-left:9pt;mso-wrap-distance-top:3.6pt;mso-wrap-distance-right:9pt;mso-wrap-distance-bottom:3.6pt;mso-position-horizontal:absolute;mso-position-horizontal-relative:margin;mso-position-vertical:absolute;mso-position-vertical-relative:text;mso-width-percent:0;mso-height-percent:0;mso-width-relative:margin;mso-height-relative:margin;v-text-anchor:top" o:gfxdata="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">
+              <v:shape w14:anchorId="022BD980" id="_x0000_s1043" type="#_x0000_t202" style="position:absolute;margin-left:-19.85pt;margin-top:30.25pt;width:476.25pt;height:613.55pt;z-index:487625216;visibility:visible;mso-wrap-style:square;mso-width-percent:0;mso-height-percent:0;mso-wrap-distance-left:9pt;mso-wrap-distance-top:3.6pt;mso-wrap-distance-right:9pt;mso-wrap-distance-bottom:3.6pt;mso-position-horizontal:absolute;mso-position-horizontal-relative:margin;mso-position-vertical:absolute;mso-position-vertical-relative:text;mso-width-percent:0;mso-height-percent:0;mso-width-relative:margin;mso-height-relative:margin;v-text-anchor:top" o:gfxdata="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">
                 <v:textbox>
                   <w:txbxContent>
                     <w:p>
@@ -26408,7 +26353,7 @@
           </mc:Choice>
           <mc:Fallback>
             <w:pict>
-              <v:shape w14:anchorId="29991FF9" id="_x0000_s1044" type="#_x0000_t202" style="position:absolute;margin-left:8.25pt;margin-top:6.8pt;width:462pt;height:194.1pt;z-index:487635456;visibility:visible;mso-wrap-style:square;mso-height-percent:0;mso-wrap-distance-left:9pt;mso-wrap-distance-top:0;mso-wrap-distance-right:9pt;mso-wrap-distance-bottom:0;mso-position-horizontal:absolute;mso-position-horizontal-relative:text;mso-position-vertical:absolute;mso-position-vertical-relative:text;mso-height-percent:0;mso-height-relative:margin;v-text-anchor:top" o:gfxdata="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" fillcolor="#fbd4b4 [1305]" strokecolor="#0a121c [484]">
+              <v:shape w14:anchorId="29991FF9" id="_x0000_s1044" type="#_x0000_t202" style="position:absolute;margin-left:8.25pt;margin-top:6.8pt;width:462pt;height:194.1pt;z-index:487635456;visibility:visible;mso-wrap-style:square;mso-height-percent:0;mso-wrap-distance-left:9pt;mso-wrap-distance-top:0;mso-wrap-distance-right:9pt;mso-wrap-distance-bottom:0;mso-position-horizontal:absolute;mso-position-horizontal-relative:text;mso-position-vertical:absolute;mso-position-vertical-relative:text;mso-height-percent:0;mso-height-relative:margin;v-text-anchor:top" o:gfxdata="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" fillcolor="#fbd4b4 [1305]" strokecolor="#0a121c [484]">
                 <v:textbox inset="0,0,0,0">
                   <w:txbxContent>
                     <w:p>
@@ -27032,17 +26977,7 @@
           <w:sz w:val="24"/>
           <w:szCs w:val="24"/>
         </w:rPr>
-        <w:t>QB.</w:t>
-      </w:r>
-      <w:r>
-        <w:rPr>
-          <w:rFonts w:ascii="Times New Roman" w:hAnsi="Times New Roman" w:cs="Times New Roman"/>
-          <w:b/>
-          <w:bCs/>
-          <w:sz w:val="24"/>
-          <w:szCs w:val="24"/>
-        </w:rPr>
-        <w:t xml:space="preserve">4.2 </w:t>
+        <w:t xml:space="preserve">QB.4.2 </w:t>
       </w:r>
       <w:r>
         <w:rPr>
@@ -27204,7 +27139,7 @@
           </mc:Choice>
           <mc:Fallback>
             <w:pict>
-              <v:shape w14:anchorId="4339DED6" id="_x0000_s1045" type="#_x0000_t202" style="position:absolute;left:0;text-align:left;margin-left:1.55pt;margin-top:37.95pt;width:476.25pt;height:488.85pt;z-index:487627264;visibility:visible;mso-wrap-style:square;mso-width-percent:0;mso-height-percent:0;mso-wrap-distance-left:9pt;mso-wrap-distance-top:3.6pt;mso-wrap-distance-right:9pt;mso-wrap-distance-bottom:3.6pt;mso-position-horizontal:absolute;mso-position-horizontal-relative:margin;mso-position-vertical:absolute;mso-position-vertical-relative:text;mso-width-percent:0;mso-height-percent:0;mso-width-relative:margin;mso-height-relative:margin;v-text-anchor:top" o:gfxdata="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">
+              <v:shape w14:anchorId="4339DED6" id="_x0000_s1045" type="#_x0000_t202" style="position:absolute;left:0;text-align:left;margin-left:1.55pt;margin-top:37.95pt;width:476.25pt;height:488.85pt;z-index:487627264;visibility:visible;mso-wrap-style:square;mso-width-percent:0;mso-height-percent:0;mso-wrap-distance-left:9pt;mso-wrap-distance-top:3.6pt;mso-wrap-distance-right:9pt;mso-wrap-distance-bottom:3.6pt;mso-position-horizontal:absolute;mso-position-horizontal-relative:margin;mso-position-vertical:absolute;mso-position-vertical-relative:text;mso-width-percent:0;mso-height-percent:0;mso-width-relative:margin;mso-height-relative:margin;v-text-anchor:top" o:gfxdata="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">
                 <v:textbox>
                   <w:txbxContent>
                     <w:p>
@@ -27851,7 +27786,7 @@
           </mc:Choice>
           <mc:Fallback>
             <w:pict>
-              <v:shape w14:anchorId="472AA421" id="Textbox 9" o:spid="_x0000_s1046" type="#_x0000_t202" style="position:absolute;left:0;text-align:left;margin-left:55.75pt;margin-top:19pt;width:349.05pt;height:122.6pt;z-index:487636480;visibility:visible;mso-wrap-style:square;mso-width-percent:0;mso-height-percent:0;mso-wrap-distance-left:9pt;mso-wrap-distance-top:0;mso-wrap-distance-right:9pt;mso-wrap-distance-bottom:0;mso-position-horizontal:absolute;mso-position-horizontal-relative:text;mso-position-vertical:absolute;mso-position-vertical-relative:text;mso-width-percent:0;mso-height-percent:0;mso-width-relative:margin;mso-height-relative:margin;v-text-anchor:top" o:gfxdata="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" fillcolor="#fbd4b4 [1305]" strokecolor="#243f60 [1604]">
+              <v:shape w14:anchorId="472AA421" id="Textbox 9" o:spid="_x0000_s1046" type="#_x0000_t202" style="position:absolute;left:0;text-align:left;margin-left:55.75pt;margin-top:19pt;width:349.05pt;height:122.6pt;z-index:487636480;visibility:visible;mso-wrap-style:square;mso-width-percent:0;mso-height-percent:0;mso-wrap-distance-left:9pt;mso-wrap-distance-top:0;mso-wrap-distance-right:9pt;mso-wrap-distance-bottom:0;mso-position-horizontal:absolute;mso-position-horizontal-relative:text;mso-position-vertical:absolute;mso-position-vertical-relative:text;mso-width-percent:0;mso-height-percent:0;mso-width-relative:margin;mso-height-relative:margin;v-text-anchor:top" o:gfxdata="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" fillcolor="#fbd4b4 [1305]" strokecolor="#243f60 [1604]">
                 <v:textbox inset="0,0,0,0">
                   <w:txbxContent>
                     <w:p>
@@ -28503,7 +28438,7 @@
           </mc:Choice>
           <mc:Fallback>
             <w:pict>
-              <v:shape w14:anchorId="4E878057" id="Text Box 8" o:spid="_x0000_s1047" type="#_x0000_t202" style="position:absolute;margin-left:6.75pt;margin-top:2.8pt;width:478.45pt;height:280.15pt;z-index:487637504;visibility:visible;mso-wrap-style:square;mso-height-percent:0;mso-wrap-distance-left:9pt;mso-wrap-distance-top:0;mso-wrap-distance-right:9pt;mso-wrap-distance-bottom:0;mso-position-horizontal:absolute;mso-position-horizontal-relative:text;mso-position-vertical:absolute;mso-position-vertical-relative:text;mso-height-percent:0;mso-height-relative:margin;v-text-anchor:top" o:gfxdata="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" fillcolor="white [3201]" strokeweight=".5pt">
+              <v:shape w14:anchorId="4E878057" id="Text Box 8" o:spid="_x0000_s1047" type="#_x0000_t202" style="position:absolute;margin-left:6.75pt;margin-top:2.8pt;width:478.45pt;height:280.15pt;z-index:487637504;visibility:visible;mso-wrap-style:square;mso-height-percent:0;mso-wrap-distance-left:9pt;mso-wrap-distance-top:0;mso-wrap-distance-right:9pt;mso-wrap-distance-bottom:0;mso-position-horizontal:absolute;mso-position-horizontal-relative:text;mso-position-vertical:absolute;mso-position-vertical-relative:text;mso-height-percent:0;mso-height-relative:margin;v-text-anchor:top" o:gfxdata="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" fillcolor="white [3201]" strokeweight=".5pt">
                 <v:textbox>
                   <w:txbxContent>
                     <w:p>
@@ -29315,7 +29250,7 @@
           </mc:Choice>
           <mc:Fallback>
             <w:pict>
-              <v:shape w14:anchorId="7CB9227B" id="Textbox 29" o:spid="_x0000_s1048" type="#_x0000_t202" style="position:absolute;left:0;text-align:left;margin-left:-.8pt;margin-top:35.65pt;width:462pt;height:96.75pt;z-index:487638528;visibility:visible;mso-wrap-style:square;mso-wrap-distance-left:9pt;mso-wrap-distance-top:0;mso-wrap-distance-right:9pt;mso-wrap-distance-bottom:0;mso-position-horizontal:absolute;mso-position-horizontal-relative:text;mso-position-vertical:absolute;mso-position-vertical-relative:text;v-text-anchor:top" o:gfxdata="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" fillcolor="#fbd4b4 [1305]" stroked="f">
+              <v:shape w14:anchorId="7CB9227B" id="Textbox 29" o:spid="_x0000_s1048" type="#_x0000_t202" style="position:absolute;left:0;text-align:left;margin-left:-.8pt;margin-top:35.65pt;width:462pt;height:96.75pt;z-index:487638528;visibility:visible;mso-wrap-style:square;mso-wrap-distance-left:9pt;mso-wrap-distance-top:0;mso-wrap-distance-right:9pt;mso-wrap-distance-bottom:0;mso-position-horizontal:absolute;mso-position-horizontal-relative:text;mso-position-vertical:absolute;mso-position-vertical-relative:text;v-text-anchor:top" o:gfxdata="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" fillcolor="#fbd4b4 [1305]" stroked="f">
                 <v:textbox inset="0,0,0,0">
                   <w:txbxContent>
                     <w:p>
@@ -30032,7 +29967,7 @@
           </mc:Choice>
           <mc:Fallback>
             <w:pict>
-              <v:shape w14:anchorId="17529603" id="_x0000_s1049" type="#_x0000_t202" style="position:absolute;margin-left:-5.75pt;margin-top:35.45pt;width:476.25pt;height:262.4pt;z-index:487626240;visibility:visible;mso-wrap-style:square;mso-width-percent:0;mso-height-percent:0;mso-wrap-distance-left:9pt;mso-wrap-distance-top:3.6pt;mso-wrap-distance-right:9pt;mso-wrap-distance-bottom:3.6pt;mso-position-horizontal:absolute;mso-position-horizontal-relative:margin;mso-position-vertical:absolute;mso-position-vertical-relative:text;mso-width-percent:0;mso-height-percent:0;mso-width-relative:margin;mso-height-relative:margin;v-text-anchor:top" o:gfxdata="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">
+              <v:shape w14:anchorId="17529603" id="_x0000_s1049" type="#_x0000_t202" style="position:absolute;margin-left:-5.75pt;margin-top:35.45pt;width:476.25pt;height:262.4pt;z-index:487626240;visibility:visible;mso-wrap-style:square;mso-width-percent:0;mso-height-percent:0;mso-wrap-distance-left:9pt;mso-wrap-distance-top:3.6pt;mso-wrap-distance-right:9pt;mso-wrap-distance-bottom:3.6pt;mso-position-horizontal:absolute;mso-position-horizontal-relative:margin;mso-position-vertical:absolute;mso-position-vertical-relative:text;mso-width-percent:0;mso-height-percent:0;mso-width-relative:margin;mso-height-relative:margin;v-text-anchor:top" o:gfxdata="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">
                 <v:textbox>
                   <w:txbxContent>
                     <w:p>
@@ -30321,7 +30256,7 @@
               <v:stroke joinstyle="miter"/>
               <v:path gradientshapeok="t" o:connecttype="rect"/>
             </v:shapetype>
-            <v:shape id="Textbox 78" o:spid="_x0000_s1051" type="#_x0000_t202" style="position:absolute;margin-left:287.5pt;margin-top:828pt;width:36.5pt;height:13pt;z-index:-15888896;visibility:visible;mso-wrap-style:square;mso-width-percent:0;mso-wrap-distance-left:0;mso-wrap-distance-top:0;mso-wrap-distance-right:0;mso-wrap-distance-bottom:0;mso-position-horizontal:absolute;mso-position-horizontal-relative:page;mso-position-vertical:absolute;mso-position-vertical-relative:page;mso-width-percent:0;mso-width-relative:margin;v-text-anchor:top" o:gfxdata="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" filled="f" stroked="f">
+            <v:shape id="Textbox 78" o:spid="_x0000_s1051" type="#_x0000_t202" style="position:absolute;margin-left:287.5pt;margin-top:828pt;width:36.5pt;height:13pt;z-index:-15888896;visibility:visible;mso-wrap-style:square;mso-width-percent:0;mso-wrap-distance-left:0;mso-wrap-distance-top:0;mso-wrap-distance-right:0;mso-wrap-distance-bottom:0;mso-position-horizontal:absolute;mso-position-horizontal-relative:page;mso-position-vertical:absolute;mso-position-vertical-relative:page;mso-width-percent:0;mso-width-relative:margin;v-text-anchor:top" o:gfxdata="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" filled="f" stroked="f">
               <v:textbox inset="0,0,0,0">
                 <w:txbxContent>
                   <w:p>
@@ -30633,7 +30568,7 @@
         </mc:Choice>
         <mc:Fallback>
           <w:pict>
-            <v:rect w14:anchorId="578D20FD" id="Rectangle 23" o:spid="_x0000_s1050" style="position:absolute;margin-left:-5.8pt;margin-top:5.3pt;width:468.5pt;height:21.3pt;z-index:-15886848;visibility:visible;mso-wrap-style:square;mso-width-percent:1000;mso-height-percent:27;mso-wrap-distance-left:9.35pt;mso-wrap-distance-top:0;mso-wrap-distance-right:9.35pt;mso-wrap-distance-bottom:0;mso-position-horizontal:absolute;mso-position-horizontal-relative:margin;mso-position-vertical:absolute;mso-position-vertical-relative:page;mso-width-percent:1000;mso-height-percent:27;mso-width-relative:margin;mso-height-relative:page;v-text-anchor:middle" o:gfxdata="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" o:allowoverlap="f" fillcolor="#4f81bd [3204]" stroked="f" strokeweight="2pt">
+            <v:rect w14:anchorId="578D20FD" id="Rectangle 23" o:spid="_x0000_s1050" style="position:absolute;margin-left:-5.8pt;margin-top:5.3pt;width:468.5pt;height:21.3pt;z-index:-15886848;visibility:visible;mso-wrap-style:square;mso-width-percent:1000;mso-height-percent:27;mso-wrap-distance-left:9.35pt;mso-wrap-distance-top:0;mso-wrap-distance-right:9.35pt;mso-wrap-distance-bottom:0;mso-position-horizontal:absolute;mso-position-horizontal-relative:margin;mso-position-vertical:absolute;mso-position-vertical-relative:page;mso-width-percent:1000;mso-height-percent:27;mso-width-relative:margin;mso-height-relative:page;v-text-anchor:middle" o:gfxdata="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" o:allowoverlap="f" fillcolor="#4f81bd [3204]" stroked="f" strokeweight="2pt">
               <v:textbox style="mso-fit-shape-to-text:t">
                 <w:txbxContent>
                   <w:p>
@@ -34651,6 +34586,7 @@
   <w:style w:type="character" w:default="1" w:styleId="DefaultParagraphFont">
     <w:name w:val="Default Paragraph Font"/>
     <w:uiPriority w:val="1"/>
+    <w:semiHidden/>
     <w:unhideWhenUsed/>
   </w:style>
   <w:style w:type="table" w:default="1" w:styleId="TableNormal">

</xml_diff>